<commit_message>
add all files to cover missing and update files
</commit_message>
<xml_diff>
--- a/PDF/Lösung Übungsaufgaben.docx
+++ b/PDF/Lösung Übungsaufgaben.docx
@@ -7284,12 +7284,23 @@
       </w:r>
     </w:p>
     <w:p>
+      <w:pPr>
+        <w:rPr>
+          <w:lang w:val="en-US"/>
+        </w:rPr>
+      </w:pPr>
       <w:proofErr w:type="spellStart"/>
       <w:r>
+        <w:rPr>
+          <w:lang w:val="en-US"/>
+        </w:rPr>
         <w:t>Lsg</w:t>
       </w:r>
       <w:proofErr w:type="spellEnd"/>
       <w:r>
+        <w:rPr>
+          <w:lang w:val="en-US"/>
+        </w:rPr>
         <w:t>:</w:t>
       </w:r>
     </w:p>
@@ -7559,19 +7570,7 @@
           <w:lang w:val="en-US" w:eastAsia="de-DE"/>
           <w14:ligatures w14:val="none"/>
         </w:rPr>
-        <w:t>//</w:t>
-      </w:r>
-      <w:r>
-        <w:rPr>
-          <w:rFonts w:eastAsia="Times New Roman" w:cs="Courier New"/>
-          <w:color w:val="00CF11"/>
-          <w:kern w:val="0"/>
-          <w:sz w:val="21"/>
-          <w:szCs w:val="21"/>
-          <w:lang w:val="en-US" w:eastAsia="de-DE"/>
-          <w14:ligatures w14:val="none"/>
-        </w:rPr>
-        <w:t>while-loop</w:t>
+        <w:t>//while-loop</w:t>
       </w:r>
     </w:p>
     <w:p>
@@ -8802,19 +8801,7 @@
           <w:lang w:val="en-US" w:eastAsia="de-DE"/>
           <w14:ligatures w14:val="none"/>
         </w:rPr>
-        <w:t>)</w:t>
-      </w:r>
-      <w:r>
-        <w:rPr>
-          <w:rFonts w:ascii="Consolas" w:eastAsia="Times New Roman" w:hAnsi="Consolas" w:cs="Courier New"/>
-          <w:color w:val="E2E2E2"/>
-          <w:kern w:val="0"/>
-          <w:sz w:val="21"/>
-          <w:szCs w:val="21"/>
-          <w:lang w:val="en-US" w:eastAsia="de-DE"/>
-          <w14:ligatures w14:val="none"/>
-        </w:rPr>
-        <w:t>;</w:t>
+        <w:t>);</w:t>
       </w:r>
     </w:p>
     <w:p>
@@ -9133,19 +9120,7 @@
           <w:lang w:val="en-US" w:eastAsia="de-DE"/>
           <w14:ligatures w14:val="none"/>
         </w:rPr>
-        <w:t>++</w:t>
-      </w:r>
-      <w:r>
-        <w:rPr>
-          <w:rFonts w:ascii="Consolas" w:eastAsia="Times New Roman" w:hAnsi="Consolas" w:cs="Courier New"/>
-          <w:color w:val="E2E2E2"/>
-          <w:kern w:val="0"/>
-          <w:sz w:val="21"/>
-          <w:szCs w:val="21"/>
-          <w:lang w:val="en-US" w:eastAsia="de-DE"/>
-          <w14:ligatures w14:val="none"/>
-        </w:rPr>
-        <w:t>)</w:t>
+        <w:t>++)</w:t>
       </w:r>
     </w:p>
     <w:p>
@@ -9357,7 +9332,7 @@
           <w:kern w:val="0"/>
           <w:sz w:val="21"/>
           <w:szCs w:val="21"/>
-          <w:lang w:val="en-US" w:eastAsia="de-DE"/>
+          <w:lang w:eastAsia="de-DE"/>
           <w14:ligatures w14:val="none"/>
         </w:rPr>
       </w:pPr>
@@ -9380,7 +9355,7 @@
           <w:kern w:val="0"/>
           <w:sz w:val="21"/>
           <w:szCs w:val="21"/>
-          <w:lang w:val="en-US" w:eastAsia="de-DE"/>
+          <w:lang w:eastAsia="de-DE"/>
           <w14:ligatures w14:val="none"/>
         </w:rPr>
         <w:t>}</w:t>
@@ -9414,22 +9389,23 @@
           <w:kern w:val="0"/>
           <w:sz w:val="21"/>
           <w:szCs w:val="21"/>
-          <w:lang w:val="en-US" w:eastAsia="de-DE"/>
-          <w14:ligatures w14:val="none"/>
-        </w:rPr>
-      </w:pPr>
-      <w:r>
-        <w:rPr>
-          <w:rFonts w:ascii="Consolas" w:eastAsia="Times New Roman" w:hAnsi="Consolas" w:cs="Courier New"/>
-          <w:color w:val="E2E2E2"/>
-          <w:kern w:val="0"/>
-          <w:sz w:val="21"/>
-          <w:szCs w:val="21"/>
-          <w:lang w:val="en-US" w:eastAsia="de-DE"/>
+          <w:lang w:eastAsia="de-DE"/>
+          <w14:ligatures w14:val="none"/>
+        </w:rPr>
+      </w:pPr>
+      <w:r>
+        <w:rPr>
+          <w:rFonts w:ascii="Consolas" w:eastAsia="Times New Roman" w:hAnsi="Consolas" w:cs="Courier New"/>
+          <w:color w:val="E2E2E2"/>
+          <w:kern w:val="0"/>
+          <w:sz w:val="21"/>
+          <w:szCs w:val="21"/>
+          <w:lang w:eastAsia="de-DE"/>
           <w14:ligatures w14:val="none"/>
         </w:rPr>
         <w:t xml:space="preserve">    </w:t>
       </w:r>
+      <w:proofErr w:type="spellStart"/>
       <w:r>
         <w:rPr>
           <w:rFonts w:ascii="Consolas" w:eastAsia="Times New Roman" w:hAnsi="Consolas" w:cs="Courier New"/>
@@ -9439,19 +9415,20 @@
           <w:kern w:val="0"/>
           <w:sz w:val="21"/>
           <w:szCs w:val="21"/>
-          <w:lang w:val="en-US" w:eastAsia="de-DE"/>
+          <w:lang w:eastAsia="de-DE"/>
           <w14:ligatures w14:val="none"/>
         </w:rPr>
         <w:t>return</w:t>
       </w:r>
-      <w:r>
-        <w:rPr>
-          <w:rFonts w:ascii="Consolas" w:eastAsia="Times New Roman" w:hAnsi="Consolas" w:cs="Courier New"/>
-          <w:color w:val="E2E2E2"/>
-          <w:kern w:val="0"/>
-          <w:sz w:val="21"/>
-          <w:szCs w:val="21"/>
-          <w:lang w:val="en-US" w:eastAsia="de-DE"/>
+      <w:proofErr w:type="spellEnd"/>
+      <w:r>
+        <w:rPr>
+          <w:rFonts w:ascii="Consolas" w:eastAsia="Times New Roman" w:hAnsi="Consolas" w:cs="Courier New"/>
+          <w:color w:val="E2E2E2"/>
+          <w:kern w:val="0"/>
+          <w:sz w:val="21"/>
+          <w:szCs w:val="21"/>
+          <w:lang w:eastAsia="de-DE"/>
           <w14:ligatures w14:val="none"/>
         </w:rPr>
         <w:t xml:space="preserve"> </w:t>
@@ -9463,7 +9440,7 @@
           <w:kern w:val="0"/>
           <w:sz w:val="21"/>
           <w:szCs w:val="21"/>
-          <w:lang w:val="en-US" w:eastAsia="de-DE"/>
+          <w:lang w:eastAsia="de-DE"/>
           <w14:ligatures w14:val="none"/>
         </w:rPr>
         <w:t>0</w:t>
@@ -9475,7 +9452,7 @@
           <w:kern w:val="0"/>
           <w:sz w:val="21"/>
           <w:szCs w:val="21"/>
-          <w:lang w:val="en-US" w:eastAsia="de-DE"/>
+          <w:lang w:eastAsia="de-DE"/>
           <w14:ligatures w14:val="none"/>
         </w:rPr>
         <w:t>;</w:t>
@@ -9509,7 +9486,7 @@
           <w:kern w:val="0"/>
           <w:sz w:val="21"/>
           <w:szCs w:val="21"/>
-          <w:lang w:val="en-US" w:eastAsia="de-DE"/>
+          <w:lang w:eastAsia="de-DE"/>
           <w14:ligatures w14:val="none"/>
         </w:rPr>
       </w:pPr>
@@ -9520,11 +9497,3276 @@
           <w:kern w:val="0"/>
           <w:sz w:val="21"/>
           <w:szCs w:val="21"/>
-          <w:lang w:val="en-US" w:eastAsia="de-DE"/>
+          <w:lang w:eastAsia="de-DE"/>
           <w14:ligatures w14:val="none"/>
         </w:rPr>
         <w:t>}</w:t>
       </w:r>
+    </w:p>
+    <w:p/>
+    <w:p>
+      <w:r>
+        <w:t>- zu Arrays gibt e</w:t>
+      </w:r>
+      <w:r>
+        <w:t>s separate Lösungen, da die Aufgaben auch in einer eigenen PDF sind -</w:t>
+      </w:r>
+    </w:p>
+    <w:p/>
+    <w:p/>
+    <w:p/>
+    <w:p/>
+    <w:p/>
+    <w:p/>
+    <w:p/>
+    <w:p/>
+    <w:p/>
+    <w:p>
+      <w:pPr>
+        <w:pStyle w:val="Listenabsatz"/>
+        <w:numPr>
+          <w:ilvl w:val="0"/>
+          <w:numId w:val="1"/>
+        </w:numPr>
+      </w:pPr>
+      <w:r>
+        <w:lastRenderedPageBreak/>
+        <w:t>Erstellen Sie zwei Strings, einen C-Style String und einen C++ String. Beide Strings sollen folgenden Text als Wert zugewiesen bekommen: "</w:t>
+      </w:r>
+      <w:proofErr w:type="spellStart"/>
+      <w:r>
+        <w:t>HaLlO</w:t>
+      </w:r>
+      <w:proofErr w:type="spellEnd"/>
+      <w:r>
+        <w:t xml:space="preserve"> </w:t>
+      </w:r>
+      <w:proofErr w:type="spellStart"/>
+      <w:r>
+        <w:t>WeLt</w:t>
+      </w:r>
+      <w:proofErr w:type="spellEnd"/>
+      <w:r>
+        <w:t>". Dieser Text enthält sowohl Groß- als auch Kleinbuchstaben, Das Programm soll die Strings so manipulieren, dass sie nur noch Kleinbuchstaben besitzen.</w:t>
+      </w:r>
+    </w:p>
+    <w:p>
+      <w:pPr>
+        <w:shd w:val="clear" w:color="auto" w:fill="303030"/>
+        <w:tabs>
+          <w:tab w:val="left" w:pos="916"/>
+          <w:tab w:val="left" w:pos="1832"/>
+          <w:tab w:val="left" w:pos="2748"/>
+          <w:tab w:val="left" w:pos="3664"/>
+          <w:tab w:val="left" w:pos="4580"/>
+          <w:tab w:val="left" w:pos="5496"/>
+          <w:tab w:val="left" w:pos="6412"/>
+          <w:tab w:val="left" w:pos="7328"/>
+          <w:tab w:val="left" w:pos="8244"/>
+          <w:tab w:val="left" w:pos="9160"/>
+          <w:tab w:val="left" w:pos="10076"/>
+          <w:tab w:val="left" w:pos="10992"/>
+          <w:tab w:val="left" w:pos="11908"/>
+          <w:tab w:val="left" w:pos="12824"/>
+          <w:tab w:val="left" w:pos="13740"/>
+          <w:tab w:val="left" w:pos="14656"/>
+        </w:tabs>
+        <w:spacing w:after="0" w:line="240" w:lineRule="auto"/>
+        <w:rPr>
+          <w:rFonts w:ascii="Consolas" w:eastAsia="Times New Roman" w:hAnsi="Consolas" w:cs="Courier New"/>
+          <w:color w:val="E2E2E2"/>
+          <w:kern w:val="0"/>
+          <w:sz w:val="21"/>
+          <w:szCs w:val="21"/>
+          <w:lang w:val="en-US" w:eastAsia="de-DE"/>
+          <w14:ligatures w14:val="none"/>
+        </w:rPr>
+      </w:pPr>
+      <w:r>
+        <w:rPr>
+          <w:rFonts w:ascii="Consolas" w:eastAsia="Times New Roman" w:hAnsi="Consolas" w:cs="Courier New"/>
+          <w:color w:val="B8B8B8"/>
+          <w:kern w:val="0"/>
+          <w:sz w:val="21"/>
+          <w:szCs w:val="21"/>
+          <w:lang w:val="en-US" w:eastAsia="de-DE"/>
+          <w14:ligatures w14:val="none"/>
+        </w:rPr>
+        <w:t>#include</w:t>
+      </w:r>
+      <w:r>
+        <w:rPr>
+          <w:rFonts w:ascii="Consolas" w:eastAsia="Times New Roman" w:hAnsi="Consolas" w:cs="Courier New"/>
+          <w:color w:val="E2E2E2"/>
+          <w:kern w:val="0"/>
+          <w:sz w:val="21"/>
+          <w:szCs w:val="21"/>
+          <w:lang w:val="en-US" w:eastAsia="de-DE"/>
+          <w14:ligatures w14:val="none"/>
+        </w:rPr>
+        <w:t xml:space="preserve"> </w:t>
+      </w:r>
+      <w:r>
+        <w:rPr>
+          <w:rFonts w:ascii="Consolas" w:eastAsia="Times New Roman" w:hAnsi="Consolas" w:cs="Courier New"/>
+          <w:color w:val="CE9178"/>
+          <w:kern w:val="0"/>
+          <w:sz w:val="21"/>
+          <w:szCs w:val="21"/>
+          <w:lang w:val="en-US" w:eastAsia="de-DE"/>
+          <w14:ligatures w14:val="none"/>
+        </w:rPr>
+        <w:t>&lt;iostream&gt;</w:t>
+      </w:r>
+    </w:p>
+    <w:p>
+      <w:pPr>
+        <w:shd w:val="clear" w:color="auto" w:fill="303030"/>
+        <w:tabs>
+          <w:tab w:val="left" w:pos="916"/>
+          <w:tab w:val="left" w:pos="1832"/>
+          <w:tab w:val="left" w:pos="2748"/>
+          <w:tab w:val="left" w:pos="3664"/>
+          <w:tab w:val="left" w:pos="4580"/>
+          <w:tab w:val="left" w:pos="5496"/>
+          <w:tab w:val="left" w:pos="6412"/>
+          <w:tab w:val="left" w:pos="7328"/>
+          <w:tab w:val="left" w:pos="8244"/>
+          <w:tab w:val="left" w:pos="9160"/>
+          <w:tab w:val="left" w:pos="10076"/>
+          <w:tab w:val="left" w:pos="10992"/>
+          <w:tab w:val="left" w:pos="11908"/>
+          <w:tab w:val="left" w:pos="12824"/>
+          <w:tab w:val="left" w:pos="13740"/>
+          <w:tab w:val="left" w:pos="14656"/>
+        </w:tabs>
+        <w:spacing w:after="0" w:line="240" w:lineRule="auto"/>
+        <w:rPr>
+          <w:rFonts w:ascii="Consolas" w:eastAsia="Times New Roman" w:hAnsi="Consolas" w:cs="Courier New"/>
+          <w:color w:val="E2E2E2"/>
+          <w:kern w:val="0"/>
+          <w:sz w:val="21"/>
+          <w:szCs w:val="21"/>
+          <w:lang w:val="en-US" w:eastAsia="de-DE"/>
+          <w14:ligatures w14:val="none"/>
+        </w:rPr>
+      </w:pPr>
+    </w:p>
+    <w:p>
+      <w:pPr>
+        <w:shd w:val="clear" w:color="auto" w:fill="303030"/>
+        <w:tabs>
+          <w:tab w:val="left" w:pos="916"/>
+          <w:tab w:val="left" w:pos="1832"/>
+          <w:tab w:val="left" w:pos="2748"/>
+          <w:tab w:val="left" w:pos="3664"/>
+          <w:tab w:val="left" w:pos="4580"/>
+          <w:tab w:val="left" w:pos="5496"/>
+          <w:tab w:val="left" w:pos="6412"/>
+          <w:tab w:val="left" w:pos="7328"/>
+          <w:tab w:val="left" w:pos="8244"/>
+          <w:tab w:val="left" w:pos="9160"/>
+          <w:tab w:val="left" w:pos="10076"/>
+          <w:tab w:val="left" w:pos="10992"/>
+          <w:tab w:val="left" w:pos="11908"/>
+          <w:tab w:val="left" w:pos="12824"/>
+          <w:tab w:val="left" w:pos="13740"/>
+          <w:tab w:val="left" w:pos="14656"/>
+        </w:tabs>
+        <w:spacing w:after="0" w:line="240" w:lineRule="auto"/>
+        <w:rPr>
+          <w:rFonts w:ascii="Consolas" w:eastAsia="Times New Roman" w:hAnsi="Consolas" w:cs="Courier New"/>
+          <w:color w:val="E2E2E2"/>
+          <w:kern w:val="0"/>
+          <w:sz w:val="21"/>
+          <w:szCs w:val="21"/>
+          <w:lang w:val="en-US" w:eastAsia="de-DE"/>
+          <w14:ligatures w14:val="none"/>
+        </w:rPr>
+      </w:pPr>
+      <w:r>
+        <w:rPr>
+          <w:rFonts w:ascii="Consolas" w:eastAsia="Times New Roman" w:hAnsi="Consolas" w:cs="Courier New"/>
+          <w:b/>
+          <w:bCs/>
+          <w:color w:val="569CD6"/>
+          <w:kern w:val="0"/>
+          <w:sz w:val="21"/>
+          <w:szCs w:val="21"/>
+          <w:lang w:val="en-US" w:eastAsia="de-DE"/>
+          <w14:ligatures w14:val="none"/>
+        </w:rPr>
+        <w:t>int</w:t>
+      </w:r>
+      <w:r>
+        <w:rPr>
+          <w:rFonts w:ascii="Consolas" w:eastAsia="Times New Roman" w:hAnsi="Consolas" w:cs="Courier New"/>
+          <w:color w:val="E2E2E2"/>
+          <w:kern w:val="0"/>
+          <w:sz w:val="21"/>
+          <w:szCs w:val="21"/>
+          <w:lang w:val="en-US" w:eastAsia="de-DE"/>
+          <w14:ligatures w14:val="none"/>
+        </w:rPr>
+        <w:t xml:space="preserve"> </w:t>
+      </w:r>
+      <w:r>
+        <w:rPr>
+          <w:rFonts w:ascii="Consolas" w:eastAsia="Times New Roman" w:hAnsi="Consolas" w:cs="Courier New"/>
+          <w:color w:val="FFF2AA"/>
+          <w:kern w:val="0"/>
+          <w:sz w:val="21"/>
+          <w:szCs w:val="21"/>
+          <w:lang w:val="en-US" w:eastAsia="de-DE"/>
+          <w14:ligatures w14:val="none"/>
+        </w:rPr>
+        <w:t>main</w:t>
+      </w:r>
+      <w:r>
+        <w:rPr>
+          <w:rFonts w:ascii="Consolas" w:eastAsia="Times New Roman" w:hAnsi="Consolas" w:cs="Courier New"/>
+          <w:color w:val="E2E2E2"/>
+          <w:kern w:val="0"/>
+          <w:sz w:val="21"/>
+          <w:szCs w:val="21"/>
+          <w:lang w:val="en-US" w:eastAsia="de-DE"/>
+          <w14:ligatures w14:val="none"/>
+        </w:rPr>
+        <w:t>()</w:t>
+      </w:r>
+    </w:p>
+    <w:p>
+      <w:pPr>
+        <w:shd w:val="clear" w:color="auto" w:fill="303030"/>
+        <w:tabs>
+          <w:tab w:val="left" w:pos="916"/>
+          <w:tab w:val="left" w:pos="1832"/>
+          <w:tab w:val="left" w:pos="2748"/>
+          <w:tab w:val="left" w:pos="3664"/>
+          <w:tab w:val="left" w:pos="4580"/>
+          <w:tab w:val="left" w:pos="5496"/>
+          <w:tab w:val="left" w:pos="6412"/>
+          <w:tab w:val="left" w:pos="7328"/>
+          <w:tab w:val="left" w:pos="8244"/>
+          <w:tab w:val="left" w:pos="9160"/>
+          <w:tab w:val="left" w:pos="10076"/>
+          <w:tab w:val="left" w:pos="10992"/>
+          <w:tab w:val="left" w:pos="11908"/>
+          <w:tab w:val="left" w:pos="12824"/>
+          <w:tab w:val="left" w:pos="13740"/>
+          <w:tab w:val="left" w:pos="14656"/>
+        </w:tabs>
+        <w:spacing w:after="0" w:line="240" w:lineRule="auto"/>
+        <w:rPr>
+          <w:rFonts w:ascii="Consolas" w:eastAsia="Times New Roman" w:hAnsi="Consolas" w:cs="Courier New"/>
+          <w:color w:val="FFD700"/>
+          <w:kern w:val="0"/>
+          <w:sz w:val="21"/>
+          <w:szCs w:val="21"/>
+          <w:lang w:val="en-US" w:eastAsia="de-DE"/>
+          <w14:ligatures w14:val="none"/>
+        </w:rPr>
+      </w:pPr>
+      <w:r>
+        <w:rPr>
+          <w:rFonts w:ascii="Consolas" w:eastAsia="Times New Roman" w:hAnsi="Consolas" w:cs="Courier New"/>
+          <w:color w:val="FFD700"/>
+          <w:kern w:val="0"/>
+          <w:sz w:val="21"/>
+          <w:szCs w:val="21"/>
+          <w:lang w:val="en-US" w:eastAsia="de-DE"/>
+          <w14:ligatures w14:val="none"/>
+        </w:rPr>
+        <w:t>{</w:t>
+      </w:r>
+    </w:p>
+    <w:p>
+      <w:pPr>
+        <w:pStyle w:val="HTMLVorformatiert"/>
+        <w:shd w:val="clear" w:color="auto" w:fill="2E2E2E"/>
+        <w:rPr>
+          <w:rFonts w:eastAsia="Times New Roman" w:cs="Courier New"/>
+          <w:color w:val="FFD700"/>
+          <w:kern w:val="0"/>
+          <w:sz w:val="21"/>
+          <w:szCs w:val="21"/>
+          <w:lang w:eastAsia="de-DE"/>
+          <w14:ligatures w14:val="none"/>
+        </w:rPr>
+      </w:pPr>
+      <w:r>
+        <w:rPr>
+          <w:rFonts w:eastAsia="Times New Roman" w:cs="Courier New"/>
+          <w:color w:val="FFD700"/>
+          <w:kern w:val="0"/>
+          <w:sz w:val="21"/>
+          <w:szCs w:val="21"/>
+          <w:lang w:eastAsia="de-DE"/>
+          <w14:ligatures w14:val="none"/>
+        </w:rPr>
+        <w:t xml:space="preserve">    </w:t>
+      </w:r>
+      <w:proofErr w:type="spellStart"/>
+      <w:r>
+        <w:rPr>
+          <w:rFonts w:eastAsia="Times New Roman" w:cs="Courier New"/>
+          <w:b/>
+          <w:bCs/>
+          <w:color w:val="569CD6"/>
+          <w:kern w:val="0"/>
+          <w:sz w:val="21"/>
+          <w:szCs w:val="21"/>
+          <w:lang w:eastAsia="de-DE"/>
+          <w14:ligatures w14:val="none"/>
+        </w:rPr>
+        <w:t>char</w:t>
+      </w:r>
+      <w:proofErr w:type="spellEnd"/>
+      <w:r>
+        <w:rPr>
+          <w:rFonts w:eastAsia="Times New Roman" w:cs="Courier New"/>
+          <w:color w:val="E2E2E2"/>
+          <w:kern w:val="0"/>
+          <w:sz w:val="21"/>
+          <w:szCs w:val="21"/>
+          <w:lang w:eastAsia="de-DE"/>
+          <w14:ligatures w14:val="none"/>
+        </w:rPr>
+        <w:t xml:space="preserve"> </w:t>
+      </w:r>
+      <w:r>
+        <w:rPr>
+          <w:rFonts w:eastAsia="Times New Roman" w:cs="Courier New"/>
+          <w:color w:val="E2E2E2"/>
+          <w:kern w:val="0"/>
+          <w:sz w:val="21"/>
+          <w:szCs w:val="21"/>
+          <w:lang w:eastAsia="de-DE"/>
+          <w14:ligatures w14:val="none"/>
+        </w:rPr>
+        <w:t xml:space="preserve">string1[] = </w:t>
+      </w:r>
+      <w:r>
+        <w:rPr>
+          <w:rFonts w:eastAsia="Times New Roman" w:cs="Courier New"/>
+          <w:color w:val="CE9178"/>
+          <w:kern w:val="0"/>
+          <w:sz w:val="21"/>
+          <w:szCs w:val="21"/>
+          <w:lang w:eastAsia="de-DE"/>
+          <w14:ligatures w14:val="none"/>
+        </w:rPr>
+        <w:t>"</w:t>
+      </w:r>
+      <w:proofErr w:type="spellStart"/>
+      <w:r>
+        <w:rPr>
+          <w:rFonts w:eastAsia="Times New Roman" w:cs="Courier New"/>
+          <w:color w:val="CE9178"/>
+          <w:kern w:val="0"/>
+          <w:sz w:val="21"/>
+          <w:szCs w:val="21"/>
+          <w:lang w:eastAsia="de-DE"/>
+          <w14:ligatures w14:val="none"/>
+        </w:rPr>
+        <w:t>HaLlO</w:t>
+      </w:r>
+      <w:proofErr w:type="spellEnd"/>
+      <w:r>
+        <w:rPr>
+          <w:rFonts w:eastAsia="Times New Roman" w:cs="Courier New"/>
+          <w:color w:val="CE9178"/>
+          <w:kern w:val="0"/>
+          <w:sz w:val="21"/>
+          <w:szCs w:val="21"/>
+          <w:lang w:eastAsia="de-DE"/>
+          <w14:ligatures w14:val="none"/>
+        </w:rPr>
+        <w:t xml:space="preserve"> </w:t>
+      </w:r>
+      <w:proofErr w:type="spellStart"/>
+      <w:r>
+        <w:rPr>
+          <w:rFonts w:eastAsia="Times New Roman" w:cs="Courier New"/>
+          <w:color w:val="CE9178"/>
+          <w:kern w:val="0"/>
+          <w:sz w:val="21"/>
+          <w:szCs w:val="21"/>
+          <w:lang w:eastAsia="de-DE"/>
+          <w14:ligatures w14:val="none"/>
+        </w:rPr>
+        <w:t>WeLt</w:t>
+      </w:r>
+      <w:proofErr w:type="spellEnd"/>
+      <w:r>
+        <w:rPr>
+          <w:rFonts w:eastAsia="Times New Roman" w:cs="Courier New"/>
+          <w:color w:val="CE9178"/>
+          <w:kern w:val="0"/>
+          <w:sz w:val="21"/>
+          <w:szCs w:val="21"/>
+          <w:lang w:eastAsia="de-DE"/>
+          <w14:ligatures w14:val="none"/>
+        </w:rPr>
+        <w:t>"</w:t>
+      </w:r>
+      <w:r>
+        <w:rPr>
+          <w:rFonts w:eastAsia="Times New Roman" w:cs="Courier New"/>
+          <w:color w:val="E2E2E2"/>
+          <w:kern w:val="0"/>
+          <w:sz w:val="21"/>
+          <w:szCs w:val="21"/>
+          <w:lang w:eastAsia="de-DE"/>
+          <w14:ligatures w14:val="none"/>
+        </w:rPr>
+        <w:t>;</w:t>
+      </w:r>
+    </w:p>
+    <w:p>
+      <w:pPr>
+        <w:pStyle w:val="HTMLVorformatiert"/>
+        <w:shd w:val="clear" w:color="auto" w:fill="2E2E2E"/>
+        <w:rPr>
+          <w:rFonts w:eastAsia="Times New Roman" w:cs="Courier New"/>
+          <w:color w:val="FFD700"/>
+          <w:kern w:val="0"/>
+          <w:sz w:val="21"/>
+          <w:szCs w:val="21"/>
+          <w:lang w:val="en-US" w:eastAsia="de-DE"/>
+          <w14:ligatures w14:val="none"/>
+        </w:rPr>
+      </w:pPr>
+      <w:r>
+        <w:rPr>
+          <w:rFonts w:eastAsia="Times New Roman" w:cs="Courier New"/>
+          <w:color w:val="FFD700"/>
+          <w:kern w:val="0"/>
+          <w:sz w:val="21"/>
+          <w:szCs w:val="21"/>
+          <w:lang w:eastAsia="de-DE"/>
+          <w14:ligatures w14:val="none"/>
+        </w:rPr>
+        <w:t xml:space="preserve">    </w:t>
+      </w:r>
+      <w:proofErr w:type="spellStart"/>
+      <w:r>
+        <w:rPr>
+          <w:rFonts w:eastAsia="Times New Roman" w:cs="Courier New"/>
+          <w:color w:val="E2E2E2"/>
+          <w:kern w:val="0"/>
+          <w:sz w:val="21"/>
+          <w:szCs w:val="21"/>
+          <w:lang w:eastAsia="de-DE"/>
+          <w14:ligatures w14:val="none"/>
+        </w:rPr>
+        <w:t>s</w:t>
+      </w:r>
+      <w:r>
+        <w:rPr>
+          <w:rFonts w:eastAsia="Times New Roman" w:cs="Courier New"/>
+          <w:color w:val="E2E2E2"/>
+          <w:kern w:val="0"/>
+          <w:sz w:val="21"/>
+          <w:szCs w:val="21"/>
+          <w:lang w:eastAsia="de-DE"/>
+          <w14:ligatures w14:val="none"/>
+        </w:rPr>
+        <w:t>td</w:t>
+      </w:r>
+      <w:proofErr w:type="spellEnd"/>
+      <w:r>
+        <w:rPr>
+          <w:rFonts w:eastAsia="Times New Roman" w:cs="Courier New"/>
+          <w:color w:val="E2E2E2"/>
+          <w:kern w:val="0"/>
+          <w:sz w:val="21"/>
+          <w:szCs w:val="21"/>
+          <w:lang w:eastAsia="de-DE"/>
+          <w14:ligatures w14:val="none"/>
+        </w:rPr>
+        <w:t>::</w:t>
+      </w:r>
+      <w:proofErr w:type="spellStart"/>
+      <w:r>
+        <w:rPr>
+          <w:rFonts w:eastAsia="Times New Roman" w:cs="Courier New"/>
+          <w:color w:val="E2E2E2"/>
+          <w:kern w:val="0"/>
+          <w:sz w:val="21"/>
+          <w:szCs w:val="21"/>
+          <w:lang w:eastAsia="de-DE"/>
+          <w14:ligatures w14:val="none"/>
+        </w:rPr>
+        <w:t>string</w:t>
+      </w:r>
+      <w:proofErr w:type="spellEnd"/>
+      <w:r>
+        <w:rPr>
+          <w:rFonts w:eastAsia="Times New Roman" w:cs="Courier New"/>
+          <w:color w:val="E2E2E2"/>
+          <w:kern w:val="0"/>
+          <w:sz w:val="21"/>
+          <w:szCs w:val="21"/>
+          <w:lang w:eastAsia="de-DE"/>
+          <w14:ligatures w14:val="none"/>
+        </w:rPr>
+        <w:t xml:space="preserve"> s</w:t>
+      </w:r>
+      <w:r>
+        <w:rPr>
+          <w:rFonts w:eastAsia="Times New Roman" w:cs="Courier New"/>
+          <w:color w:val="E2E2E2"/>
+          <w:kern w:val="0"/>
+          <w:sz w:val="21"/>
+          <w:szCs w:val="21"/>
+          <w:lang w:eastAsia="de-DE"/>
+          <w14:ligatures w14:val="none"/>
+        </w:rPr>
+        <w:t>tring</w:t>
+      </w:r>
+      <w:r>
+        <w:rPr>
+          <w:rFonts w:eastAsia="Times New Roman" w:cs="Courier New"/>
+          <w:color w:val="E2E2E2"/>
+          <w:kern w:val="0"/>
+          <w:sz w:val="21"/>
+          <w:szCs w:val="21"/>
+          <w:lang w:eastAsia="de-DE"/>
+          <w14:ligatures w14:val="none"/>
+        </w:rPr>
+        <w:t xml:space="preserve">2 </w:t>
+      </w:r>
+      <w:r>
+        <w:rPr>
+          <w:rFonts w:eastAsia="Times New Roman" w:cs="Courier New"/>
+          <w:color w:val="E2E2E2"/>
+          <w:kern w:val="0"/>
+          <w:sz w:val="21"/>
+          <w:szCs w:val="21"/>
+          <w:lang w:eastAsia="de-DE"/>
+          <w14:ligatures w14:val="none"/>
+        </w:rPr>
+        <w:t xml:space="preserve">= </w:t>
+      </w:r>
+      <w:r>
+        <w:rPr>
+          <w:rFonts w:eastAsia="Times New Roman" w:cs="Courier New"/>
+          <w:color w:val="CE9178"/>
+          <w:kern w:val="0"/>
+          <w:sz w:val="21"/>
+          <w:szCs w:val="21"/>
+          <w:lang w:eastAsia="de-DE"/>
+          <w14:ligatures w14:val="none"/>
+        </w:rPr>
+        <w:t>"</w:t>
+      </w:r>
+      <w:proofErr w:type="spellStart"/>
+      <w:r>
+        <w:rPr>
+          <w:rFonts w:eastAsia="Times New Roman" w:cs="Courier New"/>
+          <w:color w:val="CE9178"/>
+          <w:kern w:val="0"/>
+          <w:sz w:val="21"/>
+          <w:szCs w:val="21"/>
+          <w:lang w:eastAsia="de-DE"/>
+          <w14:ligatures w14:val="none"/>
+        </w:rPr>
+        <w:t>HaLlO</w:t>
+      </w:r>
+      <w:proofErr w:type="spellEnd"/>
+      <w:r>
+        <w:rPr>
+          <w:rFonts w:eastAsia="Times New Roman" w:cs="Courier New"/>
+          <w:color w:val="CE9178"/>
+          <w:kern w:val="0"/>
+          <w:sz w:val="21"/>
+          <w:szCs w:val="21"/>
+          <w:lang w:eastAsia="de-DE"/>
+          <w14:ligatures w14:val="none"/>
+        </w:rPr>
+        <w:t xml:space="preserve"> </w:t>
+      </w:r>
+      <w:proofErr w:type="spellStart"/>
+      <w:r>
+        <w:rPr>
+          <w:rFonts w:eastAsia="Times New Roman" w:cs="Courier New"/>
+          <w:color w:val="CE9178"/>
+          <w:kern w:val="0"/>
+          <w:sz w:val="21"/>
+          <w:szCs w:val="21"/>
+          <w:lang w:eastAsia="de-DE"/>
+          <w14:ligatures w14:val="none"/>
+        </w:rPr>
+        <w:t>WeLt</w:t>
+      </w:r>
+      <w:proofErr w:type="spellEnd"/>
+      <w:r>
+        <w:rPr>
+          <w:rFonts w:eastAsia="Times New Roman" w:cs="Courier New"/>
+          <w:color w:val="CE9178"/>
+          <w:kern w:val="0"/>
+          <w:sz w:val="21"/>
+          <w:szCs w:val="21"/>
+          <w:lang w:eastAsia="de-DE"/>
+          <w14:ligatures w14:val="none"/>
+        </w:rPr>
+        <w:t>"</w:t>
+      </w:r>
+      <w:r>
+        <w:rPr>
+          <w:rFonts w:eastAsia="Times New Roman" w:cs="Courier New"/>
+          <w:color w:val="E2E2E2"/>
+          <w:kern w:val="0"/>
+          <w:sz w:val="21"/>
+          <w:szCs w:val="21"/>
+          <w:lang w:eastAsia="de-DE"/>
+          <w14:ligatures w14:val="none"/>
+        </w:rPr>
+        <w:t>;</w:t>
+      </w:r>
+    </w:p>
+    <w:p>
+      <w:pPr>
+        <w:shd w:val="clear" w:color="auto" w:fill="303030"/>
+        <w:tabs>
+          <w:tab w:val="left" w:pos="916"/>
+          <w:tab w:val="left" w:pos="1832"/>
+          <w:tab w:val="left" w:pos="2748"/>
+          <w:tab w:val="left" w:pos="3664"/>
+          <w:tab w:val="left" w:pos="4580"/>
+          <w:tab w:val="left" w:pos="5496"/>
+          <w:tab w:val="left" w:pos="6412"/>
+          <w:tab w:val="left" w:pos="7328"/>
+          <w:tab w:val="left" w:pos="8244"/>
+          <w:tab w:val="left" w:pos="9160"/>
+          <w:tab w:val="left" w:pos="10076"/>
+          <w:tab w:val="left" w:pos="10992"/>
+          <w:tab w:val="left" w:pos="11908"/>
+          <w:tab w:val="left" w:pos="12824"/>
+          <w:tab w:val="left" w:pos="13740"/>
+          <w:tab w:val="left" w:pos="14656"/>
+        </w:tabs>
+        <w:spacing w:after="0" w:line="240" w:lineRule="auto"/>
+        <w:rPr>
+          <w:rFonts w:ascii="Consolas" w:eastAsia="Times New Roman" w:hAnsi="Consolas" w:cs="Courier New"/>
+          <w:color w:val="E2E2E2"/>
+          <w:kern w:val="0"/>
+          <w:sz w:val="21"/>
+          <w:szCs w:val="21"/>
+          <w:lang w:val="en-US" w:eastAsia="de-DE"/>
+          <w14:ligatures w14:val="none"/>
+        </w:rPr>
+      </w:pPr>
+      <w:r>
+        <w:rPr>
+          <w:rFonts w:ascii="Consolas" w:eastAsia="Times New Roman" w:hAnsi="Consolas" w:cs="Courier New"/>
+          <w:color w:val="FFD700"/>
+          <w:kern w:val="0"/>
+          <w:sz w:val="21"/>
+          <w:szCs w:val="21"/>
+          <w:lang w:val="en-US" w:eastAsia="de-DE"/>
+          <w14:ligatures w14:val="none"/>
+        </w:rPr>
+        <w:t xml:space="preserve">    </w:t>
+      </w:r>
+      <w:r>
+        <w:rPr>
+          <w:rFonts w:ascii="Consolas" w:eastAsia="Times New Roman" w:hAnsi="Consolas" w:cs="Courier New"/>
+          <w:color w:val="E2E2E2"/>
+          <w:kern w:val="0"/>
+          <w:sz w:val="21"/>
+          <w:szCs w:val="21"/>
+          <w:lang w:val="en-US" w:eastAsia="de-DE"/>
+          <w14:ligatures w14:val="none"/>
+        </w:rPr>
+        <w:t>std::</w:t>
+      </w:r>
+      <w:proofErr w:type="spellStart"/>
+      <w:r>
+        <w:rPr>
+          <w:rFonts w:ascii="Consolas" w:eastAsia="Times New Roman" w:hAnsi="Consolas" w:cs="Courier New"/>
+          <w:color w:val="E2E2E2"/>
+          <w:kern w:val="0"/>
+          <w:sz w:val="21"/>
+          <w:szCs w:val="21"/>
+          <w:lang w:val="en-US" w:eastAsia="de-DE"/>
+          <w14:ligatures w14:val="none"/>
+        </w:rPr>
+        <w:t>cout</w:t>
+      </w:r>
+      <w:proofErr w:type="spellEnd"/>
+      <w:r>
+        <w:rPr>
+          <w:rFonts w:ascii="Consolas" w:eastAsia="Times New Roman" w:hAnsi="Consolas" w:cs="Courier New"/>
+          <w:color w:val="E2E2E2"/>
+          <w:kern w:val="0"/>
+          <w:sz w:val="21"/>
+          <w:szCs w:val="21"/>
+          <w:lang w:val="en-US" w:eastAsia="de-DE"/>
+          <w14:ligatures w14:val="none"/>
+        </w:rPr>
+        <w:t xml:space="preserve"> &lt;&lt; </w:t>
+      </w:r>
+      <w:r>
+        <w:rPr>
+          <w:rFonts w:ascii="Consolas" w:eastAsia="Times New Roman" w:hAnsi="Consolas" w:cs="Courier New"/>
+          <w:color w:val="E2E2E2"/>
+          <w:kern w:val="0"/>
+          <w:sz w:val="21"/>
+          <w:szCs w:val="21"/>
+          <w:lang w:val="en-US" w:eastAsia="de-DE"/>
+          <w14:ligatures w14:val="none"/>
+        </w:rPr>
+        <w:t>string1</w:t>
+      </w:r>
+      <w:r>
+        <w:rPr>
+          <w:rFonts w:ascii="Consolas" w:eastAsia="Times New Roman" w:hAnsi="Consolas" w:cs="Courier New"/>
+          <w:color w:val="E2E2E2"/>
+          <w:kern w:val="0"/>
+          <w:sz w:val="21"/>
+          <w:szCs w:val="21"/>
+          <w:lang w:val="en-US" w:eastAsia="de-DE"/>
+          <w14:ligatures w14:val="none"/>
+        </w:rPr>
+        <w:t xml:space="preserve"> &lt;&lt; std::</w:t>
+      </w:r>
+      <w:proofErr w:type="spellStart"/>
+      <w:r>
+        <w:rPr>
+          <w:rFonts w:ascii="Consolas" w:eastAsia="Times New Roman" w:hAnsi="Consolas" w:cs="Courier New"/>
+          <w:color w:val="E2E2E2"/>
+          <w:kern w:val="0"/>
+          <w:sz w:val="21"/>
+          <w:szCs w:val="21"/>
+          <w:lang w:val="en-US" w:eastAsia="de-DE"/>
+          <w14:ligatures w14:val="none"/>
+        </w:rPr>
+        <w:t>endl</w:t>
+      </w:r>
+      <w:proofErr w:type="spellEnd"/>
+      <w:r>
+        <w:rPr>
+          <w:rFonts w:ascii="Consolas" w:eastAsia="Times New Roman" w:hAnsi="Consolas" w:cs="Courier New"/>
+          <w:color w:val="E2E2E2"/>
+          <w:kern w:val="0"/>
+          <w:sz w:val="21"/>
+          <w:szCs w:val="21"/>
+          <w:lang w:val="en-US" w:eastAsia="de-DE"/>
+          <w14:ligatures w14:val="none"/>
+        </w:rPr>
+        <w:t>;</w:t>
+      </w:r>
+    </w:p>
+    <w:p>
+      <w:pPr>
+        <w:shd w:val="clear" w:color="auto" w:fill="303030"/>
+        <w:tabs>
+          <w:tab w:val="left" w:pos="916"/>
+          <w:tab w:val="left" w:pos="1832"/>
+          <w:tab w:val="left" w:pos="2748"/>
+          <w:tab w:val="left" w:pos="3664"/>
+          <w:tab w:val="left" w:pos="4580"/>
+          <w:tab w:val="left" w:pos="5496"/>
+          <w:tab w:val="left" w:pos="6412"/>
+          <w:tab w:val="left" w:pos="7328"/>
+          <w:tab w:val="left" w:pos="8244"/>
+          <w:tab w:val="left" w:pos="9160"/>
+          <w:tab w:val="left" w:pos="10076"/>
+          <w:tab w:val="left" w:pos="10992"/>
+          <w:tab w:val="left" w:pos="11908"/>
+          <w:tab w:val="left" w:pos="12824"/>
+          <w:tab w:val="left" w:pos="13740"/>
+          <w:tab w:val="left" w:pos="14656"/>
+        </w:tabs>
+        <w:spacing w:after="0" w:line="240" w:lineRule="auto"/>
+        <w:rPr>
+          <w:rFonts w:ascii="Consolas" w:eastAsia="Times New Roman" w:hAnsi="Consolas" w:cs="Courier New"/>
+          <w:color w:val="E2E2E2"/>
+          <w:kern w:val="0"/>
+          <w:sz w:val="21"/>
+          <w:szCs w:val="21"/>
+          <w:lang w:val="en-US" w:eastAsia="de-DE"/>
+          <w14:ligatures w14:val="none"/>
+        </w:rPr>
+      </w:pPr>
+      <w:r>
+        <w:rPr>
+          <w:rFonts w:ascii="Consolas" w:eastAsia="Times New Roman" w:hAnsi="Consolas" w:cs="Courier New"/>
+          <w:color w:val="E2E2E2"/>
+          <w:kern w:val="0"/>
+          <w:sz w:val="21"/>
+          <w:szCs w:val="21"/>
+          <w:lang w:val="en-US" w:eastAsia="de-DE"/>
+          <w14:ligatures w14:val="none"/>
+        </w:rPr>
+        <w:t xml:space="preserve">    </w:t>
+      </w:r>
+      <w:r>
+        <w:rPr>
+          <w:rFonts w:ascii="Consolas" w:eastAsia="Times New Roman" w:hAnsi="Consolas" w:cs="Courier New"/>
+          <w:color w:val="E2E2E2"/>
+          <w:kern w:val="0"/>
+          <w:sz w:val="21"/>
+          <w:szCs w:val="21"/>
+          <w:lang w:val="en-US" w:eastAsia="de-DE"/>
+          <w14:ligatures w14:val="none"/>
+        </w:rPr>
+        <w:t>std::</w:t>
+      </w:r>
+      <w:proofErr w:type="spellStart"/>
+      <w:r>
+        <w:rPr>
+          <w:rFonts w:ascii="Consolas" w:eastAsia="Times New Roman" w:hAnsi="Consolas" w:cs="Courier New"/>
+          <w:color w:val="E2E2E2"/>
+          <w:kern w:val="0"/>
+          <w:sz w:val="21"/>
+          <w:szCs w:val="21"/>
+          <w:lang w:val="en-US" w:eastAsia="de-DE"/>
+          <w14:ligatures w14:val="none"/>
+        </w:rPr>
+        <w:t>cout</w:t>
+      </w:r>
+      <w:proofErr w:type="spellEnd"/>
+      <w:r>
+        <w:rPr>
+          <w:rFonts w:ascii="Consolas" w:eastAsia="Times New Roman" w:hAnsi="Consolas" w:cs="Courier New"/>
+          <w:color w:val="E2E2E2"/>
+          <w:kern w:val="0"/>
+          <w:sz w:val="21"/>
+          <w:szCs w:val="21"/>
+          <w:lang w:val="en-US" w:eastAsia="de-DE"/>
+          <w14:ligatures w14:val="none"/>
+        </w:rPr>
+        <w:t xml:space="preserve"> &lt;&lt; </w:t>
+      </w:r>
+      <w:r>
+        <w:rPr>
+          <w:rFonts w:ascii="Consolas" w:eastAsia="Times New Roman" w:hAnsi="Consolas" w:cs="Courier New"/>
+          <w:color w:val="E2E2E2"/>
+          <w:kern w:val="0"/>
+          <w:sz w:val="21"/>
+          <w:szCs w:val="21"/>
+          <w:lang w:val="en-US" w:eastAsia="de-DE"/>
+          <w14:ligatures w14:val="none"/>
+        </w:rPr>
+        <w:t>string2</w:t>
+      </w:r>
+      <w:r>
+        <w:rPr>
+          <w:rFonts w:ascii="Consolas" w:eastAsia="Times New Roman" w:hAnsi="Consolas" w:cs="Courier New"/>
+          <w:color w:val="E2E2E2"/>
+          <w:kern w:val="0"/>
+          <w:sz w:val="21"/>
+          <w:szCs w:val="21"/>
+          <w:lang w:val="en-US" w:eastAsia="de-DE"/>
+          <w14:ligatures w14:val="none"/>
+        </w:rPr>
+        <w:t xml:space="preserve"> &lt;&lt; std::</w:t>
+      </w:r>
+      <w:proofErr w:type="spellStart"/>
+      <w:r>
+        <w:rPr>
+          <w:rFonts w:ascii="Consolas" w:eastAsia="Times New Roman" w:hAnsi="Consolas" w:cs="Courier New"/>
+          <w:color w:val="E2E2E2"/>
+          <w:kern w:val="0"/>
+          <w:sz w:val="21"/>
+          <w:szCs w:val="21"/>
+          <w:lang w:val="en-US" w:eastAsia="de-DE"/>
+          <w14:ligatures w14:val="none"/>
+        </w:rPr>
+        <w:t>endl</w:t>
+      </w:r>
+      <w:proofErr w:type="spellEnd"/>
+      <w:r>
+        <w:rPr>
+          <w:rFonts w:ascii="Consolas" w:eastAsia="Times New Roman" w:hAnsi="Consolas" w:cs="Courier New"/>
+          <w:color w:val="E2E2E2"/>
+          <w:kern w:val="0"/>
+          <w:sz w:val="21"/>
+          <w:szCs w:val="21"/>
+          <w:lang w:val="en-US" w:eastAsia="de-DE"/>
+          <w14:ligatures w14:val="none"/>
+        </w:rPr>
+        <w:t>;</w:t>
+      </w:r>
+    </w:p>
+    <w:p>
+      <w:pPr>
+        <w:shd w:val="clear" w:color="auto" w:fill="303030"/>
+        <w:tabs>
+          <w:tab w:val="left" w:pos="916"/>
+          <w:tab w:val="left" w:pos="1832"/>
+          <w:tab w:val="left" w:pos="2748"/>
+          <w:tab w:val="left" w:pos="3664"/>
+          <w:tab w:val="left" w:pos="4580"/>
+          <w:tab w:val="left" w:pos="5496"/>
+          <w:tab w:val="left" w:pos="6412"/>
+          <w:tab w:val="left" w:pos="7328"/>
+          <w:tab w:val="left" w:pos="8244"/>
+          <w:tab w:val="left" w:pos="9160"/>
+          <w:tab w:val="left" w:pos="10076"/>
+          <w:tab w:val="left" w:pos="10992"/>
+          <w:tab w:val="left" w:pos="11908"/>
+          <w:tab w:val="left" w:pos="12824"/>
+          <w:tab w:val="left" w:pos="13740"/>
+          <w:tab w:val="left" w:pos="14656"/>
+        </w:tabs>
+        <w:spacing w:after="0" w:line="240" w:lineRule="auto"/>
+        <w:rPr>
+          <w:rFonts w:ascii="Consolas" w:eastAsia="Times New Roman" w:hAnsi="Consolas" w:cs="Courier New"/>
+          <w:color w:val="E2E2E2"/>
+          <w:kern w:val="0"/>
+          <w:sz w:val="21"/>
+          <w:szCs w:val="21"/>
+          <w:lang w:val="en-US" w:eastAsia="de-DE"/>
+          <w14:ligatures w14:val="none"/>
+        </w:rPr>
+      </w:pPr>
+    </w:p>
+    <w:p>
+      <w:pPr>
+        <w:pStyle w:val="HTMLVorformatiert"/>
+        <w:shd w:val="clear" w:color="auto" w:fill="2E2E2E"/>
+        <w:rPr>
+          <w:rFonts w:eastAsia="Times New Roman" w:cs="Courier New"/>
+          <w:color w:val="00CF11"/>
+          <w:kern w:val="0"/>
+          <w:sz w:val="21"/>
+          <w:szCs w:val="21"/>
+          <w:lang w:val="en-US" w:eastAsia="de-DE"/>
+          <w14:ligatures w14:val="none"/>
+        </w:rPr>
+      </w:pPr>
+      <w:r>
+        <w:rPr>
+          <w:rFonts w:eastAsia="Times New Roman" w:cs="Courier New"/>
+          <w:color w:val="FFD700"/>
+          <w:kern w:val="0"/>
+          <w:sz w:val="21"/>
+          <w:szCs w:val="21"/>
+          <w:lang w:val="en-US" w:eastAsia="de-DE"/>
+          <w14:ligatures w14:val="none"/>
+        </w:rPr>
+        <w:t xml:space="preserve">    </w:t>
+      </w:r>
+      <w:r>
+        <w:rPr>
+          <w:rFonts w:eastAsia="Times New Roman" w:cs="Courier New"/>
+          <w:color w:val="00CF11"/>
+          <w:kern w:val="0"/>
+          <w:sz w:val="21"/>
+          <w:szCs w:val="21"/>
+          <w:lang w:val="en-US" w:eastAsia="de-DE"/>
+          <w14:ligatures w14:val="none"/>
+        </w:rPr>
+        <w:t>//</w:t>
+      </w:r>
+      <w:r>
+        <w:rPr>
+          <w:rFonts w:eastAsia="Times New Roman" w:cs="Courier New"/>
+          <w:color w:val="00CF11"/>
+          <w:kern w:val="0"/>
+          <w:sz w:val="21"/>
+          <w:szCs w:val="21"/>
+          <w:lang w:val="en-US" w:eastAsia="de-DE"/>
+          <w14:ligatures w14:val="none"/>
+        </w:rPr>
+        <w:t>C-Style String</w:t>
+      </w:r>
+    </w:p>
+    <w:p>
+      <w:pPr>
+        <w:shd w:val="clear" w:color="auto" w:fill="303030"/>
+        <w:tabs>
+          <w:tab w:val="left" w:pos="916"/>
+          <w:tab w:val="left" w:pos="1832"/>
+          <w:tab w:val="left" w:pos="2748"/>
+          <w:tab w:val="left" w:pos="3664"/>
+          <w:tab w:val="left" w:pos="4580"/>
+          <w:tab w:val="left" w:pos="5496"/>
+          <w:tab w:val="left" w:pos="6412"/>
+          <w:tab w:val="left" w:pos="7328"/>
+          <w:tab w:val="left" w:pos="8244"/>
+          <w:tab w:val="left" w:pos="9160"/>
+          <w:tab w:val="left" w:pos="10076"/>
+          <w:tab w:val="left" w:pos="10992"/>
+          <w:tab w:val="left" w:pos="11908"/>
+          <w:tab w:val="left" w:pos="12824"/>
+          <w:tab w:val="left" w:pos="13740"/>
+          <w:tab w:val="left" w:pos="14656"/>
+        </w:tabs>
+        <w:spacing w:after="0" w:line="240" w:lineRule="auto"/>
+        <w:rPr>
+          <w:rFonts w:ascii="Consolas" w:eastAsia="Times New Roman" w:hAnsi="Consolas" w:cs="Courier New"/>
+          <w:color w:val="E2E2E2"/>
+          <w:kern w:val="0"/>
+          <w:sz w:val="21"/>
+          <w:szCs w:val="21"/>
+          <w:lang w:val="en-US" w:eastAsia="de-DE"/>
+          <w14:ligatures w14:val="none"/>
+        </w:rPr>
+      </w:pPr>
+      <w:r>
+        <w:rPr>
+          <w:rFonts w:ascii="Consolas" w:eastAsia="Times New Roman" w:hAnsi="Consolas" w:cs="Courier New"/>
+          <w:b/>
+          <w:bCs/>
+          <w:color w:val="569CD6"/>
+          <w:kern w:val="0"/>
+          <w:sz w:val="21"/>
+          <w:szCs w:val="21"/>
+          <w:lang w:val="en-US" w:eastAsia="de-DE"/>
+          <w14:ligatures w14:val="none"/>
+        </w:rPr>
+        <w:t xml:space="preserve">    </w:t>
+      </w:r>
+      <w:r>
+        <w:rPr>
+          <w:rFonts w:ascii="Consolas" w:eastAsia="Times New Roman" w:hAnsi="Consolas" w:cs="Courier New"/>
+          <w:b/>
+          <w:bCs/>
+          <w:color w:val="569CD6"/>
+          <w:kern w:val="0"/>
+          <w:sz w:val="21"/>
+          <w:szCs w:val="21"/>
+          <w:lang w:val="en-US" w:eastAsia="de-DE"/>
+          <w14:ligatures w14:val="none"/>
+        </w:rPr>
+        <w:t>for</w:t>
+      </w:r>
+      <w:r>
+        <w:rPr>
+          <w:rFonts w:ascii="Consolas" w:eastAsia="Times New Roman" w:hAnsi="Consolas" w:cs="Courier New"/>
+          <w:color w:val="E2E2E2"/>
+          <w:kern w:val="0"/>
+          <w:sz w:val="21"/>
+          <w:szCs w:val="21"/>
+          <w:lang w:val="en-US" w:eastAsia="de-DE"/>
+          <w14:ligatures w14:val="none"/>
+        </w:rPr>
+        <w:t>(</w:t>
+      </w:r>
+      <w:r>
+        <w:rPr>
+          <w:rFonts w:ascii="Consolas" w:eastAsia="Times New Roman" w:hAnsi="Consolas" w:cs="Courier New"/>
+          <w:b/>
+          <w:bCs/>
+          <w:color w:val="569CD6"/>
+          <w:kern w:val="0"/>
+          <w:sz w:val="21"/>
+          <w:szCs w:val="21"/>
+          <w:lang w:val="en-US" w:eastAsia="de-DE"/>
+          <w14:ligatures w14:val="none"/>
+        </w:rPr>
+        <w:t>int</w:t>
+      </w:r>
+      <w:r>
+        <w:rPr>
+          <w:rFonts w:ascii="Consolas" w:eastAsia="Times New Roman" w:hAnsi="Consolas" w:cs="Courier New"/>
+          <w:color w:val="E2E2E2"/>
+          <w:kern w:val="0"/>
+          <w:sz w:val="21"/>
+          <w:szCs w:val="21"/>
+          <w:lang w:val="en-US" w:eastAsia="de-DE"/>
+          <w14:ligatures w14:val="none"/>
+        </w:rPr>
+        <w:t xml:space="preserve"> </w:t>
+      </w:r>
+      <w:proofErr w:type="spellStart"/>
+      <w:r>
+        <w:rPr>
+          <w:rFonts w:ascii="Consolas" w:eastAsia="Times New Roman" w:hAnsi="Consolas" w:cs="Courier New"/>
+          <w:color w:val="E2E2E2"/>
+          <w:kern w:val="0"/>
+          <w:sz w:val="21"/>
+          <w:szCs w:val="21"/>
+          <w:lang w:val="en-US" w:eastAsia="de-DE"/>
+          <w14:ligatures w14:val="none"/>
+        </w:rPr>
+        <w:t>i</w:t>
+      </w:r>
+      <w:proofErr w:type="spellEnd"/>
+      <w:r>
+        <w:rPr>
+          <w:rFonts w:ascii="Consolas" w:eastAsia="Times New Roman" w:hAnsi="Consolas" w:cs="Courier New"/>
+          <w:color w:val="E2E2E2"/>
+          <w:kern w:val="0"/>
+          <w:sz w:val="21"/>
+          <w:szCs w:val="21"/>
+          <w:lang w:val="en-US" w:eastAsia="de-DE"/>
+          <w14:ligatures w14:val="none"/>
+        </w:rPr>
+        <w:t xml:space="preserve"> = </w:t>
+      </w:r>
+      <w:r>
+        <w:rPr>
+          <w:rFonts w:ascii="Consolas" w:eastAsia="Times New Roman" w:hAnsi="Consolas" w:cs="Courier New"/>
+          <w:color w:val="A6E696"/>
+          <w:kern w:val="0"/>
+          <w:sz w:val="21"/>
+          <w:szCs w:val="21"/>
+          <w:lang w:val="en-US" w:eastAsia="de-DE"/>
+          <w14:ligatures w14:val="none"/>
+        </w:rPr>
+        <w:t>0</w:t>
+      </w:r>
+      <w:r>
+        <w:rPr>
+          <w:rFonts w:ascii="Consolas" w:eastAsia="Times New Roman" w:hAnsi="Consolas" w:cs="Courier New"/>
+          <w:color w:val="E2E2E2"/>
+          <w:kern w:val="0"/>
+          <w:sz w:val="21"/>
+          <w:szCs w:val="21"/>
+          <w:lang w:val="en-US" w:eastAsia="de-DE"/>
+          <w14:ligatures w14:val="none"/>
+        </w:rPr>
+        <w:t>;</w:t>
+      </w:r>
+      <w:r>
+        <w:rPr>
+          <w:rFonts w:ascii="Consolas" w:eastAsia="Times New Roman" w:hAnsi="Consolas" w:cs="Courier New"/>
+          <w:color w:val="E2E2E2"/>
+          <w:kern w:val="0"/>
+          <w:sz w:val="21"/>
+          <w:szCs w:val="21"/>
+          <w:lang w:val="en-US" w:eastAsia="de-DE"/>
+          <w14:ligatures w14:val="none"/>
+        </w:rPr>
+        <w:t xml:space="preserve"> </w:t>
+      </w:r>
+      <w:proofErr w:type="spellStart"/>
+      <w:r>
+        <w:rPr>
+          <w:rFonts w:ascii="Consolas" w:eastAsia="Times New Roman" w:hAnsi="Consolas" w:cs="Courier New"/>
+          <w:color w:val="E2E2E2"/>
+          <w:kern w:val="0"/>
+          <w:sz w:val="21"/>
+          <w:szCs w:val="21"/>
+          <w:lang w:val="en-US" w:eastAsia="de-DE"/>
+          <w14:ligatures w14:val="none"/>
+        </w:rPr>
+        <w:t>i</w:t>
+      </w:r>
+      <w:proofErr w:type="spellEnd"/>
+      <w:r>
+        <w:rPr>
+          <w:rFonts w:ascii="Consolas" w:eastAsia="Times New Roman" w:hAnsi="Consolas" w:cs="Courier New"/>
+          <w:color w:val="E2E2E2"/>
+          <w:kern w:val="0"/>
+          <w:sz w:val="21"/>
+          <w:szCs w:val="21"/>
+          <w:lang w:val="en-US" w:eastAsia="de-DE"/>
+          <w14:ligatures w14:val="none"/>
+        </w:rPr>
+        <w:t xml:space="preserve"> &lt;=</w:t>
+      </w:r>
+      <w:r>
+        <w:rPr>
+          <w:rFonts w:ascii="Consolas" w:eastAsia="Times New Roman" w:hAnsi="Consolas" w:cs="Courier New"/>
+          <w:color w:val="E2E2E2"/>
+          <w:kern w:val="0"/>
+          <w:sz w:val="21"/>
+          <w:szCs w:val="21"/>
+          <w:lang w:val="en-US" w:eastAsia="de-DE"/>
+          <w14:ligatures w14:val="none"/>
+        </w:rPr>
+        <w:t xml:space="preserve"> ((</w:t>
+      </w:r>
+      <w:proofErr w:type="spellStart"/>
+      <w:r>
+        <w:rPr>
+          <w:rFonts w:ascii="Consolas" w:eastAsia="Times New Roman" w:hAnsi="Consolas" w:cs="Courier New"/>
+          <w:b/>
+          <w:bCs/>
+          <w:color w:val="569CD6"/>
+          <w:kern w:val="0"/>
+          <w:sz w:val="21"/>
+          <w:szCs w:val="21"/>
+          <w:lang w:val="en-US" w:eastAsia="de-DE"/>
+          <w14:ligatures w14:val="none"/>
+        </w:rPr>
+        <w:t>sizeof</w:t>
+      </w:r>
+      <w:proofErr w:type="spellEnd"/>
+      <w:r>
+        <w:rPr>
+          <w:rFonts w:ascii="Consolas" w:eastAsia="Times New Roman" w:hAnsi="Consolas" w:cs="Courier New"/>
+          <w:color w:val="E2E2E2"/>
+          <w:kern w:val="0"/>
+          <w:sz w:val="21"/>
+          <w:szCs w:val="21"/>
+          <w:lang w:val="en-US" w:eastAsia="de-DE"/>
+          <w14:ligatures w14:val="none"/>
+        </w:rPr>
+        <w:t>(</w:t>
+      </w:r>
+      <w:r>
+        <w:rPr>
+          <w:rFonts w:ascii="Consolas" w:eastAsia="Times New Roman" w:hAnsi="Consolas" w:cs="Courier New"/>
+          <w:color w:val="E2E2E2"/>
+          <w:kern w:val="0"/>
+          <w:sz w:val="21"/>
+          <w:szCs w:val="21"/>
+          <w:lang w:val="en-US" w:eastAsia="de-DE"/>
+          <w14:ligatures w14:val="none"/>
+        </w:rPr>
+        <w:t xml:space="preserve">string1) / </w:t>
+      </w:r>
+      <w:proofErr w:type="spellStart"/>
+      <w:r>
+        <w:rPr>
+          <w:rFonts w:ascii="Consolas" w:eastAsia="Times New Roman" w:hAnsi="Consolas" w:cs="Courier New"/>
+          <w:b/>
+          <w:bCs/>
+          <w:color w:val="569CD6"/>
+          <w:kern w:val="0"/>
+          <w:sz w:val="21"/>
+          <w:szCs w:val="21"/>
+          <w:lang w:val="en-US" w:eastAsia="de-DE"/>
+          <w14:ligatures w14:val="none"/>
+        </w:rPr>
+        <w:t>sizeof</w:t>
+      </w:r>
+      <w:proofErr w:type="spellEnd"/>
+      <w:r>
+        <w:rPr>
+          <w:rFonts w:ascii="Consolas" w:eastAsia="Times New Roman" w:hAnsi="Consolas" w:cs="Courier New"/>
+          <w:color w:val="E2E2E2"/>
+          <w:kern w:val="0"/>
+          <w:sz w:val="21"/>
+          <w:szCs w:val="21"/>
+          <w:lang w:val="en-US" w:eastAsia="de-DE"/>
+          <w14:ligatures w14:val="none"/>
+        </w:rPr>
+        <w:t>(string1</w:t>
+      </w:r>
+      <w:r>
+        <w:rPr>
+          <w:rFonts w:ascii="Consolas" w:eastAsia="Times New Roman" w:hAnsi="Consolas" w:cs="Courier New"/>
+          <w:color w:val="E2E2E2"/>
+          <w:kern w:val="0"/>
+          <w:sz w:val="21"/>
+          <w:szCs w:val="21"/>
+          <w:lang w:val="en-US" w:eastAsia="de-DE"/>
+          <w14:ligatures w14:val="none"/>
+        </w:rPr>
+        <w:t>[</w:t>
+      </w:r>
+      <w:r>
+        <w:rPr>
+          <w:rFonts w:ascii="Consolas" w:eastAsia="Times New Roman" w:hAnsi="Consolas" w:cs="Courier New"/>
+          <w:color w:val="A6E696"/>
+          <w:kern w:val="0"/>
+          <w:sz w:val="21"/>
+          <w:szCs w:val="21"/>
+          <w:lang w:val="en-US" w:eastAsia="de-DE"/>
+          <w14:ligatures w14:val="none"/>
+        </w:rPr>
+        <w:t>0</w:t>
+      </w:r>
+      <w:r>
+        <w:rPr>
+          <w:rFonts w:ascii="Consolas" w:eastAsia="Times New Roman" w:hAnsi="Consolas" w:cs="Courier New"/>
+          <w:color w:val="E2E2E2"/>
+          <w:kern w:val="0"/>
+          <w:sz w:val="21"/>
+          <w:szCs w:val="21"/>
+          <w:lang w:val="en-US" w:eastAsia="de-DE"/>
+          <w14:ligatures w14:val="none"/>
+        </w:rPr>
+        <w:t>]</w:t>
+      </w:r>
+      <w:r>
+        <w:rPr>
+          <w:rFonts w:ascii="Consolas" w:eastAsia="Times New Roman" w:hAnsi="Consolas" w:cs="Courier New"/>
+          <w:color w:val="E2E2E2"/>
+          <w:kern w:val="0"/>
+          <w:sz w:val="21"/>
+          <w:szCs w:val="21"/>
+          <w:lang w:val="en-US" w:eastAsia="de-DE"/>
+          <w14:ligatures w14:val="none"/>
+        </w:rPr>
+        <w:t>)</w:t>
+      </w:r>
+      <w:r>
+        <w:rPr>
+          <w:rFonts w:ascii="Consolas" w:eastAsia="Times New Roman" w:hAnsi="Consolas" w:cs="Courier New"/>
+          <w:color w:val="E2E2E2"/>
+          <w:kern w:val="0"/>
+          <w:sz w:val="21"/>
+          <w:szCs w:val="21"/>
+          <w:lang w:val="en-US" w:eastAsia="de-DE"/>
+          <w14:ligatures w14:val="none"/>
+        </w:rPr>
+        <w:t xml:space="preserve">) - </w:t>
+      </w:r>
+      <w:r>
+        <w:rPr>
+          <w:rFonts w:ascii="Consolas" w:eastAsia="Times New Roman" w:hAnsi="Consolas" w:cs="Courier New"/>
+          <w:color w:val="A6E696"/>
+          <w:kern w:val="0"/>
+          <w:sz w:val="21"/>
+          <w:szCs w:val="21"/>
+          <w:lang w:val="en-US" w:eastAsia="de-DE"/>
+          <w14:ligatures w14:val="none"/>
+        </w:rPr>
+        <w:t>1</w:t>
+      </w:r>
+      <w:r>
+        <w:rPr>
+          <w:rFonts w:ascii="Consolas" w:eastAsia="Times New Roman" w:hAnsi="Consolas" w:cs="Courier New"/>
+          <w:color w:val="E2E2E2"/>
+          <w:kern w:val="0"/>
+          <w:sz w:val="21"/>
+          <w:szCs w:val="21"/>
+          <w:lang w:val="en-US" w:eastAsia="de-DE"/>
+          <w14:ligatures w14:val="none"/>
+        </w:rPr>
+        <w:t>)</w:t>
+      </w:r>
+      <w:r>
+        <w:rPr>
+          <w:rFonts w:ascii="Consolas" w:eastAsia="Times New Roman" w:hAnsi="Consolas" w:cs="Courier New"/>
+          <w:color w:val="E2E2E2"/>
+          <w:kern w:val="0"/>
+          <w:sz w:val="21"/>
+          <w:szCs w:val="21"/>
+          <w:lang w:val="en-US" w:eastAsia="de-DE"/>
+          <w14:ligatures w14:val="none"/>
+        </w:rPr>
+        <w:t xml:space="preserve">; </w:t>
+      </w:r>
+      <w:proofErr w:type="spellStart"/>
+      <w:r>
+        <w:rPr>
+          <w:rFonts w:ascii="Consolas" w:eastAsia="Times New Roman" w:hAnsi="Consolas" w:cs="Courier New"/>
+          <w:color w:val="E2E2E2"/>
+          <w:kern w:val="0"/>
+          <w:sz w:val="21"/>
+          <w:szCs w:val="21"/>
+          <w:lang w:val="en-US" w:eastAsia="de-DE"/>
+          <w14:ligatures w14:val="none"/>
+        </w:rPr>
+        <w:t>i</w:t>
+      </w:r>
+      <w:proofErr w:type="spellEnd"/>
+      <w:r>
+        <w:rPr>
+          <w:rFonts w:ascii="Consolas" w:eastAsia="Times New Roman" w:hAnsi="Consolas" w:cs="Courier New"/>
+          <w:color w:val="E2E2E2"/>
+          <w:kern w:val="0"/>
+          <w:sz w:val="21"/>
+          <w:szCs w:val="21"/>
+          <w:lang w:val="en-US" w:eastAsia="de-DE"/>
+          <w14:ligatures w14:val="none"/>
+        </w:rPr>
+        <w:t>++)</w:t>
+      </w:r>
+    </w:p>
+    <w:p>
+      <w:pPr>
+        <w:shd w:val="clear" w:color="auto" w:fill="303030"/>
+        <w:tabs>
+          <w:tab w:val="left" w:pos="916"/>
+          <w:tab w:val="left" w:pos="1832"/>
+          <w:tab w:val="left" w:pos="2748"/>
+          <w:tab w:val="left" w:pos="3664"/>
+          <w:tab w:val="left" w:pos="4580"/>
+          <w:tab w:val="left" w:pos="5496"/>
+          <w:tab w:val="left" w:pos="6412"/>
+          <w:tab w:val="left" w:pos="7328"/>
+          <w:tab w:val="left" w:pos="8244"/>
+          <w:tab w:val="left" w:pos="9160"/>
+          <w:tab w:val="left" w:pos="10076"/>
+          <w:tab w:val="left" w:pos="10992"/>
+          <w:tab w:val="left" w:pos="11908"/>
+          <w:tab w:val="left" w:pos="12824"/>
+          <w:tab w:val="left" w:pos="13740"/>
+          <w:tab w:val="left" w:pos="14656"/>
+        </w:tabs>
+        <w:spacing w:after="0" w:line="240" w:lineRule="auto"/>
+        <w:rPr>
+          <w:rFonts w:ascii="Consolas" w:eastAsia="Times New Roman" w:hAnsi="Consolas" w:cs="Courier New"/>
+          <w:color w:val="FFD700"/>
+          <w:kern w:val="0"/>
+          <w:sz w:val="21"/>
+          <w:szCs w:val="21"/>
+          <w:lang w:val="en-US" w:eastAsia="de-DE"/>
+          <w14:ligatures w14:val="none"/>
+        </w:rPr>
+      </w:pPr>
+      <w:r>
+        <w:rPr>
+          <w:rFonts w:ascii="Consolas" w:eastAsia="Times New Roman" w:hAnsi="Consolas" w:cs="Courier New"/>
+          <w:color w:val="E2E2E2"/>
+          <w:kern w:val="0"/>
+          <w:sz w:val="21"/>
+          <w:szCs w:val="21"/>
+          <w:lang w:val="en-US" w:eastAsia="de-DE"/>
+          <w14:ligatures w14:val="none"/>
+        </w:rPr>
+        <w:t xml:space="preserve">    </w:t>
+      </w:r>
+      <w:r>
+        <w:rPr>
+          <w:rFonts w:ascii="Consolas" w:eastAsia="Times New Roman" w:hAnsi="Consolas" w:cs="Courier New"/>
+          <w:color w:val="FFD700"/>
+          <w:kern w:val="0"/>
+          <w:sz w:val="21"/>
+          <w:szCs w:val="21"/>
+          <w:lang w:val="en-US" w:eastAsia="de-DE"/>
+          <w14:ligatures w14:val="none"/>
+        </w:rPr>
+        <w:t>{</w:t>
+      </w:r>
+    </w:p>
+    <w:p>
+      <w:pPr>
+        <w:shd w:val="clear" w:color="auto" w:fill="303030"/>
+        <w:tabs>
+          <w:tab w:val="left" w:pos="916"/>
+          <w:tab w:val="left" w:pos="1832"/>
+          <w:tab w:val="left" w:pos="2748"/>
+          <w:tab w:val="left" w:pos="3664"/>
+          <w:tab w:val="left" w:pos="4580"/>
+          <w:tab w:val="left" w:pos="5496"/>
+          <w:tab w:val="left" w:pos="6412"/>
+          <w:tab w:val="left" w:pos="7328"/>
+          <w:tab w:val="left" w:pos="8244"/>
+          <w:tab w:val="left" w:pos="9160"/>
+          <w:tab w:val="left" w:pos="10076"/>
+          <w:tab w:val="left" w:pos="10992"/>
+          <w:tab w:val="left" w:pos="11908"/>
+          <w:tab w:val="left" w:pos="12824"/>
+          <w:tab w:val="left" w:pos="13740"/>
+          <w:tab w:val="left" w:pos="14656"/>
+        </w:tabs>
+        <w:spacing w:after="0" w:line="240" w:lineRule="auto"/>
+        <w:rPr>
+          <w:rFonts w:ascii="Consolas" w:eastAsia="Times New Roman" w:hAnsi="Consolas" w:cs="Courier New"/>
+          <w:color w:val="E2E2E2"/>
+          <w:kern w:val="0"/>
+          <w:sz w:val="21"/>
+          <w:szCs w:val="21"/>
+          <w:lang w:val="en-US" w:eastAsia="de-DE"/>
+          <w14:ligatures w14:val="none"/>
+        </w:rPr>
+      </w:pPr>
+      <w:r>
+        <w:rPr>
+          <w:rFonts w:ascii="Consolas" w:eastAsia="Times New Roman" w:hAnsi="Consolas" w:cs="Courier New"/>
+          <w:color w:val="E2E2E2"/>
+          <w:kern w:val="0"/>
+          <w:sz w:val="21"/>
+          <w:szCs w:val="21"/>
+          <w:lang w:val="en-US" w:eastAsia="de-DE"/>
+          <w14:ligatures w14:val="none"/>
+        </w:rPr>
+        <w:tab/>
+      </w:r>
+      <w:r>
+        <w:rPr>
+          <w:rFonts w:ascii="Consolas" w:eastAsia="Times New Roman" w:hAnsi="Consolas" w:cs="Courier New"/>
+          <w:b/>
+          <w:bCs/>
+          <w:color w:val="569CD6"/>
+          <w:kern w:val="0"/>
+          <w:sz w:val="21"/>
+          <w:szCs w:val="21"/>
+          <w:lang w:val="en-US" w:eastAsia="de-DE"/>
+          <w14:ligatures w14:val="none"/>
+        </w:rPr>
+        <w:t>if</w:t>
+      </w:r>
+      <w:r>
+        <w:rPr>
+          <w:rFonts w:ascii="Consolas" w:eastAsia="Times New Roman" w:hAnsi="Consolas" w:cs="Courier New"/>
+          <w:color w:val="E2E2E2"/>
+          <w:kern w:val="0"/>
+          <w:sz w:val="21"/>
+          <w:szCs w:val="21"/>
+          <w:lang w:val="en-US" w:eastAsia="de-DE"/>
+          <w14:ligatures w14:val="none"/>
+        </w:rPr>
+        <w:t>(</w:t>
+      </w:r>
+      <w:r>
+        <w:rPr>
+          <w:rFonts w:ascii="Consolas" w:eastAsia="Times New Roman" w:hAnsi="Consolas" w:cs="Courier New"/>
+          <w:color w:val="E2E2E2"/>
+          <w:kern w:val="0"/>
+          <w:sz w:val="21"/>
+          <w:szCs w:val="21"/>
+          <w:lang w:val="en-US" w:eastAsia="de-DE"/>
+          <w14:ligatures w14:val="none"/>
+        </w:rPr>
+        <w:t>string1[</w:t>
+      </w:r>
+      <w:proofErr w:type="spellStart"/>
+      <w:r>
+        <w:rPr>
+          <w:rFonts w:ascii="Consolas" w:eastAsia="Times New Roman" w:hAnsi="Consolas" w:cs="Courier New"/>
+          <w:color w:val="E2E2E2"/>
+          <w:kern w:val="0"/>
+          <w:sz w:val="21"/>
+          <w:szCs w:val="21"/>
+          <w:lang w:val="en-US" w:eastAsia="de-DE"/>
+          <w14:ligatures w14:val="none"/>
+        </w:rPr>
+        <w:t>i</w:t>
+      </w:r>
+      <w:proofErr w:type="spellEnd"/>
+      <w:r>
+        <w:rPr>
+          <w:rFonts w:ascii="Consolas" w:eastAsia="Times New Roman" w:hAnsi="Consolas" w:cs="Courier New"/>
+          <w:color w:val="E2E2E2"/>
+          <w:kern w:val="0"/>
+          <w:sz w:val="21"/>
+          <w:szCs w:val="21"/>
+          <w:lang w:val="en-US" w:eastAsia="de-DE"/>
+          <w14:ligatures w14:val="none"/>
+        </w:rPr>
+        <w:t>]</w:t>
+      </w:r>
+      <w:r>
+        <w:rPr>
+          <w:rFonts w:ascii="Consolas" w:eastAsia="Times New Roman" w:hAnsi="Consolas" w:cs="Courier New"/>
+          <w:color w:val="E2E2E2"/>
+          <w:kern w:val="0"/>
+          <w:sz w:val="21"/>
+          <w:szCs w:val="21"/>
+          <w:lang w:val="en-US" w:eastAsia="de-DE"/>
+          <w14:ligatures w14:val="none"/>
+        </w:rPr>
+        <w:t xml:space="preserve"> &gt; </w:t>
+      </w:r>
+      <w:r>
+        <w:rPr>
+          <w:rFonts w:eastAsia="Times New Roman" w:cs="Courier New"/>
+          <w:color w:val="A6E696"/>
+          <w:kern w:val="0"/>
+          <w:sz w:val="21"/>
+          <w:szCs w:val="21"/>
+          <w:lang w:val="en-US" w:eastAsia="de-DE"/>
+          <w14:ligatures w14:val="none"/>
+        </w:rPr>
+        <w:t>64</w:t>
+      </w:r>
+      <w:r>
+        <w:rPr>
+          <w:rFonts w:ascii="Consolas" w:eastAsia="Times New Roman" w:hAnsi="Consolas" w:cs="Courier New"/>
+          <w:color w:val="E2E2E2"/>
+          <w:kern w:val="0"/>
+          <w:sz w:val="21"/>
+          <w:szCs w:val="21"/>
+          <w:lang w:val="en-US" w:eastAsia="de-DE"/>
+          <w14:ligatures w14:val="none"/>
+        </w:rPr>
+        <w:t xml:space="preserve"> &amp;&amp;</w:t>
+      </w:r>
+      <w:r>
+        <w:rPr>
+          <w:rFonts w:ascii="Consolas" w:eastAsia="Times New Roman" w:hAnsi="Consolas" w:cs="Courier New"/>
+          <w:color w:val="E2E2E2"/>
+          <w:kern w:val="0"/>
+          <w:sz w:val="21"/>
+          <w:szCs w:val="21"/>
+          <w:lang w:val="en-US" w:eastAsia="de-DE"/>
+          <w14:ligatures w14:val="none"/>
+        </w:rPr>
+        <w:t xml:space="preserve"> </w:t>
+      </w:r>
+      <w:r>
+        <w:rPr>
+          <w:rFonts w:ascii="Consolas" w:eastAsia="Times New Roman" w:hAnsi="Consolas" w:cs="Courier New"/>
+          <w:color w:val="E2E2E2"/>
+          <w:kern w:val="0"/>
+          <w:sz w:val="21"/>
+          <w:szCs w:val="21"/>
+          <w:lang w:val="en-US" w:eastAsia="de-DE"/>
+          <w14:ligatures w14:val="none"/>
+        </w:rPr>
+        <w:t>string1[</w:t>
+      </w:r>
+      <w:proofErr w:type="spellStart"/>
+      <w:r>
+        <w:rPr>
+          <w:rFonts w:ascii="Consolas" w:eastAsia="Times New Roman" w:hAnsi="Consolas" w:cs="Courier New"/>
+          <w:color w:val="E2E2E2"/>
+          <w:kern w:val="0"/>
+          <w:sz w:val="21"/>
+          <w:szCs w:val="21"/>
+          <w:lang w:val="en-US" w:eastAsia="de-DE"/>
+          <w14:ligatures w14:val="none"/>
+        </w:rPr>
+        <w:t>i</w:t>
+      </w:r>
+      <w:proofErr w:type="spellEnd"/>
+      <w:r>
+        <w:rPr>
+          <w:rFonts w:ascii="Consolas" w:eastAsia="Times New Roman" w:hAnsi="Consolas" w:cs="Courier New"/>
+          <w:color w:val="E2E2E2"/>
+          <w:kern w:val="0"/>
+          <w:sz w:val="21"/>
+          <w:szCs w:val="21"/>
+          <w:lang w:val="en-US" w:eastAsia="de-DE"/>
+          <w14:ligatures w14:val="none"/>
+        </w:rPr>
+        <w:t>]</w:t>
+      </w:r>
+      <w:r>
+        <w:rPr>
+          <w:rFonts w:ascii="Consolas" w:eastAsia="Times New Roman" w:hAnsi="Consolas" w:cs="Courier New"/>
+          <w:color w:val="E2E2E2"/>
+          <w:kern w:val="0"/>
+          <w:sz w:val="21"/>
+          <w:szCs w:val="21"/>
+          <w:lang w:val="en-US" w:eastAsia="de-DE"/>
+          <w14:ligatures w14:val="none"/>
+        </w:rPr>
+        <w:t xml:space="preserve"> &lt; </w:t>
+      </w:r>
+      <w:r>
+        <w:rPr>
+          <w:rFonts w:eastAsia="Times New Roman" w:cs="Courier New"/>
+          <w:color w:val="A6E696"/>
+          <w:kern w:val="0"/>
+          <w:sz w:val="21"/>
+          <w:szCs w:val="21"/>
+          <w:lang w:val="en-US" w:eastAsia="de-DE"/>
+          <w14:ligatures w14:val="none"/>
+        </w:rPr>
+        <w:t>91</w:t>
+      </w:r>
+      <w:r>
+        <w:rPr>
+          <w:rFonts w:ascii="Consolas" w:eastAsia="Times New Roman" w:hAnsi="Consolas" w:cs="Courier New"/>
+          <w:color w:val="E2E2E2"/>
+          <w:kern w:val="0"/>
+          <w:sz w:val="21"/>
+          <w:szCs w:val="21"/>
+          <w:lang w:val="en-US" w:eastAsia="de-DE"/>
+          <w14:ligatures w14:val="none"/>
+        </w:rPr>
+        <w:t>)</w:t>
+      </w:r>
+    </w:p>
+    <w:p>
+      <w:pPr>
+        <w:shd w:val="clear" w:color="auto" w:fill="303030"/>
+        <w:tabs>
+          <w:tab w:val="left" w:pos="916"/>
+          <w:tab w:val="left" w:pos="1832"/>
+          <w:tab w:val="left" w:pos="2748"/>
+          <w:tab w:val="left" w:pos="3664"/>
+          <w:tab w:val="left" w:pos="4580"/>
+          <w:tab w:val="left" w:pos="5496"/>
+          <w:tab w:val="left" w:pos="6412"/>
+          <w:tab w:val="left" w:pos="7328"/>
+          <w:tab w:val="left" w:pos="8244"/>
+          <w:tab w:val="left" w:pos="9160"/>
+          <w:tab w:val="left" w:pos="10076"/>
+          <w:tab w:val="left" w:pos="10992"/>
+          <w:tab w:val="left" w:pos="11908"/>
+          <w:tab w:val="left" w:pos="12824"/>
+          <w:tab w:val="left" w:pos="13740"/>
+          <w:tab w:val="left" w:pos="14656"/>
+        </w:tabs>
+        <w:spacing w:after="0" w:line="240" w:lineRule="auto"/>
+        <w:rPr>
+          <w:rFonts w:ascii="Consolas" w:eastAsia="Times New Roman" w:hAnsi="Consolas" w:cs="Courier New"/>
+          <w:color w:val="E2E2E2"/>
+          <w:kern w:val="0"/>
+          <w:sz w:val="21"/>
+          <w:szCs w:val="21"/>
+          <w:lang w:val="en-US" w:eastAsia="de-DE"/>
+          <w14:ligatures w14:val="none"/>
+        </w:rPr>
+      </w:pPr>
+      <w:r>
+        <w:rPr>
+          <w:rFonts w:ascii="Consolas" w:eastAsia="Times New Roman" w:hAnsi="Consolas" w:cs="Courier New"/>
+          <w:color w:val="E2E2E2"/>
+          <w:kern w:val="0"/>
+          <w:sz w:val="21"/>
+          <w:szCs w:val="21"/>
+          <w:lang w:val="en-US" w:eastAsia="de-DE"/>
+          <w14:ligatures w14:val="none"/>
+        </w:rPr>
+        <w:tab/>
+      </w:r>
+      <w:r>
+        <w:rPr>
+          <w:rFonts w:ascii="Consolas" w:eastAsia="Times New Roman" w:hAnsi="Consolas" w:cs="Courier New"/>
+          <w:color w:val="FFD700"/>
+          <w:kern w:val="0"/>
+          <w:sz w:val="21"/>
+          <w:szCs w:val="21"/>
+          <w:lang w:val="en-US" w:eastAsia="de-DE"/>
+          <w14:ligatures w14:val="none"/>
+        </w:rPr>
+        <w:t>{</w:t>
+      </w:r>
+    </w:p>
+    <w:p>
+      <w:pPr>
+        <w:shd w:val="clear" w:color="auto" w:fill="303030"/>
+        <w:tabs>
+          <w:tab w:val="left" w:pos="916"/>
+          <w:tab w:val="left" w:pos="1832"/>
+          <w:tab w:val="left" w:pos="2748"/>
+          <w:tab w:val="left" w:pos="3664"/>
+          <w:tab w:val="left" w:pos="4580"/>
+          <w:tab w:val="left" w:pos="5496"/>
+          <w:tab w:val="left" w:pos="6412"/>
+          <w:tab w:val="left" w:pos="7328"/>
+          <w:tab w:val="left" w:pos="8244"/>
+          <w:tab w:val="left" w:pos="9160"/>
+          <w:tab w:val="left" w:pos="10076"/>
+          <w:tab w:val="left" w:pos="10992"/>
+          <w:tab w:val="left" w:pos="11908"/>
+          <w:tab w:val="left" w:pos="12824"/>
+          <w:tab w:val="left" w:pos="13740"/>
+          <w:tab w:val="left" w:pos="14656"/>
+        </w:tabs>
+        <w:spacing w:after="0" w:line="240" w:lineRule="auto"/>
+        <w:rPr>
+          <w:rFonts w:ascii="Consolas" w:eastAsia="Times New Roman" w:hAnsi="Consolas" w:cs="Courier New"/>
+          <w:color w:val="E2E2E2"/>
+          <w:kern w:val="0"/>
+          <w:sz w:val="21"/>
+          <w:szCs w:val="21"/>
+          <w:lang w:val="en-US" w:eastAsia="de-DE"/>
+          <w14:ligatures w14:val="none"/>
+        </w:rPr>
+      </w:pPr>
+      <w:r>
+        <w:rPr>
+          <w:rFonts w:ascii="Consolas" w:eastAsia="Times New Roman" w:hAnsi="Consolas" w:cs="Courier New"/>
+          <w:color w:val="E2E2E2"/>
+          <w:kern w:val="0"/>
+          <w:sz w:val="21"/>
+          <w:szCs w:val="21"/>
+          <w:lang w:val="en-US" w:eastAsia="de-DE"/>
+          <w14:ligatures w14:val="none"/>
+        </w:rPr>
+        <w:tab/>
+        <w:t xml:space="preserve">    </w:t>
+      </w:r>
+      <w:r>
+        <w:rPr>
+          <w:rFonts w:ascii="Consolas" w:eastAsia="Times New Roman" w:hAnsi="Consolas" w:cs="Courier New"/>
+          <w:color w:val="E2E2E2"/>
+          <w:kern w:val="0"/>
+          <w:sz w:val="21"/>
+          <w:szCs w:val="21"/>
+          <w:lang w:val="en-US" w:eastAsia="de-DE"/>
+          <w14:ligatures w14:val="none"/>
+        </w:rPr>
+        <w:t>string1[</w:t>
+      </w:r>
+      <w:proofErr w:type="spellStart"/>
+      <w:r>
+        <w:rPr>
+          <w:rFonts w:ascii="Consolas" w:eastAsia="Times New Roman" w:hAnsi="Consolas" w:cs="Courier New"/>
+          <w:color w:val="E2E2E2"/>
+          <w:kern w:val="0"/>
+          <w:sz w:val="21"/>
+          <w:szCs w:val="21"/>
+          <w:lang w:val="en-US" w:eastAsia="de-DE"/>
+          <w14:ligatures w14:val="none"/>
+        </w:rPr>
+        <w:t>i</w:t>
+      </w:r>
+      <w:proofErr w:type="spellEnd"/>
+      <w:r>
+        <w:rPr>
+          <w:rFonts w:ascii="Consolas" w:eastAsia="Times New Roman" w:hAnsi="Consolas" w:cs="Courier New"/>
+          <w:color w:val="E2E2E2"/>
+          <w:kern w:val="0"/>
+          <w:sz w:val="21"/>
+          <w:szCs w:val="21"/>
+          <w:lang w:val="en-US" w:eastAsia="de-DE"/>
+          <w14:ligatures w14:val="none"/>
+        </w:rPr>
+        <w:t>] = string1[</w:t>
+      </w:r>
+      <w:proofErr w:type="spellStart"/>
+      <w:r>
+        <w:rPr>
+          <w:rFonts w:ascii="Consolas" w:eastAsia="Times New Roman" w:hAnsi="Consolas" w:cs="Courier New"/>
+          <w:color w:val="E2E2E2"/>
+          <w:kern w:val="0"/>
+          <w:sz w:val="21"/>
+          <w:szCs w:val="21"/>
+          <w:lang w:val="en-US" w:eastAsia="de-DE"/>
+          <w14:ligatures w14:val="none"/>
+        </w:rPr>
+        <w:t>i</w:t>
+      </w:r>
+      <w:proofErr w:type="spellEnd"/>
+      <w:r>
+        <w:rPr>
+          <w:rFonts w:ascii="Consolas" w:eastAsia="Times New Roman" w:hAnsi="Consolas" w:cs="Courier New"/>
+          <w:color w:val="E2E2E2"/>
+          <w:kern w:val="0"/>
+          <w:sz w:val="21"/>
+          <w:szCs w:val="21"/>
+          <w:lang w:val="en-US" w:eastAsia="de-DE"/>
+          <w14:ligatures w14:val="none"/>
+        </w:rPr>
+        <w:t xml:space="preserve">] + </w:t>
+      </w:r>
+      <w:r>
+        <w:rPr>
+          <w:rFonts w:eastAsia="Times New Roman" w:cs="Courier New"/>
+          <w:color w:val="A6E696"/>
+          <w:kern w:val="0"/>
+          <w:sz w:val="21"/>
+          <w:szCs w:val="21"/>
+          <w:lang w:val="en-US" w:eastAsia="de-DE"/>
+          <w14:ligatures w14:val="none"/>
+        </w:rPr>
+        <w:t>32</w:t>
+      </w:r>
+      <w:r>
+        <w:rPr>
+          <w:rFonts w:ascii="Consolas" w:eastAsia="Times New Roman" w:hAnsi="Consolas" w:cs="Courier New"/>
+          <w:color w:val="E2E2E2"/>
+          <w:kern w:val="0"/>
+          <w:sz w:val="21"/>
+          <w:szCs w:val="21"/>
+          <w:lang w:val="en-US" w:eastAsia="de-DE"/>
+          <w14:ligatures w14:val="none"/>
+        </w:rPr>
+        <w:t>;</w:t>
+      </w:r>
+    </w:p>
+    <w:p>
+      <w:pPr>
+        <w:shd w:val="clear" w:color="auto" w:fill="303030"/>
+        <w:tabs>
+          <w:tab w:val="left" w:pos="916"/>
+          <w:tab w:val="left" w:pos="1832"/>
+          <w:tab w:val="left" w:pos="2748"/>
+          <w:tab w:val="left" w:pos="3664"/>
+          <w:tab w:val="left" w:pos="4580"/>
+          <w:tab w:val="left" w:pos="5496"/>
+          <w:tab w:val="left" w:pos="6412"/>
+          <w:tab w:val="left" w:pos="7328"/>
+          <w:tab w:val="left" w:pos="8244"/>
+          <w:tab w:val="left" w:pos="9160"/>
+          <w:tab w:val="left" w:pos="10076"/>
+          <w:tab w:val="left" w:pos="10992"/>
+          <w:tab w:val="left" w:pos="11908"/>
+          <w:tab w:val="left" w:pos="12824"/>
+          <w:tab w:val="left" w:pos="13740"/>
+          <w:tab w:val="left" w:pos="14656"/>
+        </w:tabs>
+        <w:spacing w:after="0" w:line="240" w:lineRule="auto"/>
+        <w:rPr>
+          <w:rFonts w:ascii="Consolas" w:eastAsia="Times New Roman" w:hAnsi="Consolas" w:cs="Courier New"/>
+          <w:color w:val="E2E2E2"/>
+          <w:kern w:val="0"/>
+          <w:sz w:val="21"/>
+          <w:szCs w:val="21"/>
+          <w:lang w:val="en-US" w:eastAsia="de-DE"/>
+          <w14:ligatures w14:val="none"/>
+        </w:rPr>
+      </w:pPr>
+      <w:r>
+        <w:rPr>
+          <w:rFonts w:ascii="Consolas" w:eastAsia="Times New Roman" w:hAnsi="Consolas" w:cs="Courier New"/>
+          <w:color w:val="E2E2E2"/>
+          <w:kern w:val="0"/>
+          <w:sz w:val="21"/>
+          <w:szCs w:val="21"/>
+          <w:lang w:val="en-US" w:eastAsia="de-DE"/>
+          <w14:ligatures w14:val="none"/>
+        </w:rPr>
+        <w:tab/>
+      </w:r>
+      <w:r>
+        <w:rPr>
+          <w:rFonts w:ascii="Consolas" w:eastAsia="Times New Roman" w:hAnsi="Consolas" w:cs="Courier New"/>
+          <w:color w:val="FFD700"/>
+          <w:kern w:val="0"/>
+          <w:sz w:val="21"/>
+          <w:szCs w:val="21"/>
+          <w:lang w:val="en-US" w:eastAsia="de-DE"/>
+          <w14:ligatures w14:val="none"/>
+        </w:rPr>
+        <w:t>}</w:t>
+      </w:r>
+      <w:r>
+        <w:rPr>
+          <w:rFonts w:ascii="Consolas" w:eastAsia="Times New Roman" w:hAnsi="Consolas" w:cs="Courier New"/>
+          <w:color w:val="E2E2E2"/>
+          <w:kern w:val="0"/>
+          <w:sz w:val="21"/>
+          <w:szCs w:val="21"/>
+          <w:lang w:val="en-US" w:eastAsia="de-DE"/>
+          <w14:ligatures w14:val="none"/>
+        </w:rPr>
+        <w:tab/>
+      </w:r>
+    </w:p>
+    <w:p>
+      <w:pPr>
+        <w:shd w:val="clear" w:color="auto" w:fill="303030"/>
+        <w:tabs>
+          <w:tab w:val="left" w:pos="916"/>
+          <w:tab w:val="left" w:pos="1832"/>
+          <w:tab w:val="left" w:pos="2748"/>
+          <w:tab w:val="left" w:pos="3664"/>
+          <w:tab w:val="left" w:pos="4580"/>
+          <w:tab w:val="left" w:pos="5496"/>
+          <w:tab w:val="left" w:pos="6412"/>
+          <w:tab w:val="left" w:pos="7328"/>
+          <w:tab w:val="left" w:pos="8244"/>
+          <w:tab w:val="left" w:pos="9160"/>
+          <w:tab w:val="left" w:pos="10076"/>
+          <w:tab w:val="left" w:pos="10992"/>
+          <w:tab w:val="left" w:pos="11908"/>
+          <w:tab w:val="left" w:pos="12824"/>
+          <w:tab w:val="left" w:pos="13740"/>
+          <w:tab w:val="left" w:pos="14656"/>
+        </w:tabs>
+        <w:spacing w:after="0" w:line="240" w:lineRule="auto"/>
+        <w:rPr>
+          <w:rFonts w:ascii="Consolas" w:eastAsia="Times New Roman" w:hAnsi="Consolas" w:cs="Courier New"/>
+          <w:color w:val="E2E2E2"/>
+          <w:kern w:val="0"/>
+          <w:sz w:val="21"/>
+          <w:szCs w:val="21"/>
+          <w:lang w:eastAsia="de-DE"/>
+          <w14:ligatures w14:val="none"/>
+        </w:rPr>
+      </w:pPr>
+      <w:r>
+        <w:rPr>
+          <w:rFonts w:ascii="Consolas" w:eastAsia="Times New Roman" w:hAnsi="Consolas" w:cs="Courier New"/>
+          <w:color w:val="E2E2E2"/>
+          <w:kern w:val="0"/>
+          <w:sz w:val="21"/>
+          <w:szCs w:val="21"/>
+          <w:lang w:val="en-US" w:eastAsia="de-DE"/>
+          <w14:ligatures w14:val="none"/>
+        </w:rPr>
+        <w:t xml:space="preserve">    </w:t>
+      </w:r>
+      <w:r>
+        <w:rPr>
+          <w:rFonts w:ascii="Consolas" w:eastAsia="Times New Roman" w:hAnsi="Consolas" w:cs="Courier New"/>
+          <w:color w:val="FFD700"/>
+          <w:kern w:val="0"/>
+          <w:sz w:val="21"/>
+          <w:szCs w:val="21"/>
+          <w:lang w:eastAsia="de-DE"/>
+          <w14:ligatures w14:val="none"/>
+        </w:rPr>
+        <w:t>}</w:t>
+      </w:r>
+    </w:p>
+    <w:p>
+      <w:pPr>
+        <w:pStyle w:val="HTMLVorformatiert"/>
+        <w:shd w:val="clear" w:color="auto" w:fill="2E2E2E"/>
+        <w:rPr>
+          <w:rFonts w:eastAsia="Times New Roman" w:cs="Courier New"/>
+          <w:color w:val="FFD700"/>
+          <w:kern w:val="0"/>
+          <w:sz w:val="21"/>
+          <w:szCs w:val="21"/>
+          <w:lang w:val="en-US" w:eastAsia="de-DE"/>
+          <w14:ligatures w14:val="none"/>
+        </w:rPr>
+      </w:pPr>
+    </w:p>
+    <w:p>
+      <w:pPr>
+        <w:pStyle w:val="HTMLVorformatiert"/>
+        <w:shd w:val="clear" w:color="auto" w:fill="2E2E2E"/>
+        <w:rPr>
+          <w:rFonts w:eastAsia="Times New Roman" w:cs="Courier New"/>
+          <w:color w:val="00CF11"/>
+          <w:kern w:val="0"/>
+          <w:sz w:val="21"/>
+          <w:szCs w:val="21"/>
+          <w:lang w:val="en-US" w:eastAsia="de-DE"/>
+          <w14:ligatures w14:val="none"/>
+        </w:rPr>
+      </w:pPr>
+      <w:r>
+        <w:rPr>
+          <w:rFonts w:eastAsia="Times New Roman" w:cs="Courier New"/>
+          <w:color w:val="FFD700"/>
+          <w:kern w:val="0"/>
+          <w:sz w:val="21"/>
+          <w:szCs w:val="21"/>
+          <w:lang w:val="en-US" w:eastAsia="de-DE"/>
+          <w14:ligatures w14:val="none"/>
+        </w:rPr>
+        <w:t xml:space="preserve">    </w:t>
+      </w:r>
+      <w:r>
+        <w:rPr>
+          <w:rFonts w:eastAsia="Times New Roman" w:cs="Courier New"/>
+          <w:color w:val="00CF11"/>
+          <w:kern w:val="0"/>
+          <w:sz w:val="21"/>
+          <w:szCs w:val="21"/>
+          <w:lang w:val="en-US" w:eastAsia="de-DE"/>
+          <w14:ligatures w14:val="none"/>
+        </w:rPr>
+        <w:t>//</w:t>
+      </w:r>
+      <w:r>
+        <w:rPr>
+          <w:rFonts w:eastAsia="Times New Roman" w:cs="Courier New"/>
+          <w:color w:val="00CF11"/>
+          <w:kern w:val="0"/>
+          <w:sz w:val="21"/>
+          <w:szCs w:val="21"/>
+          <w:lang w:val="en-US" w:eastAsia="de-DE"/>
+          <w14:ligatures w14:val="none"/>
+        </w:rPr>
+        <w:t>C</w:t>
+      </w:r>
+      <w:r>
+        <w:rPr>
+          <w:rFonts w:eastAsia="Times New Roman" w:cs="Courier New"/>
+          <w:color w:val="00CF11"/>
+          <w:kern w:val="0"/>
+          <w:sz w:val="21"/>
+          <w:szCs w:val="21"/>
+          <w:lang w:val="en-US" w:eastAsia="de-DE"/>
+          <w14:ligatures w14:val="none"/>
+        </w:rPr>
+        <w:t>++</w:t>
+      </w:r>
+      <w:r>
+        <w:rPr>
+          <w:rFonts w:eastAsia="Times New Roman" w:cs="Courier New"/>
+          <w:color w:val="00CF11"/>
+          <w:kern w:val="0"/>
+          <w:sz w:val="21"/>
+          <w:szCs w:val="21"/>
+          <w:lang w:val="en-US" w:eastAsia="de-DE"/>
+          <w14:ligatures w14:val="none"/>
+        </w:rPr>
+        <w:t xml:space="preserve"> String</w:t>
+      </w:r>
+    </w:p>
+    <w:p>
+      <w:pPr>
+        <w:shd w:val="clear" w:color="auto" w:fill="303030"/>
+        <w:tabs>
+          <w:tab w:val="left" w:pos="916"/>
+          <w:tab w:val="left" w:pos="1832"/>
+          <w:tab w:val="left" w:pos="2748"/>
+          <w:tab w:val="left" w:pos="3664"/>
+          <w:tab w:val="left" w:pos="4580"/>
+          <w:tab w:val="left" w:pos="5496"/>
+          <w:tab w:val="left" w:pos="6412"/>
+          <w:tab w:val="left" w:pos="7328"/>
+          <w:tab w:val="left" w:pos="8244"/>
+          <w:tab w:val="left" w:pos="9160"/>
+          <w:tab w:val="left" w:pos="10076"/>
+          <w:tab w:val="left" w:pos="10992"/>
+          <w:tab w:val="left" w:pos="11908"/>
+          <w:tab w:val="left" w:pos="12824"/>
+          <w:tab w:val="left" w:pos="13740"/>
+          <w:tab w:val="left" w:pos="14656"/>
+        </w:tabs>
+        <w:spacing w:after="0" w:line="240" w:lineRule="auto"/>
+        <w:rPr>
+          <w:rFonts w:ascii="Consolas" w:eastAsia="Times New Roman" w:hAnsi="Consolas" w:cs="Courier New"/>
+          <w:color w:val="E2E2E2"/>
+          <w:kern w:val="0"/>
+          <w:sz w:val="21"/>
+          <w:szCs w:val="21"/>
+          <w:lang w:val="en-US" w:eastAsia="de-DE"/>
+          <w14:ligatures w14:val="none"/>
+        </w:rPr>
+      </w:pPr>
+      <w:r>
+        <w:rPr>
+          <w:rFonts w:ascii="Consolas" w:eastAsia="Times New Roman" w:hAnsi="Consolas" w:cs="Courier New"/>
+          <w:b/>
+          <w:bCs/>
+          <w:color w:val="569CD6"/>
+          <w:kern w:val="0"/>
+          <w:sz w:val="21"/>
+          <w:szCs w:val="21"/>
+          <w:lang w:val="en-US" w:eastAsia="de-DE"/>
+          <w14:ligatures w14:val="none"/>
+        </w:rPr>
+        <w:t xml:space="preserve">    </w:t>
+      </w:r>
+      <w:r>
+        <w:rPr>
+          <w:rFonts w:ascii="Consolas" w:eastAsia="Times New Roman" w:hAnsi="Consolas" w:cs="Courier New"/>
+          <w:b/>
+          <w:bCs/>
+          <w:color w:val="569CD6"/>
+          <w:kern w:val="0"/>
+          <w:sz w:val="21"/>
+          <w:szCs w:val="21"/>
+          <w:lang w:val="en-US" w:eastAsia="de-DE"/>
+          <w14:ligatures w14:val="none"/>
+        </w:rPr>
+        <w:t>for</w:t>
+      </w:r>
+      <w:r>
+        <w:rPr>
+          <w:rFonts w:ascii="Consolas" w:eastAsia="Times New Roman" w:hAnsi="Consolas" w:cs="Courier New"/>
+          <w:color w:val="E2E2E2"/>
+          <w:kern w:val="0"/>
+          <w:sz w:val="21"/>
+          <w:szCs w:val="21"/>
+          <w:lang w:val="en-US" w:eastAsia="de-DE"/>
+          <w14:ligatures w14:val="none"/>
+        </w:rPr>
+        <w:t>(</w:t>
+      </w:r>
+      <w:r>
+        <w:rPr>
+          <w:rFonts w:ascii="Consolas" w:eastAsia="Times New Roman" w:hAnsi="Consolas" w:cs="Courier New"/>
+          <w:b/>
+          <w:bCs/>
+          <w:color w:val="569CD6"/>
+          <w:kern w:val="0"/>
+          <w:sz w:val="21"/>
+          <w:szCs w:val="21"/>
+          <w:lang w:val="en-US" w:eastAsia="de-DE"/>
+          <w14:ligatures w14:val="none"/>
+        </w:rPr>
+        <w:t>int</w:t>
+      </w:r>
+      <w:r>
+        <w:rPr>
+          <w:rFonts w:ascii="Consolas" w:eastAsia="Times New Roman" w:hAnsi="Consolas" w:cs="Courier New"/>
+          <w:color w:val="E2E2E2"/>
+          <w:kern w:val="0"/>
+          <w:sz w:val="21"/>
+          <w:szCs w:val="21"/>
+          <w:lang w:val="en-US" w:eastAsia="de-DE"/>
+          <w14:ligatures w14:val="none"/>
+        </w:rPr>
+        <w:t xml:space="preserve"> </w:t>
+      </w:r>
+      <w:proofErr w:type="spellStart"/>
+      <w:r>
+        <w:rPr>
+          <w:rFonts w:ascii="Consolas" w:eastAsia="Times New Roman" w:hAnsi="Consolas" w:cs="Courier New"/>
+          <w:color w:val="E2E2E2"/>
+          <w:kern w:val="0"/>
+          <w:sz w:val="21"/>
+          <w:szCs w:val="21"/>
+          <w:lang w:val="en-US" w:eastAsia="de-DE"/>
+          <w14:ligatures w14:val="none"/>
+        </w:rPr>
+        <w:t>i</w:t>
+      </w:r>
+      <w:proofErr w:type="spellEnd"/>
+      <w:r>
+        <w:rPr>
+          <w:rFonts w:ascii="Consolas" w:eastAsia="Times New Roman" w:hAnsi="Consolas" w:cs="Courier New"/>
+          <w:color w:val="E2E2E2"/>
+          <w:kern w:val="0"/>
+          <w:sz w:val="21"/>
+          <w:szCs w:val="21"/>
+          <w:lang w:val="en-US" w:eastAsia="de-DE"/>
+          <w14:ligatures w14:val="none"/>
+        </w:rPr>
+        <w:t xml:space="preserve"> = </w:t>
+      </w:r>
+      <w:r>
+        <w:rPr>
+          <w:rFonts w:ascii="Consolas" w:eastAsia="Times New Roman" w:hAnsi="Consolas" w:cs="Courier New"/>
+          <w:color w:val="A6E696"/>
+          <w:kern w:val="0"/>
+          <w:sz w:val="21"/>
+          <w:szCs w:val="21"/>
+          <w:lang w:val="en-US" w:eastAsia="de-DE"/>
+          <w14:ligatures w14:val="none"/>
+        </w:rPr>
+        <w:t>0</w:t>
+      </w:r>
+      <w:r>
+        <w:rPr>
+          <w:rFonts w:ascii="Consolas" w:eastAsia="Times New Roman" w:hAnsi="Consolas" w:cs="Courier New"/>
+          <w:color w:val="E2E2E2"/>
+          <w:kern w:val="0"/>
+          <w:sz w:val="21"/>
+          <w:szCs w:val="21"/>
+          <w:lang w:val="en-US" w:eastAsia="de-DE"/>
+          <w14:ligatures w14:val="none"/>
+        </w:rPr>
+        <w:t>;</w:t>
+      </w:r>
+      <w:r>
+        <w:rPr>
+          <w:rFonts w:ascii="Consolas" w:eastAsia="Times New Roman" w:hAnsi="Consolas" w:cs="Courier New"/>
+          <w:color w:val="E2E2E2"/>
+          <w:kern w:val="0"/>
+          <w:sz w:val="21"/>
+          <w:szCs w:val="21"/>
+          <w:lang w:val="en-US" w:eastAsia="de-DE"/>
+          <w14:ligatures w14:val="none"/>
+        </w:rPr>
+        <w:t xml:space="preserve"> </w:t>
+      </w:r>
+      <w:proofErr w:type="spellStart"/>
+      <w:r>
+        <w:rPr>
+          <w:rFonts w:ascii="Consolas" w:eastAsia="Times New Roman" w:hAnsi="Consolas" w:cs="Courier New"/>
+          <w:color w:val="E2E2E2"/>
+          <w:kern w:val="0"/>
+          <w:sz w:val="21"/>
+          <w:szCs w:val="21"/>
+          <w:lang w:val="en-US" w:eastAsia="de-DE"/>
+          <w14:ligatures w14:val="none"/>
+        </w:rPr>
+        <w:t>i</w:t>
+      </w:r>
+      <w:proofErr w:type="spellEnd"/>
+      <w:r>
+        <w:rPr>
+          <w:rFonts w:ascii="Consolas" w:eastAsia="Times New Roman" w:hAnsi="Consolas" w:cs="Courier New"/>
+          <w:color w:val="E2E2E2"/>
+          <w:kern w:val="0"/>
+          <w:sz w:val="21"/>
+          <w:szCs w:val="21"/>
+          <w:lang w:val="en-US" w:eastAsia="de-DE"/>
+          <w14:ligatures w14:val="none"/>
+        </w:rPr>
+        <w:t xml:space="preserve"> &lt;=</w:t>
+      </w:r>
+      <w:r>
+        <w:rPr>
+          <w:rFonts w:ascii="Consolas" w:eastAsia="Times New Roman" w:hAnsi="Consolas" w:cs="Courier New"/>
+          <w:color w:val="E2E2E2"/>
+          <w:kern w:val="0"/>
+          <w:sz w:val="21"/>
+          <w:szCs w:val="21"/>
+          <w:lang w:val="en-US" w:eastAsia="de-DE"/>
+          <w14:ligatures w14:val="none"/>
+        </w:rPr>
+        <w:t xml:space="preserve"> string2.</w:t>
+      </w:r>
+      <w:r>
+        <w:rPr>
+          <w:rFonts w:ascii="Consolas" w:eastAsia="Times New Roman" w:hAnsi="Consolas" w:cs="Courier New"/>
+          <w:color w:val="FFF2AA"/>
+          <w:kern w:val="0"/>
+          <w:sz w:val="21"/>
+          <w:szCs w:val="21"/>
+          <w:lang w:val="en-US" w:eastAsia="de-DE"/>
+          <w14:ligatures w14:val="none"/>
+        </w:rPr>
+        <w:t>length</w:t>
+      </w:r>
+      <w:r>
+        <w:rPr>
+          <w:rFonts w:ascii="Consolas" w:eastAsia="Times New Roman" w:hAnsi="Consolas" w:cs="Courier New"/>
+          <w:color w:val="E2E2E2"/>
+          <w:kern w:val="0"/>
+          <w:sz w:val="21"/>
+          <w:szCs w:val="21"/>
+          <w:lang w:val="en-US" w:eastAsia="de-DE"/>
+          <w14:ligatures w14:val="none"/>
+        </w:rPr>
+        <w:t>();</w:t>
+      </w:r>
+      <w:r>
+        <w:rPr>
+          <w:rFonts w:ascii="Consolas" w:eastAsia="Times New Roman" w:hAnsi="Consolas" w:cs="Courier New"/>
+          <w:color w:val="E2E2E2"/>
+          <w:kern w:val="0"/>
+          <w:sz w:val="21"/>
+          <w:szCs w:val="21"/>
+          <w:lang w:val="en-US" w:eastAsia="de-DE"/>
+          <w14:ligatures w14:val="none"/>
+        </w:rPr>
+        <w:t xml:space="preserve"> i++)</w:t>
+      </w:r>
+    </w:p>
+    <w:p>
+      <w:pPr>
+        <w:shd w:val="clear" w:color="auto" w:fill="303030"/>
+        <w:tabs>
+          <w:tab w:val="left" w:pos="916"/>
+          <w:tab w:val="left" w:pos="1832"/>
+          <w:tab w:val="left" w:pos="2748"/>
+          <w:tab w:val="left" w:pos="3664"/>
+          <w:tab w:val="left" w:pos="4580"/>
+          <w:tab w:val="left" w:pos="5496"/>
+          <w:tab w:val="left" w:pos="6412"/>
+          <w:tab w:val="left" w:pos="7328"/>
+          <w:tab w:val="left" w:pos="8244"/>
+          <w:tab w:val="left" w:pos="9160"/>
+          <w:tab w:val="left" w:pos="10076"/>
+          <w:tab w:val="left" w:pos="10992"/>
+          <w:tab w:val="left" w:pos="11908"/>
+          <w:tab w:val="left" w:pos="12824"/>
+          <w:tab w:val="left" w:pos="13740"/>
+          <w:tab w:val="left" w:pos="14656"/>
+        </w:tabs>
+        <w:spacing w:after="0" w:line="240" w:lineRule="auto"/>
+        <w:rPr>
+          <w:rFonts w:ascii="Consolas" w:eastAsia="Times New Roman" w:hAnsi="Consolas" w:cs="Courier New"/>
+          <w:color w:val="FFD700"/>
+          <w:kern w:val="0"/>
+          <w:sz w:val="21"/>
+          <w:szCs w:val="21"/>
+          <w:lang w:val="en-US" w:eastAsia="de-DE"/>
+          <w14:ligatures w14:val="none"/>
+        </w:rPr>
+      </w:pPr>
+      <w:r>
+        <w:rPr>
+          <w:rFonts w:ascii="Consolas" w:eastAsia="Times New Roman" w:hAnsi="Consolas" w:cs="Courier New"/>
+          <w:color w:val="E2E2E2"/>
+          <w:kern w:val="0"/>
+          <w:sz w:val="21"/>
+          <w:szCs w:val="21"/>
+          <w:lang w:val="en-US" w:eastAsia="de-DE"/>
+          <w14:ligatures w14:val="none"/>
+        </w:rPr>
+        <w:t xml:space="preserve">    </w:t>
+      </w:r>
+      <w:r>
+        <w:rPr>
+          <w:rFonts w:ascii="Consolas" w:eastAsia="Times New Roman" w:hAnsi="Consolas" w:cs="Courier New"/>
+          <w:color w:val="FFD700"/>
+          <w:kern w:val="0"/>
+          <w:sz w:val="21"/>
+          <w:szCs w:val="21"/>
+          <w:lang w:val="en-US" w:eastAsia="de-DE"/>
+          <w14:ligatures w14:val="none"/>
+        </w:rPr>
+        <w:t>{</w:t>
+      </w:r>
+    </w:p>
+    <w:p>
+      <w:pPr>
+        <w:shd w:val="clear" w:color="auto" w:fill="303030"/>
+        <w:tabs>
+          <w:tab w:val="left" w:pos="916"/>
+          <w:tab w:val="left" w:pos="1832"/>
+          <w:tab w:val="left" w:pos="2748"/>
+          <w:tab w:val="left" w:pos="3664"/>
+          <w:tab w:val="left" w:pos="4580"/>
+          <w:tab w:val="left" w:pos="5496"/>
+          <w:tab w:val="left" w:pos="6412"/>
+          <w:tab w:val="left" w:pos="7328"/>
+          <w:tab w:val="left" w:pos="8244"/>
+          <w:tab w:val="left" w:pos="9160"/>
+          <w:tab w:val="left" w:pos="10076"/>
+          <w:tab w:val="left" w:pos="10992"/>
+          <w:tab w:val="left" w:pos="11908"/>
+          <w:tab w:val="left" w:pos="12824"/>
+          <w:tab w:val="left" w:pos="13740"/>
+          <w:tab w:val="left" w:pos="14656"/>
+        </w:tabs>
+        <w:spacing w:after="0" w:line="240" w:lineRule="auto"/>
+        <w:rPr>
+          <w:rFonts w:ascii="Consolas" w:eastAsia="Times New Roman" w:hAnsi="Consolas" w:cs="Courier New"/>
+          <w:color w:val="E2E2E2"/>
+          <w:kern w:val="0"/>
+          <w:sz w:val="21"/>
+          <w:szCs w:val="21"/>
+          <w:lang w:val="en-US" w:eastAsia="de-DE"/>
+          <w14:ligatures w14:val="none"/>
+        </w:rPr>
+      </w:pPr>
+      <w:r>
+        <w:rPr>
+          <w:rFonts w:ascii="Consolas" w:eastAsia="Times New Roman" w:hAnsi="Consolas" w:cs="Courier New"/>
+          <w:color w:val="E2E2E2"/>
+          <w:kern w:val="0"/>
+          <w:sz w:val="21"/>
+          <w:szCs w:val="21"/>
+          <w:lang w:val="en-US" w:eastAsia="de-DE"/>
+          <w14:ligatures w14:val="none"/>
+        </w:rPr>
+        <w:tab/>
+      </w:r>
+      <w:r>
+        <w:rPr>
+          <w:rFonts w:ascii="Consolas" w:eastAsia="Times New Roman" w:hAnsi="Consolas" w:cs="Courier New"/>
+          <w:b/>
+          <w:bCs/>
+          <w:color w:val="569CD6"/>
+          <w:kern w:val="0"/>
+          <w:sz w:val="21"/>
+          <w:szCs w:val="21"/>
+          <w:lang w:val="en-US" w:eastAsia="de-DE"/>
+          <w14:ligatures w14:val="none"/>
+        </w:rPr>
+        <w:t>if</w:t>
+      </w:r>
+      <w:r>
+        <w:rPr>
+          <w:rFonts w:ascii="Consolas" w:eastAsia="Times New Roman" w:hAnsi="Consolas" w:cs="Courier New"/>
+          <w:color w:val="E2E2E2"/>
+          <w:kern w:val="0"/>
+          <w:sz w:val="21"/>
+          <w:szCs w:val="21"/>
+          <w:lang w:val="en-US" w:eastAsia="de-DE"/>
+          <w14:ligatures w14:val="none"/>
+        </w:rPr>
+        <w:t>(</w:t>
+      </w:r>
+      <w:r>
+        <w:rPr>
+          <w:rFonts w:ascii="Consolas" w:eastAsia="Times New Roman" w:hAnsi="Consolas" w:cs="Courier New"/>
+          <w:color w:val="E2E2E2"/>
+          <w:kern w:val="0"/>
+          <w:sz w:val="21"/>
+          <w:szCs w:val="21"/>
+          <w:lang w:val="en-US" w:eastAsia="de-DE"/>
+          <w14:ligatures w14:val="none"/>
+        </w:rPr>
+        <w:t>string1[</w:t>
+      </w:r>
+      <w:proofErr w:type="spellStart"/>
+      <w:r>
+        <w:rPr>
+          <w:rFonts w:ascii="Consolas" w:eastAsia="Times New Roman" w:hAnsi="Consolas" w:cs="Courier New"/>
+          <w:color w:val="E2E2E2"/>
+          <w:kern w:val="0"/>
+          <w:sz w:val="21"/>
+          <w:szCs w:val="21"/>
+          <w:lang w:val="en-US" w:eastAsia="de-DE"/>
+          <w14:ligatures w14:val="none"/>
+        </w:rPr>
+        <w:t>i</w:t>
+      </w:r>
+      <w:proofErr w:type="spellEnd"/>
+      <w:r>
+        <w:rPr>
+          <w:rFonts w:ascii="Consolas" w:eastAsia="Times New Roman" w:hAnsi="Consolas" w:cs="Courier New"/>
+          <w:color w:val="E2E2E2"/>
+          <w:kern w:val="0"/>
+          <w:sz w:val="21"/>
+          <w:szCs w:val="21"/>
+          <w:lang w:val="en-US" w:eastAsia="de-DE"/>
+          <w14:ligatures w14:val="none"/>
+        </w:rPr>
+        <w:t>]</w:t>
+      </w:r>
+      <w:r>
+        <w:rPr>
+          <w:rFonts w:ascii="Consolas" w:eastAsia="Times New Roman" w:hAnsi="Consolas" w:cs="Courier New"/>
+          <w:color w:val="E2E2E2"/>
+          <w:kern w:val="0"/>
+          <w:sz w:val="21"/>
+          <w:szCs w:val="21"/>
+          <w:lang w:val="en-US" w:eastAsia="de-DE"/>
+          <w14:ligatures w14:val="none"/>
+        </w:rPr>
+        <w:t xml:space="preserve"> &gt; </w:t>
+      </w:r>
+      <w:r>
+        <w:rPr>
+          <w:rFonts w:eastAsia="Times New Roman" w:cs="Courier New"/>
+          <w:color w:val="A6E696"/>
+          <w:kern w:val="0"/>
+          <w:sz w:val="21"/>
+          <w:szCs w:val="21"/>
+          <w:lang w:val="en-US" w:eastAsia="de-DE"/>
+          <w14:ligatures w14:val="none"/>
+        </w:rPr>
+        <w:t>64</w:t>
+      </w:r>
+      <w:r>
+        <w:rPr>
+          <w:rFonts w:ascii="Consolas" w:eastAsia="Times New Roman" w:hAnsi="Consolas" w:cs="Courier New"/>
+          <w:color w:val="E2E2E2"/>
+          <w:kern w:val="0"/>
+          <w:sz w:val="21"/>
+          <w:szCs w:val="21"/>
+          <w:lang w:val="en-US" w:eastAsia="de-DE"/>
+          <w14:ligatures w14:val="none"/>
+        </w:rPr>
+        <w:t xml:space="preserve"> &amp;&amp;</w:t>
+      </w:r>
+      <w:r>
+        <w:rPr>
+          <w:rFonts w:ascii="Consolas" w:eastAsia="Times New Roman" w:hAnsi="Consolas" w:cs="Courier New"/>
+          <w:color w:val="E2E2E2"/>
+          <w:kern w:val="0"/>
+          <w:sz w:val="21"/>
+          <w:szCs w:val="21"/>
+          <w:lang w:val="en-US" w:eastAsia="de-DE"/>
+          <w14:ligatures w14:val="none"/>
+        </w:rPr>
+        <w:t xml:space="preserve"> </w:t>
+      </w:r>
+      <w:r>
+        <w:rPr>
+          <w:rFonts w:ascii="Consolas" w:eastAsia="Times New Roman" w:hAnsi="Consolas" w:cs="Courier New"/>
+          <w:color w:val="E2E2E2"/>
+          <w:kern w:val="0"/>
+          <w:sz w:val="21"/>
+          <w:szCs w:val="21"/>
+          <w:lang w:val="en-US" w:eastAsia="de-DE"/>
+          <w14:ligatures w14:val="none"/>
+        </w:rPr>
+        <w:t>string1[</w:t>
+      </w:r>
+      <w:proofErr w:type="spellStart"/>
+      <w:r>
+        <w:rPr>
+          <w:rFonts w:ascii="Consolas" w:eastAsia="Times New Roman" w:hAnsi="Consolas" w:cs="Courier New"/>
+          <w:color w:val="E2E2E2"/>
+          <w:kern w:val="0"/>
+          <w:sz w:val="21"/>
+          <w:szCs w:val="21"/>
+          <w:lang w:val="en-US" w:eastAsia="de-DE"/>
+          <w14:ligatures w14:val="none"/>
+        </w:rPr>
+        <w:t>i</w:t>
+      </w:r>
+      <w:proofErr w:type="spellEnd"/>
+      <w:r>
+        <w:rPr>
+          <w:rFonts w:ascii="Consolas" w:eastAsia="Times New Roman" w:hAnsi="Consolas" w:cs="Courier New"/>
+          <w:color w:val="E2E2E2"/>
+          <w:kern w:val="0"/>
+          <w:sz w:val="21"/>
+          <w:szCs w:val="21"/>
+          <w:lang w:val="en-US" w:eastAsia="de-DE"/>
+          <w14:ligatures w14:val="none"/>
+        </w:rPr>
+        <w:t>]</w:t>
+      </w:r>
+      <w:r>
+        <w:rPr>
+          <w:rFonts w:ascii="Consolas" w:eastAsia="Times New Roman" w:hAnsi="Consolas" w:cs="Courier New"/>
+          <w:color w:val="E2E2E2"/>
+          <w:kern w:val="0"/>
+          <w:sz w:val="21"/>
+          <w:szCs w:val="21"/>
+          <w:lang w:val="en-US" w:eastAsia="de-DE"/>
+          <w14:ligatures w14:val="none"/>
+        </w:rPr>
+        <w:t xml:space="preserve"> &lt; </w:t>
+      </w:r>
+      <w:r>
+        <w:rPr>
+          <w:rFonts w:eastAsia="Times New Roman" w:cs="Courier New"/>
+          <w:color w:val="A6E696"/>
+          <w:kern w:val="0"/>
+          <w:sz w:val="21"/>
+          <w:szCs w:val="21"/>
+          <w:lang w:val="en-US" w:eastAsia="de-DE"/>
+          <w14:ligatures w14:val="none"/>
+        </w:rPr>
+        <w:t>91</w:t>
+      </w:r>
+      <w:r>
+        <w:rPr>
+          <w:rFonts w:ascii="Consolas" w:eastAsia="Times New Roman" w:hAnsi="Consolas" w:cs="Courier New"/>
+          <w:color w:val="E2E2E2"/>
+          <w:kern w:val="0"/>
+          <w:sz w:val="21"/>
+          <w:szCs w:val="21"/>
+          <w:lang w:val="en-US" w:eastAsia="de-DE"/>
+          <w14:ligatures w14:val="none"/>
+        </w:rPr>
+        <w:t>)</w:t>
+      </w:r>
+    </w:p>
+    <w:p>
+      <w:pPr>
+        <w:shd w:val="clear" w:color="auto" w:fill="303030"/>
+        <w:tabs>
+          <w:tab w:val="left" w:pos="916"/>
+          <w:tab w:val="left" w:pos="1832"/>
+          <w:tab w:val="left" w:pos="2748"/>
+          <w:tab w:val="left" w:pos="3664"/>
+          <w:tab w:val="left" w:pos="4580"/>
+          <w:tab w:val="left" w:pos="5496"/>
+          <w:tab w:val="left" w:pos="6412"/>
+          <w:tab w:val="left" w:pos="7328"/>
+          <w:tab w:val="left" w:pos="8244"/>
+          <w:tab w:val="left" w:pos="9160"/>
+          <w:tab w:val="left" w:pos="10076"/>
+          <w:tab w:val="left" w:pos="10992"/>
+          <w:tab w:val="left" w:pos="11908"/>
+          <w:tab w:val="left" w:pos="12824"/>
+          <w:tab w:val="left" w:pos="13740"/>
+          <w:tab w:val="left" w:pos="14656"/>
+        </w:tabs>
+        <w:spacing w:after="0" w:line="240" w:lineRule="auto"/>
+        <w:rPr>
+          <w:rFonts w:ascii="Consolas" w:eastAsia="Times New Roman" w:hAnsi="Consolas" w:cs="Courier New"/>
+          <w:color w:val="E2E2E2"/>
+          <w:kern w:val="0"/>
+          <w:sz w:val="21"/>
+          <w:szCs w:val="21"/>
+          <w:lang w:val="en-US" w:eastAsia="de-DE"/>
+          <w14:ligatures w14:val="none"/>
+        </w:rPr>
+      </w:pPr>
+      <w:r>
+        <w:rPr>
+          <w:rFonts w:ascii="Consolas" w:eastAsia="Times New Roman" w:hAnsi="Consolas" w:cs="Courier New"/>
+          <w:color w:val="E2E2E2"/>
+          <w:kern w:val="0"/>
+          <w:sz w:val="21"/>
+          <w:szCs w:val="21"/>
+          <w:lang w:val="en-US" w:eastAsia="de-DE"/>
+          <w14:ligatures w14:val="none"/>
+        </w:rPr>
+        <w:tab/>
+      </w:r>
+      <w:r>
+        <w:rPr>
+          <w:rFonts w:ascii="Consolas" w:eastAsia="Times New Roman" w:hAnsi="Consolas" w:cs="Courier New"/>
+          <w:color w:val="FFD700"/>
+          <w:kern w:val="0"/>
+          <w:sz w:val="21"/>
+          <w:szCs w:val="21"/>
+          <w:lang w:val="en-US" w:eastAsia="de-DE"/>
+          <w14:ligatures w14:val="none"/>
+        </w:rPr>
+        <w:t>{</w:t>
+      </w:r>
+    </w:p>
+    <w:p>
+      <w:pPr>
+        <w:shd w:val="clear" w:color="auto" w:fill="303030"/>
+        <w:tabs>
+          <w:tab w:val="left" w:pos="916"/>
+          <w:tab w:val="left" w:pos="1832"/>
+          <w:tab w:val="left" w:pos="2748"/>
+          <w:tab w:val="left" w:pos="3664"/>
+          <w:tab w:val="left" w:pos="4580"/>
+          <w:tab w:val="left" w:pos="5496"/>
+          <w:tab w:val="left" w:pos="6412"/>
+          <w:tab w:val="left" w:pos="7328"/>
+          <w:tab w:val="left" w:pos="8244"/>
+          <w:tab w:val="left" w:pos="9160"/>
+          <w:tab w:val="left" w:pos="10076"/>
+          <w:tab w:val="left" w:pos="10992"/>
+          <w:tab w:val="left" w:pos="11908"/>
+          <w:tab w:val="left" w:pos="12824"/>
+          <w:tab w:val="left" w:pos="13740"/>
+          <w:tab w:val="left" w:pos="14656"/>
+        </w:tabs>
+        <w:spacing w:after="0" w:line="240" w:lineRule="auto"/>
+        <w:rPr>
+          <w:rFonts w:ascii="Consolas" w:eastAsia="Times New Roman" w:hAnsi="Consolas" w:cs="Courier New"/>
+          <w:color w:val="E2E2E2"/>
+          <w:kern w:val="0"/>
+          <w:sz w:val="21"/>
+          <w:szCs w:val="21"/>
+          <w:lang w:val="en-US" w:eastAsia="de-DE"/>
+          <w14:ligatures w14:val="none"/>
+        </w:rPr>
+      </w:pPr>
+      <w:r>
+        <w:rPr>
+          <w:rFonts w:ascii="Consolas" w:eastAsia="Times New Roman" w:hAnsi="Consolas" w:cs="Courier New"/>
+          <w:color w:val="E2E2E2"/>
+          <w:kern w:val="0"/>
+          <w:sz w:val="21"/>
+          <w:szCs w:val="21"/>
+          <w:lang w:val="en-US" w:eastAsia="de-DE"/>
+          <w14:ligatures w14:val="none"/>
+        </w:rPr>
+        <w:tab/>
+        <w:t xml:space="preserve">    </w:t>
+      </w:r>
+      <w:r>
+        <w:rPr>
+          <w:rFonts w:ascii="Consolas" w:eastAsia="Times New Roman" w:hAnsi="Consolas" w:cs="Courier New"/>
+          <w:color w:val="E2E2E2"/>
+          <w:kern w:val="0"/>
+          <w:sz w:val="21"/>
+          <w:szCs w:val="21"/>
+          <w:lang w:val="en-US" w:eastAsia="de-DE"/>
+          <w14:ligatures w14:val="none"/>
+        </w:rPr>
+        <w:t>string1[</w:t>
+      </w:r>
+      <w:proofErr w:type="spellStart"/>
+      <w:r>
+        <w:rPr>
+          <w:rFonts w:ascii="Consolas" w:eastAsia="Times New Roman" w:hAnsi="Consolas" w:cs="Courier New"/>
+          <w:color w:val="E2E2E2"/>
+          <w:kern w:val="0"/>
+          <w:sz w:val="21"/>
+          <w:szCs w:val="21"/>
+          <w:lang w:val="en-US" w:eastAsia="de-DE"/>
+          <w14:ligatures w14:val="none"/>
+        </w:rPr>
+        <w:t>i</w:t>
+      </w:r>
+      <w:proofErr w:type="spellEnd"/>
+      <w:r>
+        <w:rPr>
+          <w:rFonts w:ascii="Consolas" w:eastAsia="Times New Roman" w:hAnsi="Consolas" w:cs="Courier New"/>
+          <w:color w:val="E2E2E2"/>
+          <w:kern w:val="0"/>
+          <w:sz w:val="21"/>
+          <w:szCs w:val="21"/>
+          <w:lang w:val="en-US" w:eastAsia="de-DE"/>
+          <w14:ligatures w14:val="none"/>
+        </w:rPr>
+        <w:t>] = string1[</w:t>
+      </w:r>
+      <w:proofErr w:type="spellStart"/>
+      <w:r>
+        <w:rPr>
+          <w:rFonts w:ascii="Consolas" w:eastAsia="Times New Roman" w:hAnsi="Consolas" w:cs="Courier New"/>
+          <w:color w:val="E2E2E2"/>
+          <w:kern w:val="0"/>
+          <w:sz w:val="21"/>
+          <w:szCs w:val="21"/>
+          <w:lang w:val="en-US" w:eastAsia="de-DE"/>
+          <w14:ligatures w14:val="none"/>
+        </w:rPr>
+        <w:t>i</w:t>
+      </w:r>
+      <w:proofErr w:type="spellEnd"/>
+      <w:r>
+        <w:rPr>
+          <w:rFonts w:ascii="Consolas" w:eastAsia="Times New Roman" w:hAnsi="Consolas" w:cs="Courier New"/>
+          <w:color w:val="E2E2E2"/>
+          <w:kern w:val="0"/>
+          <w:sz w:val="21"/>
+          <w:szCs w:val="21"/>
+          <w:lang w:val="en-US" w:eastAsia="de-DE"/>
+          <w14:ligatures w14:val="none"/>
+        </w:rPr>
+        <w:t xml:space="preserve">] + </w:t>
+      </w:r>
+      <w:r>
+        <w:rPr>
+          <w:rFonts w:eastAsia="Times New Roman" w:cs="Courier New"/>
+          <w:color w:val="A6E696"/>
+          <w:kern w:val="0"/>
+          <w:sz w:val="21"/>
+          <w:szCs w:val="21"/>
+          <w:lang w:val="en-US" w:eastAsia="de-DE"/>
+          <w14:ligatures w14:val="none"/>
+        </w:rPr>
+        <w:t>32</w:t>
+      </w:r>
+      <w:r>
+        <w:rPr>
+          <w:rFonts w:ascii="Consolas" w:eastAsia="Times New Roman" w:hAnsi="Consolas" w:cs="Courier New"/>
+          <w:color w:val="E2E2E2"/>
+          <w:kern w:val="0"/>
+          <w:sz w:val="21"/>
+          <w:szCs w:val="21"/>
+          <w:lang w:val="en-US" w:eastAsia="de-DE"/>
+          <w14:ligatures w14:val="none"/>
+        </w:rPr>
+        <w:t>;</w:t>
+      </w:r>
+    </w:p>
+    <w:p>
+      <w:pPr>
+        <w:shd w:val="clear" w:color="auto" w:fill="303030"/>
+        <w:tabs>
+          <w:tab w:val="left" w:pos="916"/>
+          <w:tab w:val="left" w:pos="1832"/>
+          <w:tab w:val="left" w:pos="2748"/>
+          <w:tab w:val="left" w:pos="3664"/>
+          <w:tab w:val="left" w:pos="4580"/>
+          <w:tab w:val="left" w:pos="5496"/>
+          <w:tab w:val="left" w:pos="6412"/>
+          <w:tab w:val="left" w:pos="7328"/>
+          <w:tab w:val="left" w:pos="8244"/>
+          <w:tab w:val="left" w:pos="9160"/>
+          <w:tab w:val="left" w:pos="10076"/>
+          <w:tab w:val="left" w:pos="10992"/>
+          <w:tab w:val="left" w:pos="11908"/>
+          <w:tab w:val="left" w:pos="12824"/>
+          <w:tab w:val="left" w:pos="13740"/>
+          <w:tab w:val="left" w:pos="14656"/>
+        </w:tabs>
+        <w:spacing w:after="0" w:line="240" w:lineRule="auto"/>
+        <w:rPr>
+          <w:rFonts w:ascii="Consolas" w:eastAsia="Times New Roman" w:hAnsi="Consolas" w:cs="Courier New"/>
+          <w:color w:val="E2E2E2"/>
+          <w:kern w:val="0"/>
+          <w:sz w:val="21"/>
+          <w:szCs w:val="21"/>
+          <w:lang w:val="en-US" w:eastAsia="de-DE"/>
+          <w14:ligatures w14:val="none"/>
+        </w:rPr>
+      </w:pPr>
+      <w:r>
+        <w:rPr>
+          <w:rFonts w:ascii="Consolas" w:eastAsia="Times New Roman" w:hAnsi="Consolas" w:cs="Courier New"/>
+          <w:color w:val="E2E2E2"/>
+          <w:kern w:val="0"/>
+          <w:sz w:val="21"/>
+          <w:szCs w:val="21"/>
+          <w:lang w:val="en-US" w:eastAsia="de-DE"/>
+          <w14:ligatures w14:val="none"/>
+        </w:rPr>
+        <w:tab/>
+      </w:r>
+      <w:r>
+        <w:rPr>
+          <w:rFonts w:ascii="Consolas" w:eastAsia="Times New Roman" w:hAnsi="Consolas" w:cs="Courier New"/>
+          <w:color w:val="FFD700"/>
+          <w:kern w:val="0"/>
+          <w:sz w:val="21"/>
+          <w:szCs w:val="21"/>
+          <w:lang w:val="en-US" w:eastAsia="de-DE"/>
+          <w14:ligatures w14:val="none"/>
+        </w:rPr>
+        <w:t>}</w:t>
+      </w:r>
+      <w:r>
+        <w:rPr>
+          <w:rFonts w:ascii="Consolas" w:eastAsia="Times New Roman" w:hAnsi="Consolas" w:cs="Courier New"/>
+          <w:color w:val="E2E2E2"/>
+          <w:kern w:val="0"/>
+          <w:sz w:val="21"/>
+          <w:szCs w:val="21"/>
+          <w:lang w:val="en-US" w:eastAsia="de-DE"/>
+          <w14:ligatures w14:val="none"/>
+        </w:rPr>
+        <w:tab/>
+      </w:r>
+    </w:p>
+    <w:p>
+      <w:pPr>
+        <w:shd w:val="clear" w:color="auto" w:fill="303030"/>
+        <w:tabs>
+          <w:tab w:val="left" w:pos="916"/>
+          <w:tab w:val="left" w:pos="1832"/>
+          <w:tab w:val="left" w:pos="2748"/>
+          <w:tab w:val="left" w:pos="3664"/>
+          <w:tab w:val="left" w:pos="4580"/>
+          <w:tab w:val="left" w:pos="5496"/>
+          <w:tab w:val="left" w:pos="6412"/>
+          <w:tab w:val="left" w:pos="7328"/>
+          <w:tab w:val="left" w:pos="8244"/>
+          <w:tab w:val="left" w:pos="9160"/>
+          <w:tab w:val="left" w:pos="10076"/>
+          <w:tab w:val="left" w:pos="10992"/>
+          <w:tab w:val="left" w:pos="11908"/>
+          <w:tab w:val="left" w:pos="12824"/>
+          <w:tab w:val="left" w:pos="13740"/>
+          <w:tab w:val="left" w:pos="14656"/>
+        </w:tabs>
+        <w:spacing w:after="0" w:line="240" w:lineRule="auto"/>
+        <w:rPr>
+          <w:rFonts w:ascii="Consolas" w:eastAsia="Times New Roman" w:hAnsi="Consolas" w:cs="Courier New"/>
+          <w:color w:val="E2E2E2"/>
+          <w:kern w:val="0"/>
+          <w:sz w:val="21"/>
+          <w:szCs w:val="21"/>
+          <w:lang w:eastAsia="de-DE"/>
+          <w14:ligatures w14:val="none"/>
+        </w:rPr>
+      </w:pPr>
+      <w:r>
+        <w:rPr>
+          <w:rFonts w:ascii="Consolas" w:eastAsia="Times New Roman" w:hAnsi="Consolas" w:cs="Courier New"/>
+          <w:color w:val="E2E2E2"/>
+          <w:kern w:val="0"/>
+          <w:sz w:val="21"/>
+          <w:szCs w:val="21"/>
+          <w:lang w:val="en-US" w:eastAsia="de-DE"/>
+          <w14:ligatures w14:val="none"/>
+        </w:rPr>
+        <w:t xml:space="preserve">    </w:t>
+      </w:r>
+      <w:r>
+        <w:rPr>
+          <w:rFonts w:ascii="Consolas" w:eastAsia="Times New Roman" w:hAnsi="Consolas" w:cs="Courier New"/>
+          <w:color w:val="FFD700"/>
+          <w:kern w:val="0"/>
+          <w:sz w:val="21"/>
+          <w:szCs w:val="21"/>
+          <w:lang w:eastAsia="de-DE"/>
+          <w14:ligatures w14:val="none"/>
+        </w:rPr>
+        <w:t>}</w:t>
+      </w:r>
+    </w:p>
+    <w:p>
+      <w:pPr>
+        <w:pStyle w:val="HTMLVorformatiert"/>
+        <w:shd w:val="clear" w:color="auto" w:fill="2E2E2E"/>
+        <w:rPr>
+          <w:rFonts w:eastAsia="Times New Roman" w:cs="Courier New"/>
+          <w:color w:val="FFD700"/>
+          <w:kern w:val="0"/>
+          <w:sz w:val="21"/>
+          <w:szCs w:val="21"/>
+          <w:lang w:val="en-US" w:eastAsia="de-DE"/>
+          <w14:ligatures w14:val="none"/>
+        </w:rPr>
+      </w:pPr>
+    </w:p>
+    <w:p>
+      <w:pPr>
+        <w:shd w:val="clear" w:color="auto" w:fill="303030"/>
+        <w:tabs>
+          <w:tab w:val="left" w:pos="916"/>
+          <w:tab w:val="left" w:pos="1832"/>
+          <w:tab w:val="left" w:pos="2748"/>
+          <w:tab w:val="left" w:pos="3664"/>
+          <w:tab w:val="left" w:pos="4580"/>
+          <w:tab w:val="left" w:pos="5496"/>
+          <w:tab w:val="left" w:pos="6412"/>
+          <w:tab w:val="left" w:pos="7328"/>
+          <w:tab w:val="left" w:pos="8244"/>
+          <w:tab w:val="left" w:pos="9160"/>
+          <w:tab w:val="left" w:pos="10076"/>
+          <w:tab w:val="left" w:pos="10992"/>
+          <w:tab w:val="left" w:pos="11908"/>
+          <w:tab w:val="left" w:pos="12824"/>
+          <w:tab w:val="left" w:pos="13740"/>
+          <w:tab w:val="left" w:pos="14656"/>
+        </w:tabs>
+        <w:spacing w:after="0" w:line="240" w:lineRule="auto"/>
+        <w:rPr>
+          <w:rFonts w:ascii="Consolas" w:eastAsia="Times New Roman" w:hAnsi="Consolas" w:cs="Courier New"/>
+          <w:color w:val="E2E2E2"/>
+          <w:kern w:val="0"/>
+          <w:sz w:val="21"/>
+          <w:szCs w:val="21"/>
+          <w:lang w:val="en-US" w:eastAsia="de-DE"/>
+          <w14:ligatures w14:val="none"/>
+        </w:rPr>
+      </w:pPr>
+      <w:r>
+        <w:rPr>
+          <w:rFonts w:ascii="Consolas" w:eastAsia="Times New Roman" w:hAnsi="Consolas" w:cs="Courier New"/>
+          <w:color w:val="FFD700"/>
+          <w:kern w:val="0"/>
+          <w:sz w:val="21"/>
+          <w:szCs w:val="21"/>
+          <w:lang w:val="en-US" w:eastAsia="de-DE"/>
+          <w14:ligatures w14:val="none"/>
+        </w:rPr>
+        <w:t xml:space="preserve">    </w:t>
+      </w:r>
+      <w:r>
+        <w:rPr>
+          <w:rFonts w:ascii="Consolas" w:eastAsia="Times New Roman" w:hAnsi="Consolas" w:cs="Courier New"/>
+          <w:color w:val="E2E2E2"/>
+          <w:kern w:val="0"/>
+          <w:sz w:val="21"/>
+          <w:szCs w:val="21"/>
+          <w:lang w:val="en-US" w:eastAsia="de-DE"/>
+          <w14:ligatures w14:val="none"/>
+        </w:rPr>
+        <w:t>std::</w:t>
+      </w:r>
+      <w:proofErr w:type="spellStart"/>
+      <w:r>
+        <w:rPr>
+          <w:rFonts w:ascii="Consolas" w:eastAsia="Times New Roman" w:hAnsi="Consolas" w:cs="Courier New"/>
+          <w:color w:val="E2E2E2"/>
+          <w:kern w:val="0"/>
+          <w:sz w:val="21"/>
+          <w:szCs w:val="21"/>
+          <w:lang w:val="en-US" w:eastAsia="de-DE"/>
+          <w14:ligatures w14:val="none"/>
+        </w:rPr>
+        <w:t>cout</w:t>
+      </w:r>
+      <w:proofErr w:type="spellEnd"/>
+      <w:r>
+        <w:rPr>
+          <w:rFonts w:ascii="Consolas" w:eastAsia="Times New Roman" w:hAnsi="Consolas" w:cs="Courier New"/>
+          <w:color w:val="E2E2E2"/>
+          <w:kern w:val="0"/>
+          <w:sz w:val="21"/>
+          <w:szCs w:val="21"/>
+          <w:lang w:val="en-US" w:eastAsia="de-DE"/>
+          <w14:ligatures w14:val="none"/>
+        </w:rPr>
+        <w:t xml:space="preserve"> &lt;&lt; string1 &lt;&lt; std::</w:t>
+      </w:r>
+      <w:proofErr w:type="spellStart"/>
+      <w:r>
+        <w:rPr>
+          <w:rFonts w:ascii="Consolas" w:eastAsia="Times New Roman" w:hAnsi="Consolas" w:cs="Courier New"/>
+          <w:color w:val="E2E2E2"/>
+          <w:kern w:val="0"/>
+          <w:sz w:val="21"/>
+          <w:szCs w:val="21"/>
+          <w:lang w:val="en-US" w:eastAsia="de-DE"/>
+          <w14:ligatures w14:val="none"/>
+        </w:rPr>
+        <w:t>endl</w:t>
+      </w:r>
+      <w:proofErr w:type="spellEnd"/>
+      <w:r>
+        <w:rPr>
+          <w:rFonts w:ascii="Consolas" w:eastAsia="Times New Roman" w:hAnsi="Consolas" w:cs="Courier New"/>
+          <w:color w:val="E2E2E2"/>
+          <w:kern w:val="0"/>
+          <w:sz w:val="21"/>
+          <w:szCs w:val="21"/>
+          <w:lang w:val="en-US" w:eastAsia="de-DE"/>
+          <w14:ligatures w14:val="none"/>
+        </w:rPr>
+        <w:t>;</w:t>
+      </w:r>
+    </w:p>
+    <w:p>
+      <w:pPr>
+        <w:shd w:val="clear" w:color="auto" w:fill="303030"/>
+        <w:tabs>
+          <w:tab w:val="left" w:pos="916"/>
+          <w:tab w:val="left" w:pos="1832"/>
+          <w:tab w:val="left" w:pos="2748"/>
+          <w:tab w:val="left" w:pos="3664"/>
+          <w:tab w:val="left" w:pos="4580"/>
+          <w:tab w:val="left" w:pos="5496"/>
+          <w:tab w:val="left" w:pos="6412"/>
+          <w:tab w:val="left" w:pos="7328"/>
+          <w:tab w:val="left" w:pos="8244"/>
+          <w:tab w:val="left" w:pos="9160"/>
+          <w:tab w:val="left" w:pos="10076"/>
+          <w:tab w:val="left" w:pos="10992"/>
+          <w:tab w:val="left" w:pos="11908"/>
+          <w:tab w:val="left" w:pos="12824"/>
+          <w:tab w:val="left" w:pos="13740"/>
+          <w:tab w:val="left" w:pos="14656"/>
+        </w:tabs>
+        <w:spacing w:after="0" w:line="240" w:lineRule="auto"/>
+        <w:rPr>
+          <w:rFonts w:ascii="Consolas" w:eastAsia="Times New Roman" w:hAnsi="Consolas" w:cs="Courier New"/>
+          <w:color w:val="E2E2E2"/>
+          <w:kern w:val="0"/>
+          <w:sz w:val="21"/>
+          <w:szCs w:val="21"/>
+          <w:lang w:val="en-US" w:eastAsia="de-DE"/>
+          <w14:ligatures w14:val="none"/>
+        </w:rPr>
+      </w:pPr>
+      <w:r>
+        <w:rPr>
+          <w:rFonts w:ascii="Consolas" w:eastAsia="Times New Roman" w:hAnsi="Consolas" w:cs="Courier New"/>
+          <w:color w:val="E2E2E2"/>
+          <w:kern w:val="0"/>
+          <w:sz w:val="21"/>
+          <w:szCs w:val="21"/>
+          <w:lang w:val="en-US" w:eastAsia="de-DE"/>
+          <w14:ligatures w14:val="none"/>
+        </w:rPr>
+        <w:t xml:space="preserve">    std::</w:t>
+      </w:r>
+      <w:proofErr w:type="spellStart"/>
+      <w:r>
+        <w:rPr>
+          <w:rFonts w:ascii="Consolas" w:eastAsia="Times New Roman" w:hAnsi="Consolas" w:cs="Courier New"/>
+          <w:color w:val="E2E2E2"/>
+          <w:kern w:val="0"/>
+          <w:sz w:val="21"/>
+          <w:szCs w:val="21"/>
+          <w:lang w:val="en-US" w:eastAsia="de-DE"/>
+          <w14:ligatures w14:val="none"/>
+        </w:rPr>
+        <w:t>cout</w:t>
+      </w:r>
+      <w:proofErr w:type="spellEnd"/>
+      <w:r>
+        <w:rPr>
+          <w:rFonts w:ascii="Consolas" w:eastAsia="Times New Roman" w:hAnsi="Consolas" w:cs="Courier New"/>
+          <w:color w:val="E2E2E2"/>
+          <w:kern w:val="0"/>
+          <w:sz w:val="21"/>
+          <w:szCs w:val="21"/>
+          <w:lang w:val="en-US" w:eastAsia="de-DE"/>
+          <w14:ligatures w14:val="none"/>
+        </w:rPr>
+        <w:t xml:space="preserve"> &lt;&lt; string2 &lt;&lt; std::</w:t>
+      </w:r>
+      <w:proofErr w:type="spellStart"/>
+      <w:r>
+        <w:rPr>
+          <w:rFonts w:ascii="Consolas" w:eastAsia="Times New Roman" w:hAnsi="Consolas" w:cs="Courier New"/>
+          <w:color w:val="E2E2E2"/>
+          <w:kern w:val="0"/>
+          <w:sz w:val="21"/>
+          <w:szCs w:val="21"/>
+          <w:lang w:val="en-US" w:eastAsia="de-DE"/>
+          <w14:ligatures w14:val="none"/>
+        </w:rPr>
+        <w:t>endl</w:t>
+      </w:r>
+      <w:proofErr w:type="spellEnd"/>
+      <w:r>
+        <w:rPr>
+          <w:rFonts w:ascii="Consolas" w:eastAsia="Times New Roman" w:hAnsi="Consolas" w:cs="Courier New"/>
+          <w:color w:val="E2E2E2"/>
+          <w:kern w:val="0"/>
+          <w:sz w:val="21"/>
+          <w:szCs w:val="21"/>
+          <w:lang w:val="en-US" w:eastAsia="de-DE"/>
+          <w14:ligatures w14:val="none"/>
+        </w:rPr>
+        <w:t>;</w:t>
+      </w:r>
+    </w:p>
+    <w:p>
+      <w:pPr>
+        <w:shd w:val="clear" w:color="auto" w:fill="303030"/>
+        <w:tabs>
+          <w:tab w:val="left" w:pos="916"/>
+          <w:tab w:val="left" w:pos="1832"/>
+          <w:tab w:val="left" w:pos="2748"/>
+          <w:tab w:val="left" w:pos="3664"/>
+          <w:tab w:val="left" w:pos="4580"/>
+          <w:tab w:val="left" w:pos="5496"/>
+          <w:tab w:val="left" w:pos="6412"/>
+          <w:tab w:val="left" w:pos="7328"/>
+          <w:tab w:val="left" w:pos="8244"/>
+          <w:tab w:val="left" w:pos="9160"/>
+          <w:tab w:val="left" w:pos="10076"/>
+          <w:tab w:val="left" w:pos="10992"/>
+          <w:tab w:val="left" w:pos="11908"/>
+          <w:tab w:val="left" w:pos="12824"/>
+          <w:tab w:val="left" w:pos="13740"/>
+          <w:tab w:val="left" w:pos="14656"/>
+        </w:tabs>
+        <w:spacing w:after="0" w:line="240" w:lineRule="auto"/>
+        <w:rPr>
+          <w:rFonts w:ascii="Consolas" w:eastAsia="Times New Roman" w:hAnsi="Consolas" w:cs="Courier New"/>
+          <w:color w:val="E2E2E2"/>
+          <w:kern w:val="0"/>
+          <w:sz w:val="21"/>
+          <w:szCs w:val="21"/>
+          <w:lang w:val="en-US" w:eastAsia="de-DE"/>
+          <w14:ligatures w14:val="none"/>
+        </w:rPr>
+      </w:pPr>
+      <w:r>
+        <w:rPr>
+          <w:rFonts w:ascii="Consolas" w:eastAsia="Times New Roman" w:hAnsi="Consolas" w:cs="Courier New"/>
+          <w:color w:val="E2E2E2"/>
+          <w:kern w:val="0"/>
+          <w:sz w:val="21"/>
+          <w:szCs w:val="21"/>
+          <w:lang w:val="en-US" w:eastAsia="de-DE"/>
+          <w14:ligatures w14:val="none"/>
+        </w:rPr>
+        <w:t xml:space="preserve">    </w:t>
+      </w:r>
+      <w:r>
+        <w:rPr>
+          <w:rFonts w:ascii="Consolas" w:eastAsia="Times New Roman" w:hAnsi="Consolas" w:cs="Courier New"/>
+          <w:b/>
+          <w:bCs/>
+          <w:color w:val="569CD6"/>
+          <w:kern w:val="0"/>
+          <w:sz w:val="21"/>
+          <w:szCs w:val="21"/>
+          <w:lang w:val="en-US" w:eastAsia="de-DE"/>
+          <w14:ligatures w14:val="none"/>
+        </w:rPr>
+        <w:t>return</w:t>
+      </w:r>
+      <w:r>
+        <w:rPr>
+          <w:rFonts w:ascii="Consolas" w:eastAsia="Times New Roman" w:hAnsi="Consolas" w:cs="Courier New"/>
+          <w:color w:val="E2E2E2"/>
+          <w:kern w:val="0"/>
+          <w:sz w:val="21"/>
+          <w:szCs w:val="21"/>
+          <w:lang w:val="en-US" w:eastAsia="de-DE"/>
+          <w14:ligatures w14:val="none"/>
+        </w:rPr>
+        <w:t xml:space="preserve"> </w:t>
+      </w:r>
+      <w:r>
+        <w:rPr>
+          <w:rFonts w:ascii="Consolas" w:eastAsia="Times New Roman" w:hAnsi="Consolas" w:cs="Courier New"/>
+          <w:color w:val="A6E696"/>
+          <w:kern w:val="0"/>
+          <w:sz w:val="21"/>
+          <w:szCs w:val="21"/>
+          <w:lang w:val="en-US" w:eastAsia="de-DE"/>
+          <w14:ligatures w14:val="none"/>
+        </w:rPr>
+        <w:t>0</w:t>
+      </w:r>
+      <w:r>
+        <w:rPr>
+          <w:rFonts w:ascii="Consolas" w:eastAsia="Times New Roman" w:hAnsi="Consolas" w:cs="Courier New"/>
+          <w:color w:val="E2E2E2"/>
+          <w:kern w:val="0"/>
+          <w:sz w:val="21"/>
+          <w:szCs w:val="21"/>
+          <w:lang w:val="en-US" w:eastAsia="de-DE"/>
+          <w14:ligatures w14:val="none"/>
+        </w:rPr>
+        <w:t>;</w:t>
+      </w:r>
+    </w:p>
+    <w:p>
+      <w:pPr>
+        <w:shd w:val="clear" w:color="auto" w:fill="303030"/>
+        <w:tabs>
+          <w:tab w:val="left" w:pos="916"/>
+          <w:tab w:val="left" w:pos="1832"/>
+          <w:tab w:val="left" w:pos="2748"/>
+          <w:tab w:val="left" w:pos="3664"/>
+          <w:tab w:val="left" w:pos="4580"/>
+          <w:tab w:val="left" w:pos="5496"/>
+          <w:tab w:val="left" w:pos="6412"/>
+          <w:tab w:val="left" w:pos="7328"/>
+          <w:tab w:val="left" w:pos="8244"/>
+          <w:tab w:val="left" w:pos="9160"/>
+          <w:tab w:val="left" w:pos="10076"/>
+          <w:tab w:val="left" w:pos="10992"/>
+          <w:tab w:val="left" w:pos="11908"/>
+          <w:tab w:val="left" w:pos="12824"/>
+          <w:tab w:val="left" w:pos="13740"/>
+          <w:tab w:val="left" w:pos="14656"/>
+        </w:tabs>
+        <w:spacing w:after="0" w:line="240" w:lineRule="auto"/>
+        <w:rPr>
+          <w:rFonts w:ascii="Consolas" w:eastAsia="Times New Roman" w:hAnsi="Consolas" w:cs="Courier New"/>
+          <w:color w:val="E2E2E2"/>
+          <w:kern w:val="0"/>
+          <w:sz w:val="21"/>
+          <w:szCs w:val="21"/>
+          <w:lang w:val="en-US" w:eastAsia="de-DE"/>
+          <w14:ligatures w14:val="none"/>
+        </w:rPr>
+      </w:pPr>
+      <w:r>
+        <w:rPr>
+          <w:rFonts w:ascii="Consolas" w:eastAsia="Times New Roman" w:hAnsi="Consolas" w:cs="Courier New"/>
+          <w:color w:val="FFD700"/>
+          <w:kern w:val="0"/>
+          <w:sz w:val="21"/>
+          <w:szCs w:val="21"/>
+          <w:lang w:val="en-US" w:eastAsia="de-DE"/>
+          <w14:ligatures w14:val="none"/>
+        </w:rPr>
+        <w:t>}</w:t>
+      </w:r>
+    </w:p>
+    <w:p>
+      <w:pPr>
+        <w:rPr>
+          <w:lang w:val="en-US"/>
+        </w:rPr>
+      </w:pPr>
     </w:p>
     <w:p>
       <w:pPr>
@@ -9590,7 +12832,7 @@
   <w:abstractNum w:abstractNumId="0" w15:restartNumberingAfterBreak="0">
     <w:nsid w:val="628F5CC5"/>
     <w:multiLevelType w:val="hybridMultilevel"/>
-    <w:tmpl w:val="2A4E5A00"/>
+    <w:tmpl w:val="A5DA266C"/>
     <w:lvl w:ilvl="0" w:tplc="0407000F">
       <w:start w:val="1"/>
       <w:numFmt w:val="decimal"/>

</xml_diff>

<commit_message>
Add files via upload to add all new changes
</commit_message>
<xml_diff>
--- a/PDF/Lösung Übungsaufgaben.docx
+++ b/PDF/Lösung Übungsaufgaben.docx
@@ -30,7 +30,15 @@
         </w:numPr>
       </w:pPr>
       <w:r>
-        <w:t>Wenn Sie alle Schritte aus der Installation befolgt haben, sollten Sie jetzt vor Ihnen ein Hallo Welt Programm sehen und dieses Ausführen können. Die erste Übungs-Aufgabe soll es sein, das Programm so abzuändern, dass es "Hallo " und ihren Namen aus gibt.</w:t>
+        <w:t xml:space="preserve">Wenn Sie alle Schritte aus der Installation befolgt haben, sollten Sie jetzt vor Ihnen ein Hallo Welt Programm sehen und dieses Ausführen können. Die erste Übungs-Aufgabe soll es sein, das Programm so abzuändern, dass es "Hallo " und ihren Namen </w:t>
+      </w:r>
+      <w:proofErr w:type="gramStart"/>
+      <w:r>
+        <w:t>aus gibt</w:t>
+      </w:r>
+      <w:proofErr w:type="gramEnd"/>
+      <w:r>
+        <w:t>.</w:t>
       </w:r>
     </w:p>
     <w:p>
@@ -86,6 +94,7 @@
           <w14:ligatures w14:val="none"/>
         </w:rPr>
       </w:pPr>
+      <w:proofErr w:type="gramStart"/>
       <w:r>
         <w:rPr>
           <w:rFonts w:ascii="Consolas" w:eastAsia="Times New Roman" w:hAnsi="Consolas" w:cs="Courier New"/>
@@ -98,6 +107,7 @@
         </w:rPr>
         <w:t>#include</w:t>
       </w:r>
+      <w:proofErr w:type="gramEnd"/>
       <w:r>
         <w:rPr>
           <w:rFonts w:ascii="Consolas" w:eastAsia="Times New Roman" w:hAnsi="Consolas" w:cs="Courier New"/>
@@ -214,6 +224,7 @@
         </w:rPr>
         <w:t xml:space="preserve"> </w:t>
       </w:r>
+      <w:proofErr w:type="gramStart"/>
       <w:r>
         <w:rPr>
           <w:rFonts w:ascii="Consolas" w:eastAsia="Times New Roman" w:hAnsi="Consolas" w:cs="Courier New"/>
@@ -236,7 +247,20 @@
           <w:lang w:val="en-US" w:eastAsia="de-DE"/>
           <w14:ligatures w14:val="none"/>
         </w:rPr>
-        <w:t>()</w:t>
+        <w:t>(</w:t>
+      </w:r>
+      <w:proofErr w:type="gramEnd"/>
+      <w:r>
+        <w:rPr>
+          <w:rFonts w:ascii="Consolas" w:eastAsia="Times New Roman" w:hAnsi="Consolas" w:cs="Courier New"/>
+          <w:color w:val="E2E2E2"/>
+          <w:kern w:val="0"/>
+          <w:sz w:val="21"/>
+          <w:szCs w:val="21"/>
+          <w:lang w:val="en-US" w:eastAsia="de-DE"/>
+          <w14:ligatures w14:val="none"/>
+        </w:rPr>
+        <w:t>)</w:t>
       </w:r>
     </w:p>
     <w:p>
@@ -326,9 +350,23 @@
           <w:lang w:val="en-US" w:eastAsia="de-DE"/>
           <w14:ligatures w14:val="none"/>
         </w:rPr>
-        <w:t xml:space="preserve">    std::</w:t>
+        <w:t xml:space="preserve">    </w:t>
+      </w:r>
+      <w:proofErr w:type="gramStart"/>
+      <w:r>
+        <w:rPr>
+          <w:rFonts w:ascii="Consolas" w:eastAsia="Times New Roman" w:hAnsi="Consolas" w:cs="Courier New"/>
+          <w:color w:val="E2E2E2"/>
+          <w:kern w:val="0"/>
+          <w:sz w:val="21"/>
+          <w:szCs w:val="21"/>
+          <w:lang w:val="en-US" w:eastAsia="de-DE"/>
+          <w14:ligatures w14:val="none"/>
+        </w:rPr>
+        <w:t>std::</w:t>
       </w:r>
       <w:proofErr w:type="spellStart"/>
+      <w:proofErr w:type="gramEnd"/>
       <w:r>
         <w:rPr>
           <w:rFonts w:ascii="Consolas" w:eastAsia="Times New Roman" w:hAnsi="Consolas" w:cs="Courier New"/>
@@ -631,6 +669,7 @@
           <w14:ligatures w14:val="none"/>
         </w:rPr>
       </w:pPr>
+      <w:proofErr w:type="gramStart"/>
       <w:r>
         <w:rPr>
           <w:rFonts w:ascii="Consolas" w:eastAsia="Times New Roman" w:hAnsi="Consolas" w:cs="Courier New"/>
@@ -643,6 +682,7 @@
         </w:rPr>
         <w:t>#include</w:t>
       </w:r>
+      <w:proofErr w:type="gramEnd"/>
       <w:r>
         <w:rPr>
           <w:rFonts w:ascii="Consolas" w:eastAsia="Times New Roman" w:hAnsi="Consolas" w:cs="Courier New"/>
@@ -1334,6 +1374,7 @@
           <w14:ligatures w14:val="none"/>
         </w:rPr>
       </w:pPr>
+      <w:proofErr w:type="gramStart"/>
       <w:r>
         <w:rPr>
           <w:rFonts w:ascii="Consolas" w:eastAsia="Times New Roman" w:hAnsi="Consolas" w:cs="Courier New"/>
@@ -1346,6 +1387,7 @@
         </w:rPr>
         <w:t>#include</w:t>
       </w:r>
+      <w:proofErr w:type="gramEnd"/>
       <w:r>
         <w:rPr>
           <w:rFonts w:ascii="Consolas" w:eastAsia="Times New Roman" w:hAnsi="Consolas" w:cs="Courier New"/>
@@ -1863,6 +1905,7 @@
         <w:t xml:space="preserve">    </w:t>
       </w:r>
       <w:proofErr w:type="spellStart"/>
+      <w:proofErr w:type="gramStart"/>
       <w:r>
         <w:rPr>
           <w:rFonts w:ascii="Consolas" w:eastAsia="Times New Roman" w:hAnsi="Consolas" w:cs="Courier New"/>
@@ -1901,6 +1944,7 @@
         <w:t>::</w:t>
       </w:r>
       <w:proofErr w:type="spellStart"/>
+      <w:proofErr w:type="gramEnd"/>
       <w:r>
         <w:rPr>
           <w:rFonts w:ascii="Consolas" w:eastAsia="Times New Roman" w:hAnsi="Consolas" w:cs="Courier New"/>
@@ -1963,6 +2007,7 @@
         <w:t xml:space="preserve"> &lt;&lt; </w:t>
       </w:r>
       <w:proofErr w:type="spellStart"/>
+      <w:proofErr w:type="gramStart"/>
       <w:r>
         <w:rPr>
           <w:rFonts w:ascii="Consolas" w:eastAsia="Times New Roman" w:hAnsi="Consolas" w:cs="Courier New"/>
@@ -1989,6 +2034,7 @@
         <w:t>::</w:t>
       </w:r>
       <w:proofErr w:type="spellStart"/>
+      <w:proofErr w:type="gramEnd"/>
       <w:r>
         <w:rPr>
           <w:rFonts w:ascii="Consolas" w:eastAsia="Times New Roman" w:hAnsi="Consolas" w:cs="Courier New"/>
@@ -2221,6 +2267,7 @@
           <w14:ligatures w14:val="none"/>
         </w:rPr>
       </w:pPr>
+      <w:proofErr w:type="gramStart"/>
       <w:r>
         <w:rPr>
           <w:rFonts w:ascii="Consolas" w:eastAsia="Times New Roman" w:hAnsi="Consolas" w:cs="Courier New"/>
@@ -2233,6 +2280,7 @@
         </w:rPr>
         <w:t>#include</w:t>
       </w:r>
+      <w:proofErr w:type="gramEnd"/>
       <w:r>
         <w:rPr>
           <w:rFonts w:ascii="Consolas" w:eastAsia="Times New Roman" w:hAnsi="Consolas" w:cs="Courier New"/>
@@ -2349,6 +2397,7 @@
         </w:rPr>
         <w:t xml:space="preserve"> </w:t>
       </w:r>
+      <w:proofErr w:type="gramStart"/>
       <w:r>
         <w:rPr>
           <w:rFonts w:ascii="Consolas" w:eastAsia="Times New Roman" w:hAnsi="Consolas" w:cs="Courier New"/>
@@ -2371,7 +2420,20 @@
           <w:lang w:val="en-US" w:eastAsia="de-DE"/>
           <w14:ligatures w14:val="none"/>
         </w:rPr>
-        <w:t>()</w:t>
+        <w:t>(</w:t>
+      </w:r>
+      <w:proofErr w:type="gramEnd"/>
+      <w:r>
+        <w:rPr>
+          <w:rFonts w:ascii="Consolas" w:eastAsia="Times New Roman" w:hAnsi="Consolas" w:cs="Courier New"/>
+          <w:color w:val="E2E2E2"/>
+          <w:kern w:val="0"/>
+          <w:sz w:val="21"/>
+          <w:szCs w:val="21"/>
+          <w:lang w:val="en-US" w:eastAsia="de-DE"/>
+          <w14:ligatures w14:val="none"/>
+        </w:rPr>
+        <w:t>)</w:t>
       </w:r>
     </w:p>
     <w:p>
@@ -2628,6 +2690,7 @@
         <w:t xml:space="preserve">    </w:t>
       </w:r>
       <w:proofErr w:type="spellStart"/>
+      <w:proofErr w:type="gramStart"/>
       <w:r>
         <w:rPr>
           <w:rFonts w:eastAsia="Times New Roman" w:cs="Courier New"/>
@@ -2654,6 +2717,7 @@
         <w:t>::</w:t>
       </w:r>
       <w:proofErr w:type="spellStart"/>
+      <w:proofErr w:type="gramEnd"/>
       <w:r>
         <w:rPr>
           <w:rFonts w:eastAsia="Times New Roman" w:cs="Courier New"/>
@@ -2773,6 +2837,7 @@
         <w:t xml:space="preserve">    </w:t>
       </w:r>
       <w:proofErr w:type="spellStart"/>
+      <w:proofErr w:type="gramStart"/>
       <w:r>
         <w:rPr>
           <w:rFonts w:ascii="Consolas" w:eastAsia="Times New Roman" w:hAnsi="Consolas" w:cs="Courier New"/>
@@ -2799,6 +2864,7 @@
         <w:t>::</w:t>
       </w:r>
       <w:proofErr w:type="spellStart"/>
+      <w:proofErr w:type="gramEnd"/>
       <w:r>
         <w:rPr>
           <w:rFonts w:ascii="Consolas" w:eastAsia="Times New Roman" w:hAnsi="Consolas" w:cs="Courier New"/>
@@ -2852,6 +2918,7 @@
         <w:t xml:space="preserve">    </w:t>
       </w:r>
       <w:proofErr w:type="spellStart"/>
+      <w:proofErr w:type="gramStart"/>
       <w:r>
         <w:rPr>
           <w:rFonts w:eastAsia="Times New Roman" w:cs="Courier New"/>
@@ -2878,6 +2945,7 @@
         <w:t>::</w:t>
       </w:r>
       <w:proofErr w:type="spellStart"/>
+      <w:proofErr w:type="gramEnd"/>
       <w:r>
         <w:rPr>
           <w:rFonts w:eastAsia="Times New Roman" w:cs="Courier New"/>
@@ -3020,6 +3088,7 @@
         </w:rPr>
         <w:t xml:space="preserve">    </w:t>
       </w:r>
+      <w:proofErr w:type="gramStart"/>
       <w:r>
         <w:rPr>
           <w:rFonts w:ascii="Consolas" w:eastAsia="Times New Roman" w:hAnsi="Consolas" w:cs="Courier New"/>
@@ -3033,6 +3102,7 @@
         <w:t>std::</w:t>
       </w:r>
       <w:proofErr w:type="spellStart"/>
+      <w:proofErr w:type="gramEnd"/>
       <w:r>
         <w:rPr>
           <w:rFonts w:ascii="Consolas" w:eastAsia="Times New Roman" w:hAnsi="Consolas" w:cs="Courier New"/>
@@ -3135,9 +3205,23 @@
           <w:lang w:val="en-US" w:eastAsia="de-DE"/>
           <w14:ligatures w14:val="none"/>
         </w:rPr>
-        <w:t xml:space="preserve">    std::</w:t>
+        <w:t xml:space="preserve">    </w:t>
+      </w:r>
+      <w:proofErr w:type="gramStart"/>
+      <w:r>
+        <w:rPr>
+          <w:rFonts w:ascii="Consolas" w:eastAsia="Times New Roman" w:hAnsi="Consolas" w:cs="Courier New"/>
+          <w:color w:val="E2E2E2"/>
+          <w:kern w:val="0"/>
+          <w:sz w:val="21"/>
+          <w:szCs w:val="21"/>
+          <w:lang w:val="en-US" w:eastAsia="de-DE"/>
+          <w14:ligatures w14:val="none"/>
+        </w:rPr>
+        <w:t>std::</w:t>
       </w:r>
       <w:proofErr w:type="spellStart"/>
+      <w:proofErr w:type="gramEnd"/>
       <w:r>
         <w:rPr>
           <w:rFonts w:ascii="Consolas" w:eastAsia="Times New Roman" w:hAnsi="Consolas" w:cs="Courier New"/>
@@ -3161,9 +3245,23 @@
           <w:lang w:val="en-US" w:eastAsia="de-DE"/>
           <w14:ligatures w14:val="none"/>
         </w:rPr>
-        <w:t xml:space="preserve"> &lt;&lt; a * b &lt;&lt; std::</w:t>
+        <w:t xml:space="preserve"> &lt;&lt; a * b &lt;&lt; </w:t>
+      </w:r>
+      <w:proofErr w:type="gramStart"/>
+      <w:r>
+        <w:rPr>
+          <w:rFonts w:ascii="Consolas" w:eastAsia="Times New Roman" w:hAnsi="Consolas" w:cs="Courier New"/>
+          <w:color w:val="E2E2E2"/>
+          <w:kern w:val="0"/>
+          <w:sz w:val="21"/>
+          <w:szCs w:val="21"/>
+          <w:lang w:val="en-US" w:eastAsia="de-DE"/>
+          <w14:ligatures w14:val="none"/>
+        </w:rPr>
+        <w:t>std::</w:t>
       </w:r>
       <w:proofErr w:type="spellStart"/>
+      <w:proofErr w:type="gramEnd"/>
       <w:r>
         <w:rPr>
           <w:rFonts w:ascii="Consolas" w:eastAsia="Times New Roman" w:hAnsi="Consolas" w:cs="Courier New"/>
@@ -3401,6 +3499,7 @@
           <w14:ligatures w14:val="none"/>
         </w:rPr>
       </w:pPr>
+      <w:proofErr w:type="gramStart"/>
       <w:r>
         <w:rPr>
           <w:rFonts w:ascii="Consolas" w:eastAsia="Times New Roman" w:hAnsi="Consolas" w:cs="Courier New"/>
@@ -3413,6 +3512,7 @@
         </w:rPr>
         <w:t>#include</w:t>
       </w:r>
+      <w:proofErr w:type="gramEnd"/>
       <w:r>
         <w:rPr>
           <w:rFonts w:ascii="Consolas" w:eastAsia="Times New Roman" w:hAnsi="Consolas" w:cs="Courier New"/>
@@ -3529,6 +3629,7 @@
         </w:rPr>
         <w:t xml:space="preserve"> </w:t>
       </w:r>
+      <w:proofErr w:type="gramStart"/>
       <w:r>
         <w:rPr>
           <w:rFonts w:ascii="Consolas" w:eastAsia="Times New Roman" w:hAnsi="Consolas" w:cs="Courier New"/>
@@ -3551,7 +3652,20 @@
           <w:lang w:val="en-US" w:eastAsia="de-DE"/>
           <w14:ligatures w14:val="none"/>
         </w:rPr>
-        <w:t>()</w:t>
+        <w:t>(</w:t>
+      </w:r>
+      <w:proofErr w:type="gramEnd"/>
+      <w:r>
+        <w:rPr>
+          <w:rFonts w:ascii="Consolas" w:eastAsia="Times New Roman" w:hAnsi="Consolas" w:cs="Courier New"/>
+          <w:color w:val="E2E2E2"/>
+          <w:kern w:val="0"/>
+          <w:sz w:val="21"/>
+          <w:szCs w:val="21"/>
+          <w:lang w:val="en-US" w:eastAsia="de-DE"/>
+          <w14:ligatures w14:val="none"/>
+        </w:rPr>
+        <w:t>)</w:t>
       </w:r>
     </w:p>
     <w:p>
@@ -3703,6 +3817,7 @@
         <w:t xml:space="preserve">    </w:t>
       </w:r>
       <w:proofErr w:type="spellStart"/>
+      <w:proofErr w:type="gramStart"/>
       <w:r>
         <w:rPr>
           <w:rFonts w:eastAsia="Times New Roman" w:cs="Courier New"/>
@@ -3729,6 +3844,7 @@
         <w:t>::</w:t>
       </w:r>
       <w:proofErr w:type="spellStart"/>
+      <w:proofErr w:type="gramEnd"/>
       <w:r>
         <w:rPr>
           <w:rFonts w:eastAsia="Times New Roman" w:cs="Courier New"/>
@@ -3847,6 +3963,7 @@
         </w:rPr>
         <w:t xml:space="preserve">    </w:t>
       </w:r>
+      <w:proofErr w:type="gramStart"/>
       <w:r>
         <w:rPr>
           <w:rFonts w:ascii="Consolas" w:eastAsia="Times New Roman" w:hAnsi="Consolas" w:cs="Courier New"/>
@@ -3860,6 +3977,7 @@
         <w:t>std::</w:t>
       </w:r>
       <w:proofErr w:type="spellStart"/>
+      <w:proofErr w:type="gramEnd"/>
       <w:r>
         <w:rPr>
           <w:rFonts w:ascii="Consolas" w:eastAsia="Times New Roman" w:hAnsi="Consolas" w:cs="Courier New"/>
@@ -3930,6 +4048,7 @@
         </w:rPr>
         <w:t xml:space="preserve">    </w:t>
       </w:r>
+      <w:proofErr w:type="gramStart"/>
       <w:r>
         <w:rPr>
           <w:rFonts w:ascii="Consolas" w:eastAsia="Times New Roman" w:hAnsi="Consolas" w:cs="Courier New"/>
@@ -3956,6 +4075,7 @@
         </w:rPr>
         <w:t>(</w:t>
       </w:r>
+      <w:proofErr w:type="gramEnd"/>
       <w:r>
         <w:rPr>
           <w:rFonts w:ascii="Consolas" w:eastAsia="Times New Roman" w:hAnsi="Consolas" w:cs="Courier New"/>
@@ -3992,6 +4112,7 @@
         </w:rPr>
         <w:t xml:space="preserve">% </w:t>
       </w:r>
+      <w:proofErr w:type="gramStart"/>
       <w:r>
         <w:rPr>
           <w:rFonts w:eastAsia="Times New Roman" w:cs="Courier New"/>
@@ -4014,7 +4135,20 @@
           <w:lang w:val="en-US" w:eastAsia="de-DE"/>
           <w14:ligatures w14:val="none"/>
         </w:rPr>
-        <w:t xml:space="preserve">== </w:t>
+        <w:t>=</w:t>
+      </w:r>
+      <w:proofErr w:type="gramEnd"/>
+      <w:r>
+        <w:rPr>
+          <w:rFonts w:ascii="Consolas" w:eastAsia="Times New Roman" w:hAnsi="Consolas" w:cs="Courier New"/>
+          <w:color w:val="E2E2E2"/>
+          <w:kern w:val="0"/>
+          <w:sz w:val="21"/>
+          <w:szCs w:val="21"/>
+          <w:lang w:val="en-US" w:eastAsia="de-DE"/>
+          <w14:ligatures w14:val="none"/>
+        </w:rPr>
+        <w:t xml:space="preserve">= </w:t>
       </w:r>
       <w:r>
         <w:rPr>
@@ -4143,6 +4277,7 @@
         <w:t xml:space="preserve">        </w:t>
       </w:r>
       <w:proofErr w:type="spellStart"/>
+      <w:proofErr w:type="gramStart"/>
       <w:r>
         <w:rPr>
           <w:rFonts w:ascii="Consolas" w:eastAsia="Times New Roman" w:hAnsi="Consolas" w:cs="Courier New"/>
@@ -4169,6 +4304,7 @@
         <w:t>::</w:t>
       </w:r>
       <w:proofErr w:type="spellStart"/>
+      <w:proofErr w:type="gramEnd"/>
       <w:r>
         <w:rPr>
           <w:rFonts w:ascii="Consolas" w:eastAsia="Times New Roman" w:hAnsi="Consolas" w:cs="Courier New"/>
@@ -4463,6 +4599,7 @@
         <w:t xml:space="preserve">        </w:t>
       </w:r>
       <w:proofErr w:type="spellStart"/>
+      <w:proofErr w:type="gramStart"/>
       <w:r>
         <w:rPr>
           <w:rFonts w:ascii="Consolas" w:eastAsia="Times New Roman" w:hAnsi="Consolas" w:cs="Courier New"/>
@@ -4489,6 +4626,7 @@
         <w:t>::</w:t>
       </w:r>
       <w:proofErr w:type="spellStart"/>
+      <w:proofErr w:type="gramEnd"/>
       <w:r>
         <w:rPr>
           <w:rFonts w:ascii="Consolas" w:eastAsia="Times New Roman" w:hAnsi="Consolas" w:cs="Courier New"/>
@@ -4881,6 +5019,7 @@
           <w14:ligatures w14:val="none"/>
         </w:rPr>
       </w:pPr>
+      <w:proofErr w:type="gramStart"/>
       <w:r>
         <w:rPr>
           <w:rFonts w:ascii="Consolas" w:eastAsia="Times New Roman" w:hAnsi="Consolas" w:cs="Courier New"/>
@@ -4893,6 +5032,7 @@
         </w:rPr>
         <w:t>#include</w:t>
       </w:r>
+      <w:proofErr w:type="gramEnd"/>
       <w:r>
         <w:rPr>
           <w:rFonts w:ascii="Consolas" w:eastAsia="Times New Roman" w:hAnsi="Consolas" w:cs="Courier New"/>
@@ -5009,6 +5149,7 @@
         </w:rPr>
         <w:t xml:space="preserve"> </w:t>
       </w:r>
+      <w:proofErr w:type="gramStart"/>
       <w:r>
         <w:rPr>
           <w:rFonts w:ascii="Consolas" w:eastAsia="Times New Roman" w:hAnsi="Consolas" w:cs="Courier New"/>
@@ -5031,7 +5172,20 @@
           <w:lang w:val="en-US" w:eastAsia="de-DE"/>
           <w14:ligatures w14:val="none"/>
         </w:rPr>
-        <w:t>()</w:t>
+        <w:t>(</w:t>
+      </w:r>
+      <w:proofErr w:type="gramEnd"/>
+      <w:r>
+        <w:rPr>
+          <w:rFonts w:ascii="Consolas" w:eastAsia="Times New Roman" w:hAnsi="Consolas" w:cs="Courier New"/>
+          <w:color w:val="E2E2E2"/>
+          <w:kern w:val="0"/>
+          <w:sz w:val="21"/>
+          <w:szCs w:val="21"/>
+          <w:lang w:val="en-US" w:eastAsia="de-DE"/>
+          <w14:ligatures w14:val="none"/>
+        </w:rPr>
+        <w:t>)</w:t>
       </w:r>
     </w:p>
     <w:p>
@@ -5185,6 +5339,7 @@
         <w:t xml:space="preserve">    </w:t>
       </w:r>
       <w:proofErr w:type="spellStart"/>
+      <w:proofErr w:type="gramStart"/>
       <w:r>
         <w:rPr>
           <w:rFonts w:eastAsia="Times New Roman" w:cs="Courier New"/>
@@ -5211,6 +5366,7 @@
         <w:t>::</w:t>
       </w:r>
       <w:proofErr w:type="spellStart"/>
+      <w:proofErr w:type="gramEnd"/>
       <w:r>
         <w:rPr>
           <w:rFonts w:eastAsia="Times New Roman" w:cs="Courier New"/>
@@ -5329,6 +5485,7 @@
         </w:rPr>
         <w:t xml:space="preserve">    </w:t>
       </w:r>
+      <w:proofErr w:type="gramStart"/>
       <w:r>
         <w:rPr>
           <w:rFonts w:ascii="Consolas" w:eastAsia="Times New Roman" w:hAnsi="Consolas" w:cs="Courier New"/>
@@ -5342,6 +5499,7 @@
         <w:t>std::</w:t>
       </w:r>
       <w:proofErr w:type="spellStart"/>
+      <w:proofErr w:type="gramEnd"/>
       <w:r>
         <w:rPr>
           <w:rFonts w:ascii="Consolas" w:eastAsia="Times New Roman" w:hAnsi="Consolas" w:cs="Courier New"/>
@@ -5412,6 +5570,7 @@
         </w:rPr>
         <w:t xml:space="preserve">    </w:t>
       </w:r>
+      <w:proofErr w:type="gramStart"/>
       <w:r>
         <w:rPr>
           <w:rFonts w:ascii="Consolas" w:eastAsia="Times New Roman" w:hAnsi="Consolas" w:cs="Courier New"/>
@@ -5438,6 +5597,7 @@
         </w:rPr>
         <w:t>(</w:t>
       </w:r>
+      <w:proofErr w:type="gramEnd"/>
       <w:r>
         <w:rPr>
           <w:rFonts w:ascii="Consolas" w:eastAsia="Times New Roman" w:hAnsi="Consolas" w:cs="Courier New"/>
@@ -5767,6 +5927,7 @@
         <w:t xml:space="preserve">       </w:t>
       </w:r>
       <w:proofErr w:type="spellStart"/>
+      <w:proofErr w:type="gramStart"/>
       <w:r>
         <w:rPr>
           <w:rFonts w:ascii="Consolas" w:eastAsia="Times New Roman" w:hAnsi="Consolas" w:cs="Courier New"/>
@@ -5793,6 +5954,7 @@
         <w:t>::</w:t>
       </w:r>
       <w:proofErr w:type="spellStart"/>
+      <w:proofErr w:type="gramEnd"/>
       <w:r>
         <w:rPr>
           <w:rFonts w:ascii="Consolas" w:eastAsia="Times New Roman" w:hAnsi="Consolas" w:cs="Courier New"/>
@@ -6193,6 +6355,7 @@
           <w14:ligatures w14:val="none"/>
         </w:rPr>
       </w:pPr>
+      <w:proofErr w:type="gramStart"/>
       <w:r>
         <w:rPr>
           <w:rFonts w:ascii="Consolas" w:eastAsia="Times New Roman" w:hAnsi="Consolas" w:cs="Courier New"/>
@@ -6205,6 +6368,7 @@
         </w:rPr>
         <w:t>#include</w:t>
       </w:r>
+      <w:proofErr w:type="gramEnd"/>
       <w:r>
         <w:rPr>
           <w:rFonts w:ascii="Consolas" w:eastAsia="Times New Roman" w:hAnsi="Consolas" w:cs="Courier New"/>
@@ -6321,6 +6485,7 @@
         </w:rPr>
         <w:t xml:space="preserve"> </w:t>
       </w:r>
+      <w:proofErr w:type="gramStart"/>
       <w:r>
         <w:rPr>
           <w:rFonts w:ascii="Consolas" w:eastAsia="Times New Roman" w:hAnsi="Consolas" w:cs="Courier New"/>
@@ -6343,7 +6508,20 @@
           <w:lang w:val="en-US" w:eastAsia="de-DE"/>
           <w14:ligatures w14:val="none"/>
         </w:rPr>
-        <w:t>()</w:t>
+        <w:t>(</w:t>
+      </w:r>
+      <w:proofErr w:type="gramEnd"/>
+      <w:r>
+        <w:rPr>
+          <w:rFonts w:ascii="Consolas" w:eastAsia="Times New Roman" w:hAnsi="Consolas" w:cs="Courier New"/>
+          <w:color w:val="E2E2E2"/>
+          <w:kern w:val="0"/>
+          <w:sz w:val="21"/>
+          <w:szCs w:val="21"/>
+          <w:lang w:val="en-US" w:eastAsia="de-DE"/>
+          <w14:ligatures w14:val="none"/>
+        </w:rPr>
+        <w:t>)</w:t>
       </w:r>
     </w:p>
     <w:p>
@@ -6497,6 +6675,7 @@
         <w:t xml:space="preserve">    </w:t>
       </w:r>
       <w:proofErr w:type="spellStart"/>
+      <w:proofErr w:type="gramStart"/>
       <w:r>
         <w:rPr>
           <w:rFonts w:eastAsia="Times New Roman" w:cs="Courier New"/>
@@ -6523,6 +6702,7 @@
         <w:t>::</w:t>
       </w:r>
       <w:proofErr w:type="spellStart"/>
+      <w:proofErr w:type="gramEnd"/>
       <w:r>
         <w:rPr>
           <w:rFonts w:eastAsia="Times New Roman" w:cs="Courier New"/>
@@ -6641,6 +6821,7 @@
         </w:rPr>
         <w:t xml:space="preserve">    </w:t>
       </w:r>
+      <w:proofErr w:type="gramStart"/>
       <w:r>
         <w:rPr>
           <w:rFonts w:ascii="Consolas" w:eastAsia="Times New Roman" w:hAnsi="Consolas" w:cs="Courier New"/>
@@ -6654,6 +6835,7 @@
         <w:t>std::</w:t>
       </w:r>
       <w:proofErr w:type="spellStart"/>
+      <w:proofErr w:type="gramEnd"/>
       <w:r>
         <w:rPr>
           <w:rFonts w:ascii="Consolas" w:eastAsia="Times New Roman" w:hAnsi="Consolas" w:cs="Courier New"/>
@@ -6724,6 +6906,7 @@
         </w:rPr>
         <w:t xml:space="preserve">    </w:t>
       </w:r>
+      <w:proofErr w:type="gramStart"/>
       <w:r>
         <w:rPr>
           <w:rFonts w:ascii="Consolas" w:eastAsia="Times New Roman" w:hAnsi="Consolas" w:cs="Courier New"/>
@@ -6750,6 +6933,7 @@
         </w:rPr>
         <w:t>(</w:t>
       </w:r>
+      <w:proofErr w:type="gramEnd"/>
       <w:r>
         <w:rPr>
           <w:rFonts w:ascii="Consolas" w:eastAsia="Times New Roman" w:hAnsi="Consolas" w:cs="Courier New"/>
@@ -6949,6 +7133,7 @@
         <w:t xml:space="preserve">   </w:t>
       </w:r>
       <w:proofErr w:type="spellStart"/>
+      <w:proofErr w:type="gramStart"/>
       <w:r>
         <w:rPr>
           <w:rFonts w:ascii="Consolas" w:eastAsia="Times New Roman" w:hAnsi="Consolas" w:cs="Courier New"/>
@@ -6975,6 +7160,7 @@
         <w:t>::</w:t>
       </w:r>
       <w:proofErr w:type="spellStart"/>
+      <w:proofErr w:type="gramEnd"/>
       <w:r>
         <w:rPr>
           <w:rFonts w:ascii="Consolas" w:eastAsia="Times New Roman" w:hAnsi="Consolas" w:cs="Courier New"/>
@@ -7336,6 +7522,7 @@
           <w14:ligatures w14:val="none"/>
         </w:rPr>
       </w:pPr>
+      <w:proofErr w:type="gramStart"/>
       <w:r>
         <w:rPr>
           <w:rFonts w:ascii="Consolas" w:eastAsia="Times New Roman" w:hAnsi="Consolas" w:cs="Courier New"/>
@@ -7348,6 +7535,7 @@
         </w:rPr>
         <w:t>#include</w:t>
       </w:r>
+      <w:proofErr w:type="gramEnd"/>
       <w:r>
         <w:rPr>
           <w:rFonts w:ascii="Consolas" w:eastAsia="Times New Roman" w:hAnsi="Consolas" w:cs="Courier New"/>
@@ -7464,6 +7652,7 @@
         </w:rPr>
         <w:t xml:space="preserve"> </w:t>
       </w:r>
+      <w:proofErr w:type="gramStart"/>
       <w:r>
         <w:rPr>
           <w:rFonts w:ascii="Consolas" w:eastAsia="Times New Roman" w:hAnsi="Consolas" w:cs="Courier New"/>
@@ -7486,7 +7675,20 @@
           <w:lang w:val="en-US" w:eastAsia="de-DE"/>
           <w14:ligatures w14:val="none"/>
         </w:rPr>
-        <w:t>()</w:t>
+        <w:t>(</w:t>
+      </w:r>
+      <w:proofErr w:type="gramEnd"/>
+      <w:r>
+        <w:rPr>
+          <w:rFonts w:ascii="Consolas" w:eastAsia="Times New Roman" w:hAnsi="Consolas" w:cs="Courier New"/>
+          <w:color w:val="E2E2E2"/>
+          <w:kern w:val="0"/>
+          <w:sz w:val="21"/>
+          <w:szCs w:val="21"/>
+          <w:lang w:val="en-US" w:eastAsia="de-DE"/>
+          <w14:ligatures w14:val="none"/>
+        </w:rPr>
+        <w:t>)</w:t>
       </w:r>
     </w:p>
     <w:p>
@@ -7738,6 +7940,7 @@
         </w:rPr>
         <w:t xml:space="preserve">    </w:t>
       </w:r>
+      <w:proofErr w:type="gramStart"/>
       <w:r>
         <w:rPr>
           <w:rFonts w:ascii="Consolas" w:eastAsia="Times New Roman" w:hAnsi="Consolas" w:cs="Courier New"/>
@@ -7765,6 +7968,7 @@
         <w:t>(</w:t>
       </w:r>
       <w:proofErr w:type="spellStart"/>
+      <w:proofErr w:type="gramEnd"/>
       <w:r>
         <w:rPr>
           <w:rFonts w:ascii="Consolas" w:eastAsia="Times New Roman" w:hAnsi="Consolas" w:cs="Courier New"/>
@@ -7986,9 +8190,22 @@
           <w14:ligatures w14:val="none"/>
         </w:rPr>
         <w:tab/>
+      </w:r>
+      <w:proofErr w:type="gramStart"/>
+      <w:r>
+        <w:rPr>
+          <w:rFonts w:ascii="Consolas" w:eastAsia="Times New Roman" w:hAnsi="Consolas" w:cs="Courier New"/>
+          <w:color w:val="E2E2E2"/>
+          <w:kern w:val="0"/>
+          <w:sz w:val="21"/>
+          <w:szCs w:val="21"/>
+          <w:lang w:val="en-US" w:eastAsia="de-DE"/>
+          <w14:ligatures w14:val="none"/>
+        </w:rPr>
         <w:t>std::</w:t>
       </w:r>
       <w:proofErr w:type="spellStart"/>
+      <w:proofErr w:type="gramEnd"/>
       <w:r>
         <w:rPr>
           <w:rFonts w:ascii="Consolas" w:eastAsia="Times New Roman" w:hAnsi="Consolas" w:cs="Courier New"/>
@@ -8038,9 +8255,23 @@
           <w:lang w:val="en-US" w:eastAsia="de-DE"/>
           <w14:ligatures w14:val="none"/>
         </w:rPr>
-        <w:t xml:space="preserve"> &lt;&lt; std::</w:t>
+        <w:t xml:space="preserve"> &lt;&lt; </w:t>
+      </w:r>
+      <w:proofErr w:type="gramStart"/>
+      <w:r>
+        <w:rPr>
+          <w:rFonts w:ascii="Consolas" w:eastAsia="Times New Roman" w:hAnsi="Consolas" w:cs="Courier New"/>
+          <w:color w:val="E2E2E2"/>
+          <w:kern w:val="0"/>
+          <w:sz w:val="21"/>
+          <w:szCs w:val="21"/>
+          <w:lang w:val="en-US" w:eastAsia="de-DE"/>
+          <w14:ligatures w14:val="none"/>
+        </w:rPr>
+        <w:t>std::</w:t>
       </w:r>
       <w:proofErr w:type="spellStart"/>
+      <w:proofErr w:type="gramEnd"/>
       <w:r>
         <w:rPr>
           <w:rFonts w:ascii="Consolas" w:eastAsia="Times New Roman" w:hAnsi="Consolas" w:cs="Courier New"/>
@@ -8545,9 +8776,22 @@
           <w14:ligatures w14:val="none"/>
         </w:rPr>
         <w:tab/>
+      </w:r>
+      <w:proofErr w:type="gramStart"/>
+      <w:r>
+        <w:rPr>
+          <w:rFonts w:ascii="Consolas" w:eastAsia="Times New Roman" w:hAnsi="Consolas" w:cs="Courier New"/>
+          <w:color w:val="E2E2E2"/>
+          <w:kern w:val="0"/>
+          <w:sz w:val="21"/>
+          <w:szCs w:val="21"/>
+          <w:lang w:val="en-US" w:eastAsia="de-DE"/>
+          <w14:ligatures w14:val="none"/>
+        </w:rPr>
         <w:t>std::</w:t>
       </w:r>
       <w:proofErr w:type="spellStart"/>
+      <w:proofErr w:type="gramEnd"/>
       <w:r>
         <w:rPr>
           <w:rFonts w:ascii="Consolas" w:eastAsia="Times New Roman" w:hAnsi="Consolas" w:cs="Courier New"/>
@@ -8597,9 +8841,23 @@
           <w:lang w:val="en-US" w:eastAsia="de-DE"/>
           <w14:ligatures w14:val="none"/>
         </w:rPr>
-        <w:t xml:space="preserve"> &lt;&lt; std::</w:t>
+        <w:t xml:space="preserve"> &lt;&lt; </w:t>
+      </w:r>
+      <w:proofErr w:type="gramStart"/>
+      <w:r>
+        <w:rPr>
+          <w:rFonts w:ascii="Consolas" w:eastAsia="Times New Roman" w:hAnsi="Consolas" w:cs="Courier New"/>
+          <w:color w:val="E2E2E2"/>
+          <w:kern w:val="0"/>
+          <w:sz w:val="21"/>
+          <w:szCs w:val="21"/>
+          <w:lang w:val="en-US" w:eastAsia="de-DE"/>
+          <w14:ligatures w14:val="none"/>
+        </w:rPr>
+        <w:t>std::</w:t>
       </w:r>
       <w:proofErr w:type="spellStart"/>
+      <w:proofErr w:type="gramEnd"/>
       <w:r>
         <w:rPr>
           <w:rFonts w:ascii="Consolas" w:eastAsia="Times New Roman" w:hAnsi="Consolas" w:cs="Courier New"/>
@@ -8727,6 +8985,7 @@
         </w:rPr>
         <w:t xml:space="preserve">    </w:t>
       </w:r>
+      <w:proofErr w:type="gramStart"/>
       <w:r>
         <w:rPr>
           <w:rFonts w:ascii="Consolas" w:eastAsia="Times New Roman" w:hAnsi="Consolas" w:cs="Courier New"/>
@@ -8754,6 +9013,7 @@
         <w:t>(</w:t>
       </w:r>
       <w:proofErr w:type="spellStart"/>
+      <w:proofErr w:type="gramEnd"/>
       <w:r>
         <w:rPr>
           <w:rFonts w:ascii="Consolas" w:eastAsia="Times New Roman" w:hAnsi="Consolas" w:cs="Courier New"/>
@@ -8932,6 +9192,7 @@
         </w:rPr>
         <w:t xml:space="preserve">    </w:t>
       </w:r>
+      <w:proofErr w:type="gramStart"/>
       <w:r>
         <w:rPr>
           <w:rFonts w:ascii="Consolas" w:eastAsia="Times New Roman" w:hAnsi="Consolas" w:cs="Courier New"/>
@@ -8958,6 +9219,7 @@
         </w:rPr>
         <w:t>(</w:t>
       </w:r>
+      <w:proofErr w:type="gramEnd"/>
       <w:r>
         <w:rPr>
           <w:rFonts w:ascii="Consolas" w:eastAsia="Times New Roman" w:hAnsi="Consolas" w:cs="Courier New"/>
@@ -9223,9 +9485,22 @@
           <w14:ligatures w14:val="none"/>
         </w:rPr>
         <w:tab/>
+      </w:r>
+      <w:proofErr w:type="gramStart"/>
+      <w:r>
+        <w:rPr>
+          <w:rFonts w:ascii="Consolas" w:eastAsia="Times New Roman" w:hAnsi="Consolas" w:cs="Courier New"/>
+          <w:color w:val="E2E2E2"/>
+          <w:kern w:val="0"/>
+          <w:sz w:val="21"/>
+          <w:szCs w:val="21"/>
+          <w:lang w:val="en-US" w:eastAsia="de-DE"/>
+          <w14:ligatures w14:val="none"/>
+        </w:rPr>
         <w:t>std::</w:t>
       </w:r>
       <w:proofErr w:type="spellStart"/>
+      <w:proofErr w:type="gramEnd"/>
       <w:r>
         <w:rPr>
           <w:rFonts w:ascii="Consolas" w:eastAsia="Times New Roman" w:hAnsi="Consolas" w:cs="Courier New"/>
@@ -9275,9 +9550,23 @@
           <w:lang w:val="en-US" w:eastAsia="de-DE"/>
           <w14:ligatures w14:val="none"/>
         </w:rPr>
-        <w:t xml:space="preserve"> &lt;&lt; std::</w:t>
+        <w:t xml:space="preserve"> &lt;&lt; </w:t>
+      </w:r>
+      <w:proofErr w:type="gramStart"/>
+      <w:r>
+        <w:rPr>
+          <w:rFonts w:ascii="Consolas" w:eastAsia="Times New Roman" w:hAnsi="Consolas" w:cs="Courier New"/>
+          <w:color w:val="E2E2E2"/>
+          <w:kern w:val="0"/>
+          <w:sz w:val="21"/>
+          <w:szCs w:val="21"/>
+          <w:lang w:val="en-US" w:eastAsia="de-DE"/>
+          <w14:ligatures w14:val="none"/>
+        </w:rPr>
+        <w:t>std::</w:t>
       </w:r>
       <w:proofErr w:type="spellStart"/>
+      <w:proofErr w:type="gramEnd"/>
       <w:r>
         <w:rPr>
           <w:rFonts w:ascii="Consolas" w:eastAsia="Times New Roman" w:hAnsi="Consolas" w:cs="Courier New"/>
@@ -9547,7 +9836,23 @@
       </w:r>
       <w:proofErr w:type="spellEnd"/>
       <w:r>
-        <w:t>". Dieser Text enthält sowohl Groß- als auch Kleinbuchstaben, Das Programm soll die Strings so manipulieren, dass sie nur noch Kleinbuchstaben besitzen.</w:t>
+        <w:t>". Dieser Text enthält sowohl Groß- als auch Kleinbuchstaben</w:t>
+      </w:r>
+      <w:r>
+        <w:t xml:space="preserve">. </w:t>
+      </w:r>
+      <w:r>
+        <w:t>Das Programm soll die Strings so manipulieren, dass sie nur noch Kleinbuchstaben besitzen.</w:t>
+      </w:r>
+    </w:p>
+    <w:p>
+      <w:proofErr w:type="spellStart"/>
+      <w:r>
+        <w:t>Lsg</w:t>
+      </w:r>
+      <w:proofErr w:type="spellEnd"/>
+      <w:r>
+        <w:t>:</w:t>
       </w:r>
     </w:p>
     <w:p>
@@ -9582,6 +9887,7 @@
           <w14:ligatures w14:val="none"/>
         </w:rPr>
       </w:pPr>
+      <w:proofErr w:type="gramStart"/>
       <w:r>
         <w:rPr>
           <w:rFonts w:ascii="Consolas" w:eastAsia="Times New Roman" w:hAnsi="Consolas" w:cs="Courier New"/>
@@ -9594,6 +9900,7 @@
         </w:rPr>
         <w:t>#include</w:t>
       </w:r>
+      <w:proofErr w:type="gramEnd"/>
       <w:r>
         <w:rPr>
           <w:rFonts w:ascii="Consolas" w:eastAsia="Times New Roman" w:hAnsi="Consolas" w:cs="Courier New"/>
@@ -9710,6 +10017,7 @@
         </w:rPr>
         <w:t xml:space="preserve"> </w:t>
       </w:r>
+      <w:proofErr w:type="gramStart"/>
       <w:r>
         <w:rPr>
           <w:rFonts w:ascii="Consolas" w:eastAsia="Times New Roman" w:hAnsi="Consolas" w:cs="Courier New"/>
@@ -9732,7 +10040,20 @@
           <w:lang w:val="en-US" w:eastAsia="de-DE"/>
           <w14:ligatures w14:val="none"/>
         </w:rPr>
-        <w:t>()</w:t>
+        <w:t>(</w:t>
+      </w:r>
+      <w:proofErr w:type="gramEnd"/>
+      <w:r>
+        <w:rPr>
+          <w:rFonts w:ascii="Consolas" w:eastAsia="Times New Roman" w:hAnsi="Consolas" w:cs="Courier New"/>
+          <w:color w:val="E2E2E2"/>
+          <w:kern w:val="0"/>
+          <w:sz w:val="21"/>
+          <w:szCs w:val="21"/>
+          <w:lang w:val="en-US" w:eastAsia="de-DE"/>
+          <w14:ligatures w14:val="none"/>
+        </w:rPr>
+        <w:t>)</w:t>
       </w:r>
     </w:p>
     <w:p>
@@ -9790,7 +10111,7 @@
           <w:kern w:val="0"/>
           <w:sz w:val="21"/>
           <w:szCs w:val="21"/>
-          <w:lang w:eastAsia="de-DE"/>
+          <w:lang w:val="en-US" w:eastAsia="de-DE"/>
           <w14:ligatures w14:val="none"/>
         </w:rPr>
       </w:pPr>
@@ -9801,12 +10122,11 @@
           <w:kern w:val="0"/>
           <w:sz w:val="21"/>
           <w:szCs w:val="21"/>
-          <w:lang w:eastAsia="de-DE"/>
+          <w:lang w:val="en-US" w:eastAsia="de-DE"/>
           <w14:ligatures w14:val="none"/>
         </w:rPr>
         <w:t xml:space="preserve">    </w:t>
       </w:r>
-      <w:proofErr w:type="spellStart"/>
       <w:r>
         <w:rPr>
           <w:rFonts w:eastAsia="Times New Roman" w:cs="Courier New"/>
@@ -9816,12 +10136,11 @@
           <w:kern w:val="0"/>
           <w:sz w:val="21"/>
           <w:szCs w:val="21"/>
-          <w:lang w:eastAsia="de-DE"/>
+          <w:lang w:val="en-US" w:eastAsia="de-DE"/>
           <w14:ligatures w14:val="none"/>
         </w:rPr>
         <w:t>char</w:t>
       </w:r>
-      <w:proofErr w:type="spellEnd"/>
       <w:r>
         <w:rPr>
           <w:rFonts w:eastAsia="Times New Roman" w:cs="Courier New"/>
@@ -9829,22 +10148,10 @@
           <w:kern w:val="0"/>
           <w:sz w:val="21"/>
           <w:szCs w:val="21"/>
-          <w:lang w:eastAsia="de-DE"/>
-          <w14:ligatures w14:val="none"/>
-        </w:rPr>
-        <w:t xml:space="preserve"> </w:t>
-      </w:r>
-      <w:r>
-        <w:rPr>
-          <w:rFonts w:eastAsia="Times New Roman" w:cs="Courier New"/>
-          <w:color w:val="E2E2E2"/>
-          <w:kern w:val="0"/>
-          <w:sz w:val="21"/>
-          <w:szCs w:val="21"/>
-          <w:lang w:eastAsia="de-DE"/>
-          <w14:ligatures w14:val="none"/>
-        </w:rPr>
-        <w:t xml:space="preserve">string1[] = </w:t>
+          <w:lang w:val="en-US" w:eastAsia="de-DE"/>
+          <w14:ligatures w14:val="none"/>
+        </w:rPr>
+        <w:t xml:space="preserve"> string1[] = </w:t>
       </w:r>
       <w:r>
         <w:rPr>
@@ -9853,7 +10160,7 @@
           <w:kern w:val="0"/>
           <w:sz w:val="21"/>
           <w:szCs w:val="21"/>
-          <w:lang w:eastAsia="de-DE"/>
+          <w:lang w:val="en-US" w:eastAsia="de-DE"/>
           <w14:ligatures w14:val="none"/>
         </w:rPr>
         <w:t>"</w:t>
@@ -9866,7 +10173,7 @@
           <w:kern w:val="0"/>
           <w:sz w:val="21"/>
           <w:szCs w:val="21"/>
-          <w:lang w:eastAsia="de-DE"/>
+          <w:lang w:val="en-US" w:eastAsia="de-DE"/>
           <w14:ligatures w14:val="none"/>
         </w:rPr>
         <w:t>HaLlO</w:t>
@@ -9879,7 +10186,7 @@
           <w:kern w:val="0"/>
           <w:sz w:val="21"/>
           <w:szCs w:val="21"/>
-          <w:lang w:eastAsia="de-DE"/>
+          <w:lang w:val="en-US" w:eastAsia="de-DE"/>
           <w14:ligatures w14:val="none"/>
         </w:rPr>
         <w:t xml:space="preserve"> </w:t>
@@ -9892,7 +10199,7 @@
           <w:kern w:val="0"/>
           <w:sz w:val="21"/>
           <w:szCs w:val="21"/>
-          <w:lang w:eastAsia="de-DE"/>
+          <w:lang w:val="en-US" w:eastAsia="de-DE"/>
           <w14:ligatures w14:val="none"/>
         </w:rPr>
         <w:t>WeLt</w:t>
@@ -9905,7 +10212,7 @@
           <w:kern w:val="0"/>
           <w:sz w:val="21"/>
           <w:szCs w:val="21"/>
-          <w:lang w:eastAsia="de-DE"/>
+          <w:lang w:val="en-US" w:eastAsia="de-DE"/>
           <w14:ligatures w14:val="none"/>
         </w:rPr>
         <w:t>"</w:t>
@@ -9917,7 +10224,7 @@
           <w:kern w:val="0"/>
           <w:sz w:val="21"/>
           <w:szCs w:val="21"/>
-          <w:lang w:eastAsia="de-DE"/>
+          <w:lang w:val="en-US" w:eastAsia="de-DE"/>
           <w14:ligatures w14:val="none"/>
         </w:rPr>
         <w:t>;</w:t>
@@ -9944,12 +10251,12 @@
           <w:kern w:val="0"/>
           <w:sz w:val="21"/>
           <w:szCs w:val="21"/>
-          <w:lang w:eastAsia="de-DE"/>
+          <w:lang w:val="en-US" w:eastAsia="de-DE"/>
           <w14:ligatures w14:val="none"/>
         </w:rPr>
         <w:t xml:space="preserve">    </w:t>
       </w:r>
-      <w:proofErr w:type="spellStart"/>
+      <w:proofErr w:type="gramStart"/>
       <w:r>
         <w:rPr>
           <w:rFonts w:eastAsia="Times New Roman" w:cs="Courier New"/>
@@ -9957,11 +10264,12 @@
           <w:kern w:val="0"/>
           <w:sz w:val="21"/>
           <w:szCs w:val="21"/>
-          <w:lang w:eastAsia="de-DE"/>
-          <w14:ligatures w14:val="none"/>
-        </w:rPr>
-        <w:t>s</w:t>
-      </w:r>
+          <w:lang w:val="en-US" w:eastAsia="de-DE"/>
+          <w14:ligatures w14:val="none"/>
+        </w:rPr>
+        <w:t>std::</w:t>
+      </w:r>
+      <w:proofErr w:type="gramEnd"/>
       <w:r>
         <w:rPr>
           <w:rFonts w:eastAsia="Times New Roman" w:cs="Courier New"/>
@@ -9969,85 +10277,10 @@
           <w:kern w:val="0"/>
           <w:sz w:val="21"/>
           <w:szCs w:val="21"/>
-          <w:lang w:eastAsia="de-DE"/>
-          <w14:ligatures w14:val="none"/>
-        </w:rPr>
-        <w:t>td</w:t>
-      </w:r>
-      <w:proofErr w:type="spellEnd"/>
-      <w:r>
-        <w:rPr>
-          <w:rFonts w:eastAsia="Times New Roman" w:cs="Courier New"/>
-          <w:color w:val="E2E2E2"/>
-          <w:kern w:val="0"/>
-          <w:sz w:val="21"/>
-          <w:szCs w:val="21"/>
-          <w:lang w:eastAsia="de-DE"/>
-          <w14:ligatures w14:val="none"/>
-        </w:rPr>
-        <w:t>::</w:t>
-      </w:r>
-      <w:proofErr w:type="spellStart"/>
-      <w:r>
-        <w:rPr>
-          <w:rFonts w:eastAsia="Times New Roman" w:cs="Courier New"/>
-          <w:color w:val="E2E2E2"/>
-          <w:kern w:val="0"/>
-          <w:sz w:val="21"/>
-          <w:szCs w:val="21"/>
-          <w:lang w:eastAsia="de-DE"/>
-          <w14:ligatures w14:val="none"/>
-        </w:rPr>
-        <w:t>string</w:t>
-      </w:r>
-      <w:proofErr w:type="spellEnd"/>
-      <w:r>
-        <w:rPr>
-          <w:rFonts w:eastAsia="Times New Roman" w:cs="Courier New"/>
-          <w:color w:val="E2E2E2"/>
-          <w:kern w:val="0"/>
-          <w:sz w:val="21"/>
-          <w:szCs w:val="21"/>
-          <w:lang w:eastAsia="de-DE"/>
-          <w14:ligatures w14:val="none"/>
-        </w:rPr>
-        <w:t xml:space="preserve"> s</w:t>
-      </w:r>
-      <w:r>
-        <w:rPr>
-          <w:rFonts w:eastAsia="Times New Roman" w:cs="Courier New"/>
-          <w:color w:val="E2E2E2"/>
-          <w:kern w:val="0"/>
-          <w:sz w:val="21"/>
-          <w:szCs w:val="21"/>
-          <w:lang w:eastAsia="de-DE"/>
-          <w14:ligatures w14:val="none"/>
-        </w:rPr>
-        <w:t>tring</w:t>
-      </w:r>
-      <w:r>
-        <w:rPr>
-          <w:rFonts w:eastAsia="Times New Roman" w:cs="Courier New"/>
-          <w:color w:val="E2E2E2"/>
-          <w:kern w:val="0"/>
-          <w:sz w:val="21"/>
-          <w:szCs w:val="21"/>
-          <w:lang w:eastAsia="de-DE"/>
-          <w14:ligatures w14:val="none"/>
-        </w:rPr>
-        <w:t xml:space="preserve">2 </w:t>
-      </w:r>
-      <w:r>
-        <w:rPr>
-          <w:rFonts w:eastAsia="Times New Roman" w:cs="Courier New"/>
-          <w:color w:val="E2E2E2"/>
-          <w:kern w:val="0"/>
-          <w:sz w:val="21"/>
-          <w:szCs w:val="21"/>
-          <w:lang w:eastAsia="de-DE"/>
-          <w14:ligatures w14:val="none"/>
-        </w:rPr>
-        <w:t xml:space="preserve">= </w:t>
+          <w:lang w:val="en-US" w:eastAsia="de-DE"/>
+          <w14:ligatures w14:val="none"/>
+        </w:rPr>
+        <w:t xml:space="preserve">string string2 = </w:t>
       </w:r>
       <w:r>
         <w:rPr>
@@ -10056,7 +10289,7 @@
           <w:kern w:val="0"/>
           <w:sz w:val="21"/>
           <w:szCs w:val="21"/>
-          <w:lang w:eastAsia="de-DE"/>
+          <w:lang w:val="en-US" w:eastAsia="de-DE"/>
           <w14:ligatures w14:val="none"/>
         </w:rPr>
         <w:t>"</w:t>
@@ -10069,7 +10302,7 @@
           <w:kern w:val="0"/>
           <w:sz w:val="21"/>
           <w:szCs w:val="21"/>
-          <w:lang w:eastAsia="de-DE"/>
+          <w:lang w:val="en-US" w:eastAsia="de-DE"/>
           <w14:ligatures w14:val="none"/>
         </w:rPr>
         <w:t>HaLlO</w:t>
@@ -10082,7 +10315,7 @@
           <w:kern w:val="0"/>
           <w:sz w:val="21"/>
           <w:szCs w:val="21"/>
-          <w:lang w:eastAsia="de-DE"/>
+          <w:lang w:val="en-US" w:eastAsia="de-DE"/>
           <w14:ligatures w14:val="none"/>
         </w:rPr>
         <w:t xml:space="preserve"> </w:t>
@@ -10095,7 +10328,7 @@
           <w:kern w:val="0"/>
           <w:sz w:val="21"/>
           <w:szCs w:val="21"/>
-          <w:lang w:eastAsia="de-DE"/>
+          <w:lang w:val="en-US" w:eastAsia="de-DE"/>
           <w14:ligatures w14:val="none"/>
         </w:rPr>
         <w:t>WeLt</w:t>
@@ -10108,7 +10341,7 @@
           <w:kern w:val="0"/>
           <w:sz w:val="21"/>
           <w:szCs w:val="21"/>
-          <w:lang w:eastAsia="de-DE"/>
+          <w:lang w:val="en-US" w:eastAsia="de-DE"/>
           <w14:ligatures w14:val="none"/>
         </w:rPr>
         <w:t>"</w:t>
@@ -10120,7 +10353,7 @@
           <w:kern w:val="0"/>
           <w:sz w:val="21"/>
           <w:szCs w:val="21"/>
-          <w:lang w:eastAsia="de-DE"/>
+          <w:lang w:val="en-US" w:eastAsia="de-DE"/>
           <w14:ligatures w14:val="none"/>
         </w:rPr>
         <w:t>;</w:t>
@@ -10170,6 +10403,7 @@
         </w:rPr>
         <w:t xml:space="preserve">    </w:t>
       </w:r>
+      <w:proofErr w:type="gramStart"/>
       <w:r>
         <w:rPr>
           <w:rFonts w:ascii="Consolas" w:eastAsia="Times New Roman" w:hAnsi="Consolas" w:cs="Courier New"/>
@@ -10183,6 +10417,7 @@
         <w:t>std::</w:t>
       </w:r>
       <w:proofErr w:type="spellStart"/>
+      <w:proofErr w:type="gramEnd"/>
       <w:r>
         <w:rPr>
           <w:rFonts w:ascii="Consolas" w:eastAsia="Times New Roman" w:hAnsi="Consolas" w:cs="Courier New"/>
@@ -10206,33 +10441,23 @@
           <w:lang w:val="en-US" w:eastAsia="de-DE"/>
           <w14:ligatures w14:val="none"/>
         </w:rPr>
-        <w:t xml:space="preserve"> &lt;&lt; </w:t>
-      </w:r>
-      <w:r>
-        <w:rPr>
-          <w:rFonts w:ascii="Consolas" w:eastAsia="Times New Roman" w:hAnsi="Consolas" w:cs="Courier New"/>
-          <w:color w:val="E2E2E2"/>
-          <w:kern w:val="0"/>
-          <w:sz w:val="21"/>
-          <w:szCs w:val="21"/>
-          <w:lang w:val="en-US" w:eastAsia="de-DE"/>
-          <w14:ligatures w14:val="none"/>
-        </w:rPr>
-        <w:t>string1</w:t>
-      </w:r>
-      <w:r>
-        <w:rPr>
-          <w:rFonts w:ascii="Consolas" w:eastAsia="Times New Roman" w:hAnsi="Consolas" w:cs="Courier New"/>
-          <w:color w:val="E2E2E2"/>
-          <w:kern w:val="0"/>
-          <w:sz w:val="21"/>
-          <w:szCs w:val="21"/>
-          <w:lang w:val="en-US" w:eastAsia="de-DE"/>
-          <w14:ligatures w14:val="none"/>
-        </w:rPr>
-        <w:t xml:space="preserve"> &lt;&lt; std::</w:t>
+        <w:t xml:space="preserve"> &lt;&lt; string1 &lt;&lt; </w:t>
+      </w:r>
+      <w:proofErr w:type="gramStart"/>
+      <w:r>
+        <w:rPr>
+          <w:rFonts w:ascii="Consolas" w:eastAsia="Times New Roman" w:hAnsi="Consolas" w:cs="Courier New"/>
+          <w:color w:val="E2E2E2"/>
+          <w:kern w:val="0"/>
+          <w:sz w:val="21"/>
+          <w:szCs w:val="21"/>
+          <w:lang w:val="en-US" w:eastAsia="de-DE"/>
+          <w14:ligatures w14:val="none"/>
+        </w:rPr>
+        <w:t>std::</w:t>
       </w:r>
       <w:proofErr w:type="spellStart"/>
+      <w:proofErr w:type="gramEnd"/>
       <w:r>
         <w:rPr>
           <w:rFonts w:ascii="Consolas" w:eastAsia="Times New Roman" w:hAnsi="Consolas" w:cs="Courier New"/>
@@ -10303,6 +10528,7 @@
         </w:rPr>
         <w:t xml:space="preserve">    </w:t>
       </w:r>
+      <w:proofErr w:type="gramStart"/>
       <w:r>
         <w:rPr>
           <w:rFonts w:ascii="Consolas" w:eastAsia="Times New Roman" w:hAnsi="Consolas" w:cs="Courier New"/>
@@ -10316,6 +10542,7 @@
         <w:t>std::</w:t>
       </w:r>
       <w:proofErr w:type="spellStart"/>
+      <w:proofErr w:type="gramEnd"/>
       <w:r>
         <w:rPr>
           <w:rFonts w:ascii="Consolas" w:eastAsia="Times New Roman" w:hAnsi="Consolas" w:cs="Courier New"/>
@@ -10339,33 +10566,23 @@
           <w:lang w:val="en-US" w:eastAsia="de-DE"/>
           <w14:ligatures w14:val="none"/>
         </w:rPr>
-        <w:t xml:space="preserve"> &lt;&lt; </w:t>
-      </w:r>
-      <w:r>
-        <w:rPr>
-          <w:rFonts w:ascii="Consolas" w:eastAsia="Times New Roman" w:hAnsi="Consolas" w:cs="Courier New"/>
-          <w:color w:val="E2E2E2"/>
-          <w:kern w:val="0"/>
-          <w:sz w:val="21"/>
-          <w:szCs w:val="21"/>
-          <w:lang w:val="en-US" w:eastAsia="de-DE"/>
-          <w14:ligatures w14:val="none"/>
-        </w:rPr>
-        <w:t>string2</w:t>
-      </w:r>
-      <w:r>
-        <w:rPr>
-          <w:rFonts w:ascii="Consolas" w:eastAsia="Times New Roman" w:hAnsi="Consolas" w:cs="Courier New"/>
-          <w:color w:val="E2E2E2"/>
-          <w:kern w:val="0"/>
-          <w:sz w:val="21"/>
-          <w:szCs w:val="21"/>
-          <w:lang w:val="en-US" w:eastAsia="de-DE"/>
-          <w14:ligatures w14:val="none"/>
-        </w:rPr>
-        <w:t xml:space="preserve"> &lt;&lt; std::</w:t>
+        <w:t xml:space="preserve"> &lt;&lt; string2 &lt;&lt; </w:t>
+      </w:r>
+      <w:proofErr w:type="gramStart"/>
+      <w:r>
+        <w:rPr>
+          <w:rFonts w:ascii="Consolas" w:eastAsia="Times New Roman" w:hAnsi="Consolas" w:cs="Courier New"/>
+          <w:color w:val="E2E2E2"/>
+          <w:kern w:val="0"/>
+          <w:sz w:val="21"/>
+          <w:szCs w:val="21"/>
+          <w:lang w:val="en-US" w:eastAsia="de-DE"/>
+          <w14:ligatures w14:val="none"/>
+        </w:rPr>
+        <w:t>std::</w:t>
       </w:r>
       <w:proofErr w:type="spellStart"/>
+      <w:proofErr w:type="gramEnd"/>
       <w:r>
         <w:rPr>
           <w:rFonts w:ascii="Consolas" w:eastAsia="Times New Roman" w:hAnsi="Consolas" w:cs="Courier New"/>
@@ -10522,6 +10739,7 @@
         </w:rPr>
         <w:t xml:space="preserve">    </w:t>
       </w:r>
+      <w:proofErr w:type="gramStart"/>
       <w:r>
         <w:rPr>
           <w:rFonts w:ascii="Consolas" w:eastAsia="Times New Roman" w:hAnsi="Consolas" w:cs="Courier New"/>
@@ -10548,6 +10766,7 @@
         </w:rPr>
         <w:t>(</w:t>
       </w:r>
+      <w:proofErr w:type="gramEnd"/>
       <w:r>
         <w:rPr>
           <w:rFonts w:ascii="Consolas" w:eastAsia="Times New Roman" w:hAnsi="Consolas" w:cs="Courier New"/>
@@ -10660,19 +10879,7 @@
           <w:lang w:val="en-US" w:eastAsia="de-DE"/>
           <w14:ligatures w14:val="none"/>
         </w:rPr>
-        <w:t xml:space="preserve"> &lt;=</w:t>
-      </w:r>
-      <w:r>
-        <w:rPr>
-          <w:rFonts w:ascii="Consolas" w:eastAsia="Times New Roman" w:hAnsi="Consolas" w:cs="Courier New"/>
-          <w:color w:val="E2E2E2"/>
-          <w:kern w:val="0"/>
-          <w:sz w:val="21"/>
-          <w:szCs w:val="21"/>
-          <w:lang w:val="en-US" w:eastAsia="de-DE"/>
-          <w14:ligatures w14:val="none"/>
-        </w:rPr>
-        <w:t xml:space="preserve"> ((</w:t>
+        <w:t xml:space="preserve"> &lt;= ((</w:t>
       </w:r>
       <w:proofErr w:type="spellStart"/>
       <w:r>
@@ -10700,19 +10907,7 @@
           <w:lang w:val="en-US" w:eastAsia="de-DE"/>
           <w14:ligatures w14:val="none"/>
         </w:rPr>
-        <w:t>(</w:t>
-      </w:r>
-      <w:r>
-        <w:rPr>
-          <w:rFonts w:ascii="Consolas" w:eastAsia="Times New Roman" w:hAnsi="Consolas" w:cs="Courier New"/>
-          <w:color w:val="E2E2E2"/>
-          <w:kern w:val="0"/>
-          <w:sz w:val="21"/>
-          <w:szCs w:val="21"/>
-          <w:lang w:val="en-US" w:eastAsia="de-DE"/>
-          <w14:ligatures w14:val="none"/>
-        </w:rPr>
-        <w:t xml:space="preserve">string1) / </w:t>
+        <w:t xml:space="preserve">(string1) / </w:t>
       </w:r>
       <w:proofErr w:type="spellStart"/>
       <w:r>
@@ -10740,19 +10935,7 @@
           <w:lang w:val="en-US" w:eastAsia="de-DE"/>
           <w14:ligatures w14:val="none"/>
         </w:rPr>
-        <w:t>(string1</w:t>
-      </w:r>
-      <w:r>
-        <w:rPr>
-          <w:rFonts w:ascii="Consolas" w:eastAsia="Times New Roman" w:hAnsi="Consolas" w:cs="Courier New"/>
-          <w:color w:val="E2E2E2"/>
-          <w:kern w:val="0"/>
-          <w:sz w:val="21"/>
-          <w:szCs w:val="21"/>
-          <w:lang w:val="en-US" w:eastAsia="de-DE"/>
-          <w14:ligatures w14:val="none"/>
-        </w:rPr>
-        <w:t>[</w:t>
+        <w:t>(string1[</w:t>
       </w:r>
       <w:r>
         <w:rPr>
@@ -10776,31 +10959,7 @@
           <w:lang w:val="en-US" w:eastAsia="de-DE"/>
           <w14:ligatures w14:val="none"/>
         </w:rPr>
-        <w:t>]</w:t>
-      </w:r>
-      <w:r>
-        <w:rPr>
-          <w:rFonts w:ascii="Consolas" w:eastAsia="Times New Roman" w:hAnsi="Consolas" w:cs="Courier New"/>
-          <w:color w:val="E2E2E2"/>
-          <w:kern w:val="0"/>
-          <w:sz w:val="21"/>
-          <w:szCs w:val="21"/>
-          <w:lang w:val="en-US" w:eastAsia="de-DE"/>
-          <w14:ligatures w14:val="none"/>
-        </w:rPr>
-        <w:t>)</w:t>
-      </w:r>
-      <w:r>
-        <w:rPr>
-          <w:rFonts w:ascii="Consolas" w:eastAsia="Times New Roman" w:hAnsi="Consolas" w:cs="Courier New"/>
-          <w:color w:val="E2E2E2"/>
-          <w:kern w:val="0"/>
-          <w:sz w:val="21"/>
-          <w:szCs w:val="21"/>
-          <w:lang w:val="en-US" w:eastAsia="de-DE"/>
-          <w14:ligatures w14:val="none"/>
-        </w:rPr>
-        <w:t xml:space="preserve">) - </w:t>
+        <w:t xml:space="preserve">])) - </w:t>
       </w:r>
       <w:r>
         <w:rPr>
@@ -10824,19 +10983,7 @@
           <w:lang w:val="en-US" w:eastAsia="de-DE"/>
           <w14:ligatures w14:val="none"/>
         </w:rPr>
-        <w:t>)</w:t>
-      </w:r>
-      <w:r>
-        <w:rPr>
-          <w:rFonts w:ascii="Consolas" w:eastAsia="Times New Roman" w:hAnsi="Consolas" w:cs="Courier New"/>
-          <w:color w:val="E2E2E2"/>
-          <w:kern w:val="0"/>
-          <w:sz w:val="21"/>
-          <w:szCs w:val="21"/>
-          <w:lang w:val="en-US" w:eastAsia="de-DE"/>
-          <w14:ligatures w14:val="none"/>
-        </w:rPr>
-        <w:t xml:space="preserve">; </w:t>
+        <w:t xml:space="preserve">); </w:t>
       </w:r>
       <w:proofErr w:type="spellStart"/>
       <w:r>
@@ -11441,7 +11588,7 @@
           <w:kern w:val="0"/>
           <w:sz w:val="21"/>
           <w:szCs w:val="21"/>
-          <w:lang w:eastAsia="de-DE"/>
+          <w:lang w:val="en-US" w:eastAsia="de-DE"/>
           <w14:ligatures w14:val="none"/>
         </w:rPr>
       </w:pPr>
@@ -11464,7 +11611,7 @@
           <w:kern w:val="0"/>
           <w:sz w:val="21"/>
           <w:szCs w:val="21"/>
-          <w:lang w:eastAsia="de-DE"/>
+          <w:lang w:val="en-US" w:eastAsia="de-DE"/>
           <w14:ligatures w14:val="none"/>
         </w:rPr>
         <w:t>}</w:t>
@@ -11533,31 +11680,7 @@
           <w:lang w:val="en-US" w:eastAsia="de-DE"/>
           <w14:ligatures w14:val="none"/>
         </w:rPr>
-        <w:t>C</w:t>
-      </w:r>
-      <w:r>
-        <w:rPr>
-          <w:rFonts w:eastAsia="Times New Roman" w:cs="Courier New"/>
-          <w:color w:val="00CF11"/>
-          <w:kern w:val="0"/>
-          <w:sz w:val="21"/>
-          <w:szCs w:val="21"/>
-          <w:lang w:val="en-US" w:eastAsia="de-DE"/>
-          <w14:ligatures w14:val="none"/>
-        </w:rPr>
-        <w:t>++</w:t>
-      </w:r>
-      <w:r>
-        <w:rPr>
-          <w:rFonts w:eastAsia="Times New Roman" w:cs="Courier New"/>
-          <w:color w:val="00CF11"/>
-          <w:kern w:val="0"/>
-          <w:sz w:val="21"/>
-          <w:szCs w:val="21"/>
-          <w:lang w:val="en-US" w:eastAsia="de-DE"/>
-          <w14:ligatures w14:val="none"/>
-        </w:rPr>
-        <w:t xml:space="preserve"> String</w:t>
+        <w:t>C++ String</w:t>
       </w:r>
     </w:p>
     <w:p>
@@ -11606,6 +11729,7 @@
         </w:rPr>
         <w:t xml:space="preserve">    </w:t>
       </w:r>
+      <w:proofErr w:type="gramStart"/>
       <w:r>
         <w:rPr>
           <w:rFonts w:ascii="Consolas" w:eastAsia="Times New Roman" w:hAnsi="Consolas" w:cs="Courier New"/>
@@ -11632,6 +11756,7 @@
         </w:rPr>
         <w:t>(</w:t>
       </w:r>
+      <w:proofErr w:type="gramEnd"/>
       <w:r>
         <w:rPr>
           <w:rFonts w:ascii="Consolas" w:eastAsia="Times New Roman" w:hAnsi="Consolas" w:cs="Courier New"/>
@@ -11744,19 +11869,7 @@
           <w:lang w:val="en-US" w:eastAsia="de-DE"/>
           <w14:ligatures w14:val="none"/>
         </w:rPr>
-        <w:t xml:space="preserve"> &lt;=</w:t>
-      </w:r>
-      <w:r>
-        <w:rPr>
-          <w:rFonts w:ascii="Consolas" w:eastAsia="Times New Roman" w:hAnsi="Consolas" w:cs="Courier New"/>
-          <w:color w:val="E2E2E2"/>
-          <w:kern w:val="0"/>
-          <w:sz w:val="21"/>
-          <w:szCs w:val="21"/>
-          <w:lang w:val="en-US" w:eastAsia="de-DE"/>
-          <w14:ligatures w14:val="none"/>
-        </w:rPr>
-        <w:t xml:space="preserve"> string2.</w:t>
+        <w:t xml:space="preserve"> &lt;= string2.</w:t>
       </w:r>
       <w:r>
         <w:rPr>
@@ -11780,19 +11893,7 @@
           <w:lang w:val="en-US" w:eastAsia="de-DE"/>
           <w14:ligatures w14:val="none"/>
         </w:rPr>
-        <w:t>();</w:t>
-      </w:r>
-      <w:r>
-        <w:rPr>
-          <w:rFonts w:ascii="Consolas" w:eastAsia="Times New Roman" w:hAnsi="Consolas" w:cs="Courier New"/>
-          <w:color w:val="E2E2E2"/>
-          <w:kern w:val="0"/>
-          <w:sz w:val="21"/>
-          <w:szCs w:val="21"/>
-          <w:lang w:val="en-US" w:eastAsia="de-DE"/>
-          <w14:ligatures w14:val="none"/>
-        </w:rPr>
-        <w:t xml:space="preserve"> i++)</w:t>
+        <w:t>(); i++)</w:t>
       </w:r>
     </w:p>
     <w:p>
@@ -12371,7 +12472,7 @@
           <w:kern w:val="0"/>
           <w:sz w:val="21"/>
           <w:szCs w:val="21"/>
-          <w:lang w:eastAsia="de-DE"/>
+          <w:lang w:val="en-US" w:eastAsia="de-DE"/>
           <w14:ligatures w14:val="none"/>
         </w:rPr>
       </w:pPr>
@@ -12394,7 +12495,7 @@
           <w:kern w:val="0"/>
           <w:sz w:val="21"/>
           <w:szCs w:val="21"/>
-          <w:lang w:eastAsia="de-DE"/>
+          <w:lang w:val="en-US" w:eastAsia="de-DE"/>
           <w14:ligatures w14:val="none"/>
         </w:rPr>
         <w:t>}</w:t>
@@ -12459,6 +12560,7 @@
         </w:rPr>
         <w:t xml:space="preserve">    </w:t>
       </w:r>
+      <w:proofErr w:type="gramStart"/>
       <w:r>
         <w:rPr>
           <w:rFonts w:ascii="Consolas" w:eastAsia="Times New Roman" w:hAnsi="Consolas" w:cs="Courier New"/>
@@ -12472,6 +12574,7 @@
         <w:t>std::</w:t>
       </w:r>
       <w:proofErr w:type="spellStart"/>
+      <w:proofErr w:type="gramEnd"/>
       <w:r>
         <w:rPr>
           <w:rFonts w:ascii="Consolas" w:eastAsia="Times New Roman" w:hAnsi="Consolas" w:cs="Courier New"/>
@@ -12495,9 +12598,23 @@
           <w:lang w:val="en-US" w:eastAsia="de-DE"/>
           <w14:ligatures w14:val="none"/>
         </w:rPr>
-        <w:t xml:space="preserve"> &lt;&lt; string1 &lt;&lt; std::</w:t>
+        <w:t xml:space="preserve"> &lt;&lt; string1 &lt;&lt; </w:t>
+      </w:r>
+      <w:proofErr w:type="gramStart"/>
+      <w:r>
+        <w:rPr>
+          <w:rFonts w:ascii="Consolas" w:eastAsia="Times New Roman" w:hAnsi="Consolas" w:cs="Courier New"/>
+          <w:color w:val="E2E2E2"/>
+          <w:kern w:val="0"/>
+          <w:sz w:val="21"/>
+          <w:szCs w:val="21"/>
+          <w:lang w:val="en-US" w:eastAsia="de-DE"/>
+          <w14:ligatures w14:val="none"/>
+        </w:rPr>
+        <w:t>std::</w:t>
       </w:r>
       <w:proofErr w:type="spellStart"/>
+      <w:proofErr w:type="gramEnd"/>
       <w:r>
         <w:rPr>
           <w:rFonts w:ascii="Consolas" w:eastAsia="Times New Roman" w:hAnsi="Consolas" w:cs="Courier New"/>
@@ -12566,9 +12683,23 @@
           <w:lang w:val="en-US" w:eastAsia="de-DE"/>
           <w14:ligatures w14:val="none"/>
         </w:rPr>
-        <w:t xml:space="preserve">    std::</w:t>
+        <w:t xml:space="preserve">    </w:t>
+      </w:r>
+      <w:proofErr w:type="gramStart"/>
+      <w:r>
+        <w:rPr>
+          <w:rFonts w:ascii="Consolas" w:eastAsia="Times New Roman" w:hAnsi="Consolas" w:cs="Courier New"/>
+          <w:color w:val="E2E2E2"/>
+          <w:kern w:val="0"/>
+          <w:sz w:val="21"/>
+          <w:szCs w:val="21"/>
+          <w:lang w:val="en-US" w:eastAsia="de-DE"/>
+          <w14:ligatures w14:val="none"/>
+        </w:rPr>
+        <w:t>std::</w:t>
       </w:r>
       <w:proofErr w:type="spellStart"/>
+      <w:proofErr w:type="gramEnd"/>
       <w:r>
         <w:rPr>
           <w:rFonts w:ascii="Consolas" w:eastAsia="Times New Roman" w:hAnsi="Consolas" w:cs="Courier New"/>
@@ -12592,9 +12723,23 @@
           <w:lang w:val="en-US" w:eastAsia="de-DE"/>
           <w14:ligatures w14:val="none"/>
         </w:rPr>
-        <w:t xml:space="preserve"> &lt;&lt; string2 &lt;&lt; std::</w:t>
+        <w:t xml:space="preserve"> &lt;&lt; string2 &lt;&lt; </w:t>
+      </w:r>
+      <w:proofErr w:type="gramStart"/>
+      <w:r>
+        <w:rPr>
+          <w:rFonts w:ascii="Consolas" w:eastAsia="Times New Roman" w:hAnsi="Consolas" w:cs="Courier New"/>
+          <w:color w:val="E2E2E2"/>
+          <w:kern w:val="0"/>
+          <w:sz w:val="21"/>
+          <w:szCs w:val="21"/>
+          <w:lang w:val="en-US" w:eastAsia="de-DE"/>
+          <w14:ligatures w14:val="none"/>
+        </w:rPr>
+        <w:t>std::</w:t>
       </w:r>
       <w:proofErr w:type="spellStart"/>
+      <w:proofErr w:type="gramEnd"/>
       <w:r>
         <w:rPr>
           <w:rFonts w:ascii="Consolas" w:eastAsia="Times New Roman" w:hAnsi="Consolas" w:cs="Courier New"/>
@@ -12817,6 +12962,1400 @@
         </w:rPr>
       </w:pPr>
     </w:p>
+    <w:p>
+      <w:pPr>
+        <w:rPr>
+          <w:lang w:val="en-US"/>
+        </w:rPr>
+      </w:pPr>
+    </w:p>
+    <w:p>
+      <w:pPr>
+        <w:pStyle w:val="Listenabsatz"/>
+        <w:numPr>
+          <w:ilvl w:val="0"/>
+          <w:numId w:val="1"/>
+        </w:numPr>
+      </w:pPr>
+      <w:r>
+        <w:lastRenderedPageBreak/>
+        <w:t>Erstelle</w:t>
+      </w:r>
+      <w:r>
+        <w:t>n Sie</w:t>
+      </w:r>
+      <w:r>
+        <w:t xml:space="preserve"> eine Funktion namens </w:t>
+      </w:r>
+      <w:proofErr w:type="spellStart"/>
+      <w:r>
+        <w:t>p</w:t>
+      </w:r>
+      <w:r>
+        <w:t>rintFour</w:t>
+      </w:r>
+      <w:proofErr w:type="spellEnd"/>
+      <w:r>
+        <w:t>(), die eine Zahl (</w:t>
+      </w:r>
+      <w:proofErr w:type="spellStart"/>
+      <w:r>
+        <w:t>int</w:t>
+      </w:r>
+      <w:proofErr w:type="spellEnd"/>
+      <w:r>
+        <w:t>) als Parameter entgegennimmt und diese vier Mal untereinander ausgibt. Rufen Sie die Funktion in main() zweimal auf, einmal mit dem Wert 5 und einmal mit dem Wert 8.</w:t>
+      </w:r>
+    </w:p>
+    <w:p>
+      <w:proofErr w:type="spellStart"/>
+      <w:r>
+        <w:t>Lsg</w:t>
+      </w:r>
+      <w:proofErr w:type="spellEnd"/>
+      <w:r>
+        <w:t>:</w:t>
+      </w:r>
+    </w:p>
+    <w:p>
+      <w:pPr>
+        <w:shd w:val="clear" w:color="auto" w:fill="303030"/>
+        <w:tabs>
+          <w:tab w:val="left" w:pos="916"/>
+          <w:tab w:val="left" w:pos="1832"/>
+          <w:tab w:val="left" w:pos="2748"/>
+          <w:tab w:val="left" w:pos="3664"/>
+          <w:tab w:val="left" w:pos="4580"/>
+          <w:tab w:val="left" w:pos="5496"/>
+          <w:tab w:val="left" w:pos="6412"/>
+          <w:tab w:val="left" w:pos="7328"/>
+          <w:tab w:val="left" w:pos="8244"/>
+          <w:tab w:val="left" w:pos="9160"/>
+          <w:tab w:val="left" w:pos="10076"/>
+          <w:tab w:val="left" w:pos="10992"/>
+          <w:tab w:val="left" w:pos="11908"/>
+          <w:tab w:val="left" w:pos="12824"/>
+          <w:tab w:val="left" w:pos="13740"/>
+          <w:tab w:val="left" w:pos="14656"/>
+        </w:tabs>
+        <w:spacing w:after="0" w:line="240" w:lineRule="auto"/>
+        <w:rPr>
+          <w:rFonts w:ascii="Consolas" w:eastAsia="Times New Roman" w:hAnsi="Consolas" w:cs="Courier New"/>
+          <w:color w:val="E2E2E2"/>
+          <w:kern w:val="0"/>
+          <w:sz w:val="21"/>
+          <w:szCs w:val="21"/>
+          <w:lang w:val="en-US" w:eastAsia="de-DE"/>
+          <w14:ligatures w14:val="none"/>
+        </w:rPr>
+      </w:pPr>
+      <w:proofErr w:type="gramStart"/>
+      <w:r>
+        <w:rPr>
+          <w:rFonts w:ascii="Consolas" w:eastAsia="Times New Roman" w:hAnsi="Consolas" w:cs="Courier New"/>
+          <w:color w:val="B8B8B8"/>
+          <w:kern w:val="0"/>
+          <w:sz w:val="21"/>
+          <w:szCs w:val="21"/>
+          <w:lang w:val="en-US" w:eastAsia="de-DE"/>
+          <w14:ligatures w14:val="none"/>
+        </w:rPr>
+        <w:t>#include</w:t>
+      </w:r>
+      <w:proofErr w:type="gramEnd"/>
+      <w:r>
+        <w:rPr>
+          <w:rFonts w:ascii="Consolas" w:eastAsia="Times New Roman" w:hAnsi="Consolas" w:cs="Courier New"/>
+          <w:color w:val="E2E2E2"/>
+          <w:kern w:val="0"/>
+          <w:sz w:val="21"/>
+          <w:szCs w:val="21"/>
+          <w:lang w:val="en-US" w:eastAsia="de-DE"/>
+          <w14:ligatures w14:val="none"/>
+        </w:rPr>
+        <w:t xml:space="preserve"> </w:t>
+      </w:r>
+      <w:r>
+        <w:rPr>
+          <w:rFonts w:ascii="Consolas" w:eastAsia="Times New Roman" w:hAnsi="Consolas" w:cs="Courier New"/>
+          <w:color w:val="CE9178"/>
+          <w:kern w:val="0"/>
+          <w:sz w:val="21"/>
+          <w:szCs w:val="21"/>
+          <w:lang w:val="en-US" w:eastAsia="de-DE"/>
+          <w14:ligatures w14:val="none"/>
+        </w:rPr>
+        <w:t>&lt;iostream&gt;</w:t>
+      </w:r>
+    </w:p>
+    <w:p>
+      <w:pPr>
+        <w:shd w:val="clear" w:color="auto" w:fill="303030"/>
+        <w:tabs>
+          <w:tab w:val="left" w:pos="916"/>
+          <w:tab w:val="left" w:pos="1832"/>
+          <w:tab w:val="left" w:pos="2748"/>
+          <w:tab w:val="left" w:pos="3664"/>
+          <w:tab w:val="left" w:pos="4580"/>
+          <w:tab w:val="left" w:pos="5496"/>
+          <w:tab w:val="left" w:pos="6412"/>
+          <w:tab w:val="left" w:pos="7328"/>
+          <w:tab w:val="left" w:pos="8244"/>
+          <w:tab w:val="left" w:pos="9160"/>
+          <w:tab w:val="left" w:pos="10076"/>
+          <w:tab w:val="left" w:pos="10992"/>
+          <w:tab w:val="left" w:pos="11908"/>
+          <w:tab w:val="left" w:pos="12824"/>
+          <w:tab w:val="left" w:pos="13740"/>
+          <w:tab w:val="left" w:pos="14656"/>
+        </w:tabs>
+        <w:spacing w:after="0" w:line="240" w:lineRule="auto"/>
+        <w:rPr>
+          <w:rFonts w:ascii="Consolas" w:eastAsia="Times New Roman" w:hAnsi="Consolas" w:cs="Courier New"/>
+          <w:color w:val="E2E2E2"/>
+          <w:kern w:val="0"/>
+          <w:sz w:val="21"/>
+          <w:szCs w:val="21"/>
+          <w:lang w:val="en-US" w:eastAsia="de-DE"/>
+          <w14:ligatures w14:val="none"/>
+        </w:rPr>
+      </w:pPr>
+    </w:p>
+    <w:p>
+      <w:pPr>
+        <w:shd w:val="clear" w:color="auto" w:fill="303030"/>
+        <w:tabs>
+          <w:tab w:val="left" w:pos="916"/>
+          <w:tab w:val="left" w:pos="1832"/>
+          <w:tab w:val="left" w:pos="2748"/>
+          <w:tab w:val="left" w:pos="3664"/>
+          <w:tab w:val="left" w:pos="4580"/>
+          <w:tab w:val="left" w:pos="5496"/>
+          <w:tab w:val="left" w:pos="6412"/>
+          <w:tab w:val="left" w:pos="7328"/>
+          <w:tab w:val="left" w:pos="8244"/>
+          <w:tab w:val="left" w:pos="9160"/>
+          <w:tab w:val="left" w:pos="10076"/>
+          <w:tab w:val="left" w:pos="10992"/>
+          <w:tab w:val="left" w:pos="11908"/>
+          <w:tab w:val="left" w:pos="12824"/>
+          <w:tab w:val="left" w:pos="13740"/>
+          <w:tab w:val="left" w:pos="14656"/>
+        </w:tabs>
+        <w:spacing w:after="0" w:line="240" w:lineRule="auto"/>
+        <w:rPr>
+          <w:rFonts w:ascii="Consolas" w:eastAsia="Times New Roman" w:hAnsi="Consolas" w:cs="Courier New"/>
+          <w:color w:val="E2E2E2"/>
+          <w:kern w:val="0"/>
+          <w:sz w:val="21"/>
+          <w:szCs w:val="21"/>
+          <w:lang w:val="en-US" w:eastAsia="de-DE"/>
+          <w14:ligatures w14:val="none"/>
+        </w:rPr>
+      </w:pPr>
+      <w:r>
+        <w:rPr>
+          <w:rFonts w:ascii="Consolas" w:eastAsia="Times New Roman" w:hAnsi="Consolas" w:cs="Courier New"/>
+          <w:b/>
+          <w:bCs/>
+          <w:color w:val="569CD6"/>
+          <w:kern w:val="0"/>
+          <w:sz w:val="21"/>
+          <w:szCs w:val="21"/>
+          <w:lang w:val="en-US" w:eastAsia="de-DE"/>
+          <w14:ligatures w14:val="none"/>
+        </w:rPr>
+        <w:t>void</w:t>
+      </w:r>
+      <w:r>
+        <w:rPr>
+          <w:rFonts w:ascii="Consolas" w:eastAsia="Times New Roman" w:hAnsi="Consolas" w:cs="Courier New"/>
+          <w:color w:val="E2E2E2"/>
+          <w:kern w:val="0"/>
+          <w:sz w:val="21"/>
+          <w:szCs w:val="21"/>
+          <w:lang w:val="en-US" w:eastAsia="de-DE"/>
+          <w14:ligatures w14:val="none"/>
+        </w:rPr>
+        <w:t xml:space="preserve"> </w:t>
+      </w:r>
+      <w:proofErr w:type="spellStart"/>
+      <w:proofErr w:type="gramStart"/>
+      <w:r>
+        <w:rPr>
+          <w:rFonts w:ascii="Consolas" w:eastAsia="Times New Roman" w:hAnsi="Consolas" w:cs="Courier New"/>
+          <w:color w:val="FFF2AA"/>
+          <w:kern w:val="0"/>
+          <w:sz w:val="21"/>
+          <w:szCs w:val="21"/>
+          <w:lang w:val="en-US" w:eastAsia="de-DE"/>
+          <w14:ligatures w14:val="none"/>
+        </w:rPr>
+        <w:t>printFour</w:t>
+      </w:r>
+      <w:proofErr w:type="spellEnd"/>
+      <w:r>
+        <w:rPr>
+          <w:rFonts w:ascii="Consolas" w:eastAsia="Times New Roman" w:hAnsi="Consolas" w:cs="Courier New"/>
+          <w:color w:val="E2E2E2"/>
+          <w:kern w:val="0"/>
+          <w:sz w:val="21"/>
+          <w:szCs w:val="21"/>
+          <w:lang w:val="en-US" w:eastAsia="de-DE"/>
+          <w14:ligatures w14:val="none"/>
+        </w:rPr>
+        <w:t>(</w:t>
+      </w:r>
+      <w:proofErr w:type="gramEnd"/>
+      <w:r>
+        <w:rPr>
+          <w:rFonts w:ascii="Consolas" w:eastAsia="Times New Roman" w:hAnsi="Consolas" w:cs="Courier New"/>
+          <w:b/>
+          <w:bCs/>
+          <w:color w:val="569CD6"/>
+          <w:kern w:val="0"/>
+          <w:sz w:val="21"/>
+          <w:szCs w:val="21"/>
+          <w:lang w:val="en-US" w:eastAsia="de-DE"/>
+          <w14:ligatures w14:val="none"/>
+        </w:rPr>
+        <w:t>int</w:t>
+      </w:r>
+      <w:r>
+        <w:rPr>
+          <w:rFonts w:ascii="Consolas" w:eastAsia="Times New Roman" w:hAnsi="Consolas" w:cs="Courier New"/>
+          <w:color w:val="E2E2E2"/>
+          <w:kern w:val="0"/>
+          <w:sz w:val="21"/>
+          <w:szCs w:val="21"/>
+          <w:lang w:val="en-US" w:eastAsia="de-DE"/>
+          <w14:ligatures w14:val="none"/>
+        </w:rPr>
+        <w:t xml:space="preserve"> a</w:t>
+      </w:r>
+      <w:r>
+        <w:rPr>
+          <w:rFonts w:ascii="Consolas" w:eastAsia="Times New Roman" w:hAnsi="Consolas" w:cs="Courier New"/>
+          <w:color w:val="E2E2E2"/>
+          <w:kern w:val="0"/>
+          <w:sz w:val="21"/>
+          <w:szCs w:val="21"/>
+          <w:lang w:val="en-US" w:eastAsia="de-DE"/>
+          <w14:ligatures w14:val="none"/>
+        </w:rPr>
+        <w:t>)</w:t>
+      </w:r>
+    </w:p>
+    <w:p>
+      <w:pPr>
+        <w:shd w:val="clear" w:color="auto" w:fill="303030"/>
+        <w:tabs>
+          <w:tab w:val="left" w:pos="916"/>
+          <w:tab w:val="left" w:pos="1832"/>
+          <w:tab w:val="left" w:pos="2748"/>
+          <w:tab w:val="left" w:pos="3664"/>
+          <w:tab w:val="left" w:pos="4580"/>
+          <w:tab w:val="left" w:pos="5496"/>
+          <w:tab w:val="left" w:pos="6412"/>
+          <w:tab w:val="left" w:pos="7328"/>
+          <w:tab w:val="left" w:pos="8244"/>
+          <w:tab w:val="left" w:pos="9160"/>
+          <w:tab w:val="left" w:pos="10076"/>
+          <w:tab w:val="left" w:pos="10992"/>
+          <w:tab w:val="left" w:pos="11908"/>
+          <w:tab w:val="left" w:pos="12824"/>
+          <w:tab w:val="left" w:pos="13740"/>
+          <w:tab w:val="left" w:pos="14656"/>
+        </w:tabs>
+        <w:spacing w:after="0" w:line="240" w:lineRule="auto"/>
+        <w:rPr>
+          <w:rFonts w:ascii="Consolas" w:eastAsia="Times New Roman" w:hAnsi="Consolas" w:cs="Courier New"/>
+          <w:color w:val="FFD700"/>
+          <w:kern w:val="0"/>
+          <w:sz w:val="21"/>
+          <w:szCs w:val="21"/>
+          <w:lang w:val="en-US" w:eastAsia="de-DE"/>
+          <w14:ligatures w14:val="none"/>
+        </w:rPr>
+      </w:pPr>
+      <w:r>
+        <w:rPr>
+          <w:rFonts w:ascii="Consolas" w:eastAsia="Times New Roman" w:hAnsi="Consolas" w:cs="Courier New"/>
+          <w:color w:val="FFD700"/>
+          <w:kern w:val="0"/>
+          <w:sz w:val="21"/>
+          <w:szCs w:val="21"/>
+          <w:lang w:val="en-US" w:eastAsia="de-DE"/>
+          <w14:ligatures w14:val="none"/>
+        </w:rPr>
+        <w:t>{</w:t>
+      </w:r>
+    </w:p>
+    <w:p>
+      <w:pPr>
+        <w:shd w:val="clear" w:color="auto" w:fill="303030"/>
+        <w:tabs>
+          <w:tab w:val="left" w:pos="916"/>
+          <w:tab w:val="left" w:pos="1832"/>
+          <w:tab w:val="left" w:pos="2748"/>
+          <w:tab w:val="left" w:pos="3664"/>
+          <w:tab w:val="left" w:pos="4580"/>
+          <w:tab w:val="left" w:pos="5496"/>
+          <w:tab w:val="left" w:pos="6412"/>
+          <w:tab w:val="left" w:pos="7328"/>
+          <w:tab w:val="left" w:pos="8244"/>
+          <w:tab w:val="left" w:pos="9160"/>
+          <w:tab w:val="left" w:pos="10076"/>
+          <w:tab w:val="left" w:pos="10992"/>
+          <w:tab w:val="left" w:pos="11908"/>
+          <w:tab w:val="left" w:pos="12824"/>
+          <w:tab w:val="left" w:pos="13740"/>
+          <w:tab w:val="left" w:pos="14656"/>
+        </w:tabs>
+        <w:spacing w:after="0" w:line="240" w:lineRule="auto"/>
+        <w:rPr>
+          <w:rFonts w:ascii="Consolas" w:eastAsia="Times New Roman" w:hAnsi="Consolas" w:cs="Courier New"/>
+          <w:color w:val="E2E2E2"/>
+          <w:kern w:val="0"/>
+          <w:sz w:val="21"/>
+          <w:szCs w:val="21"/>
+          <w:lang w:val="en-US" w:eastAsia="de-DE"/>
+          <w14:ligatures w14:val="none"/>
+        </w:rPr>
+      </w:pPr>
+      <w:r>
+        <w:rPr>
+          <w:rFonts w:ascii="Consolas" w:eastAsia="Times New Roman" w:hAnsi="Consolas" w:cs="Courier New"/>
+          <w:b/>
+          <w:bCs/>
+          <w:color w:val="569CD6"/>
+          <w:kern w:val="0"/>
+          <w:sz w:val="21"/>
+          <w:szCs w:val="21"/>
+          <w:lang w:val="en-US" w:eastAsia="de-DE"/>
+          <w14:ligatures w14:val="none"/>
+        </w:rPr>
+        <w:t xml:space="preserve">    </w:t>
+      </w:r>
+      <w:proofErr w:type="gramStart"/>
+      <w:r>
+        <w:rPr>
+          <w:rFonts w:ascii="Consolas" w:eastAsia="Times New Roman" w:hAnsi="Consolas" w:cs="Courier New"/>
+          <w:b/>
+          <w:bCs/>
+          <w:color w:val="569CD6"/>
+          <w:kern w:val="0"/>
+          <w:sz w:val="21"/>
+          <w:szCs w:val="21"/>
+          <w:lang w:val="en-US" w:eastAsia="de-DE"/>
+          <w14:ligatures w14:val="none"/>
+        </w:rPr>
+        <w:t>for</w:t>
+      </w:r>
+      <w:r>
+        <w:rPr>
+          <w:rFonts w:ascii="Consolas" w:eastAsia="Times New Roman" w:hAnsi="Consolas" w:cs="Courier New"/>
+          <w:color w:val="E2E2E2"/>
+          <w:kern w:val="0"/>
+          <w:sz w:val="21"/>
+          <w:szCs w:val="21"/>
+          <w:lang w:val="en-US" w:eastAsia="de-DE"/>
+          <w14:ligatures w14:val="none"/>
+        </w:rPr>
+        <w:t>(</w:t>
+      </w:r>
+      <w:proofErr w:type="gramEnd"/>
+      <w:r>
+        <w:rPr>
+          <w:rFonts w:ascii="Consolas" w:eastAsia="Times New Roman" w:hAnsi="Consolas" w:cs="Courier New"/>
+          <w:b/>
+          <w:bCs/>
+          <w:color w:val="569CD6"/>
+          <w:kern w:val="0"/>
+          <w:sz w:val="21"/>
+          <w:szCs w:val="21"/>
+          <w:lang w:val="en-US" w:eastAsia="de-DE"/>
+          <w14:ligatures w14:val="none"/>
+        </w:rPr>
+        <w:t>int</w:t>
+      </w:r>
+      <w:r>
+        <w:rPr>
+          <w:rFonts w:ascii="Consolas" w:eastAsia="Times New Roman" w:hAnsi="Consolas" w:cs="Courier New"/>
+          <w:color w:val="E2E2E2"/>
+          <w:kern w:val="0"/>
+          <w:sz w:val="21"/>
+          <w:szCs w:val="21"/>
+          <w:lang w:val="en-US" w:eastAsia="de-DE"/>
+          <w14:ligatures w14:val="none"/>
+        </w:rPr>
+        <w:t xml:space="preserve"> </w:t>
+      </w:r>
+      <w:proofErr w:type="spellStart"/>
+      <w:r>
+        <w:rPr>
+          <w:rFonts w:ascii="Consolas" w:eastAsia="Times New Roman" w:hAnsi="Consolas" w:cs="Courier New"/>
+          <w:color w:val="E2E2E2"/>
+          <w:kern w:val="0"/>
+          <w:sz w:val="21"/>
+          <w:szCs w:val="21"/>
+          <w:lang w:val="en-US" w:eastAsia="de-DE"/>
+          <w14:ligatures w14:val="none"/>
+        </w:rPr>
+        <w:t>i</w:t>
+      </w:r>
+      <w:proofErr w:type="spellEnd"/>
+      <w:r>
+        <w:rPr>
+          <w:rFonts w:ascii="Consolas" w:eastAsia="Times New Roman" w:hAnsi="Consolas" w:cs="Courier New"/>
+          <w:color w:val="E2E2E2"/>
+          <w:kern w:val="0"/>
+          <w:sz w:val="21"/>
+          <w:szCs w:val="21"/>
+          <w:lang w:val="en-US" w:eastAsia="de-DE"/>
+          <w14:ligatures w14:val="none"/>
+        </w:rPr>
+        <w:t xml:space="preserve"> = </w:t>
+      </w:r>
+      <w:r>
+        <w:rPr>
+          <w:rFonts w:ascii="Consolas" w:eastAsia="Times New Roman" w:hAnsi="Consolas" w:cs="Courier New"/>
+          <w:color w:val="A6E696"/>
+          <w:kern w:val="0"/>
+          <w:sz w:val="21"/>
+          <w:szCs w:val="21"/>
+          <w:lang w:val="en-US" w:eastAsia="de-DE"/>
+          <w14:ligatures w14:val="none"/>
+        </w:rPr>
+        <w:t>0</w:t>
+      </w:r>
+      <w:r>
+        <w:rPr>
+          <w:rFonts w:ascii="Consolas" w:eastAsia="Times New Roman" w:hAnsi="Consolas" w:cs="Courier New"/>
+          <w:color w:val="E2E2E2"/>
+          <w:kern w:val="0"/>
+          <w:sz w:val="21"/>
+          <w:szCs w:val="21"/>
+          <w:lang w:val="en-US" w:eastAsia="de-DE"/>
+          <w14:ligatures w14:val="none"/>
+        </w:rPr>
+        <w:t>;</w:t>
+      </w:r>
+      <w:r>
+        <w:rPr>
+          <w:rFonts w:ascii="Consolas" w:eastAsia="Times New Roman" w:hAnsi="Consolas" w:cs="Courier New"/>
+          <w:color w:val="E2E2E2"/>
+          <w:kern w:val="0"/>
+          <w:sz w:val="21"/>
+          <w:szCs w:val="21"/>
+          <w:lang w:val="en-US" w:eastAsia="de-DE"/>
+          <w14:ligatures w14:val="none"/>
+        </w:rPr>
+        <w:t xml:space="preserve"> </w:t>
+      </w:r>
+      <w:proofErr w:type="spellStart"/>
+      <w:r>
+        <w:rPr>
+          <w:rFonts w:ascii="Consolas" w:eastAsia="Times New Roman" w:hAnsi="Consolas" w:cs="Courier New"/>
+          <w:color w:val="E2E2E2"/>
+          <w:kern w:val="0"/>
+          <w:sz w:val="21"/>
+          <w:szCs w:val="21"/>
+          <w:lang w:val="en-US" w:eastAsia="de-DE"/>
+          <w14:ligatures w14:val="none"/>
+        </w:rPr>
+        <w:t>i</w:t>
+      </w:r>
+      <w:proofErr w:type="spellEnd"/>
+      <w:r>
+        <w:rPr>
+          <w:rFonts w:ascii="Consolas" w:eastAsia="Times New Roman" w:hAnsi="Consolas" w:cs="Courier New"/>
+          <w:color w:val="E2E2E2"/>
+          <w:kern w:val="0"/>
+          <w:sz w:val="21"/>
+          <w:szCs w:val="21"/>
+          <w:lang w:val="en-US" w:eastAsia="de-DE"/>
+          <w14:ligatures w14:val="none"/>
+        </w:rPr>
+        <w:t xml:space="preserve"> &lt; </w:t>
+      </w:r>
+      <w:r>
+        <w:rPr>
+          <w:rFonts w:ascii="Consolas" w:eastAsia="Times New Roman" w:hAnsi="Consolas" w:cs="Courier New"/>
+          <w:color w:val="A6E696"/>
+          <w:kern w:val="0"/>
+          <w:sz w:val="21"/>
+          <w:szCs w:val="21"/>
+          <w:lang w:val="en-US" w:eastAsia="de-DE"/>
+          <w14:ligatures w14:val="none"/>
+        </w:rPr>
+        <w:t>4</w:t>
+      </w:r>
+      <w:r>
+        <w:rPr>
+          <w:rFonts w:ascii="Consolas" w:eastAsia="Times New Roman" w:hAnsi="Consolas" w:cs="Courier New"/>
+          <w:color w:val="E2E2E2"/>
+          <w:kern w:val="0"/>
+          <w:sz w:val="21"/>
+          <w:szCs w:val="21"/>
+          <w:lang w:val="en-US" w:eastAsia="de-DE"/>
+          <w14:ligatures w14:val="none"/>
+        </w:rPr>
+        <w:t>; i++)</w:t>
+      </w:r>
+    </w:p>
+    <w:p>
+      <w:pPr>
+        <w:shd w:val="clear" w:color="auto" w:fill="303030"/>
+        <w:tabs>
+          <w:tab w:val="left" w:pos="916"/>
+          <w:tab w:val="left" w:pos="1832"/>
+          <w:tab w:val="left" w:pos="2748"/>
+          <w:tab w:val="left" w:pos="3664"/>
+          <w:tab w:val="left" w:pos="4580"/>
+          <w:tab w:val="left" w:pos="5496"/>
+          <w:tab w:val="left" w:pos="6412"/>
+          <w:tab w:val="left" w:pos="7328"/>
+          <w:tab w:val="left" w:pos="8244"/>
+          <w:tab w:val="left" w:pos="9160"/>
+          <w:tab w:val="left" w:pos="10076"/>
+          <w:tab w:val="left" w:pos="10992"/>
+          <w:tab w:val="left" w:pos="11908"/>
+          <w:tab w:val="left" w:pos="12824"/>
+          <w:tab w:val="left" w:pos="13740"/>
+          <w:tab w:val="left" w:pos="14656"/>
+        </w:tabs>
+        <w:spacing w:after="0" w:line="240" w:lineRule="auto"/>
+        <w:rPr>
+          <w:rFonts w:ascii="Consolas" w:eastAsia="Times New Roman" w:hAnsi="Consolas" w:cs="Courier New"/>
+          <w:color w:val="FFD700"/>
+          <w:kern w:val="0"/>
+          <w:sz w:val="21"/>
+          <w:szCs w:val="21"/>
+          <w:lang w:val="en-US" w:eastAsia="de-DE"/>
+          <w14:ligatures w14:val="none"/>
+        </w:rPr>
+      </w:pPr>
+      <w:r>
+        <w:rPr>
+          <w:rFonts w:ascii="Consolas" w:eastAsia="Times New Roman" w:hAnsi="Consolas" w:cs="Courier New"/>
+          <w:color w:val="E2E2E2"/>
+          <w:kern w:val="0"/>
+          <w:sz w:val="21"/>
+          <w:szCs w:val="21"/>
+          <w:lang w:val="en-US" w:eastAsia="de-DE"/>
+          <w14:ligatures w14:val="none"/>
+        </w:rPr>
+        <w:t xml:space="preserve">    </w:t>
+      </w:r>
+      <w:r>
+        <w:rPr>
+          <w:rFonts w:ascii="Consolas" w:eastAsia="Times New Roman" w:hAnsi="Consolas" w:cs="Courier New"/>
+          <w:color w:val="FFD700"/>
+          <w:kern w:val="0"/>
+          <w:sz w:val="21"/>
+          <w:szCs w:val="21"/>
+          <w:lang w:val="en-US" w:eastAsia="de-DE"/>
+          <w14:ligatures w14:val="none"/>
+        </w:rPr>
+        <w:t>{</w:t>
+      </w:r>
+    </w:p>
+    <w:p>
+      <w:pPr>
+        <w:shd w:val="clear" w:color="auto" w:fill="303030"/>
+        <w:tabs>
+          <w:tab w:val="left" w:pos="916"/>
+          <w:tab w:val="left" w:pos="1832"/>
+          <w:tab w:val="left" w:pos="2748"/>
+          <w:tab w:val="left" w:pos="3664"/>
+          <w:tab w:val="left" w:pos="4580"/>
+          <w:tab w:val="left" w:pos="5496"/>
+          <w:tab w:val="left" w:pos="6412"/>
+          <w:tab w:val="left" w:pos="7328"/>
+          <w:tab w:val="left" w:pos="8244"/>
+          <w:tab w:val="left" w:pos="9160"/>
+          <w:tab w:val="left" w:pos="10076"/>
+          <w:tab w:val="left" w:pos="10992"/>
+          <w:tab w:val="left" w:pos="11908"/>
+          <w:tab w:val="left" w:pos="12824"/>
+          <w:tab w:val="left" w:pos="13740"/>
+          <w:tab w:val="left" w:pos="14656"/>
+        </w:tabs>
+        <w:spacing w:after="0" w:line="240" w:lineRule="auto"/>
+        <w:rPr>
+          <w:rFonts w:ascii="Consolas" w:eastAsia="Times New Roman" w:hAnsi="Consolas" w:cs="Courier New"/>
+          <w:color w:val="E2E2E2"/>
+          <w:kern w:val="0"/>
+          <w:sz w:val="21"/>
+          <w:szCs w:val="21"/>
+          <w:lang w:val="en-US" w:eastAsia="de-DE"/>
+          <w14:ligatures w14:val="none"/>
+        </w:rPr>
+      </w:pPr>
+      <w:r>
+        <w:rPr>
+          <w:rFonts w:ascii="Consolas" w:eastAsia="Times New Roman" w:hAnsi="Consolas" w:cs="Courier New"/>
+          <w:color w:val="E2E2E2"/>
+          <w:kern w:val="0"/>
+          <w:sz w:val="21"/>
+          <w:szCs w:val="21"/>
+          <w:lang w:val="en-US" w:eastAsia="de-DE"/>
+          <w14:ligatures w14:val="none"/>
+        </w:rPr>
+        <w:tab/>
+      </w:r>
+      <w:proofErr w:type="gramStart"/>
+      <w:r>
+        <w:rPr>
+          <w:rFonts w:ascii="Consolas" w:eastAsia="Times New Roman" w:hAnsi="Consolas" w:cs="Courier New"/>
+          <w:color w:val="E2E2E2"/>
+          <w:kern w:val="0"/>
+          <w:sz w:val="21"/>
+          <w:szCs w:val="21"/>
+          <w:lang w:val="en-US" w:eastAsia="de-DE"/>
+          <w14:ligatures w14:val="none"/>
+        </w:rPr>
+        <w:t>std::</w:t>
+      </w:r>
+      <w:proofErr w:type="spellStart"/>
+      <w:proofErr w:type="gramEnd"/>
+      <w:r>
+        <w:rPr>
+          <w:rFonts w:ascii="Consolas" w:eastAsia="Times New Roman" w:hAnsi="Consolas" w:cs="Courier New"/>
+          <w:color w:val="E2E2E2"/>
+          <w:kern w:val="0"/>
+          <w:sz w:val="21"/>
+          <w:szCs w:val="21"/>
+          <w:lang w:val="en-US" w:eastAsia="de-DE"/>
+          <w14:ligatures w14:val="none"/>
+        </w:rPr>
+        <w:t>cout</w:t>
+      </w:r>
+      <w:proofErr w:type="spellEnd"/>
+      <w:r>
+        <w:rPr>
+          <w:rFonts w:ascii="Consolas" w:eastAsia="Times New Roman" w:hAnsi="Consolas" w:cs="Courier New"/>
+          <w:color w:val="E2E2E2"/>
+          <w:kern w:val="0"/>
+          <w:sz w:val="21"/>
+          <w:szCs w:val="21"/>
+          <w:lang w:val="en-US" w:eastAsia="de-DE"/>
+          <w14:ligatures w14:val="none"/>
+        </w:rPr>
+        <w:t xml:space="preserve"> &lt;&lt; </w:t>
+      </w:r>
+      <w:r>
+        <w:rPr>
+          <w:rFonts w:ascii="Consolas" w:eastAsia="Times New Roman" w:hAnsi="Consolas" w:cs="Courier New"/>
+          <w:color w:val="E2E2E2"/>
+          <w:kern w:val="0"/>
+          <w:sz w:val="21"/>
+          <w:szCs w:val="21"/>
+          <w:lang w:val="en-US" w:eastAsia="de-DE"/>
+          <w14:ligatures w14:val="none"/>
+        </w:rPr>
+        <w:t>a</w:t>
+      </w:r>
+      <w:r>
+        <w:rPr>
+          <w:rFonts w:ascii="Consolas" w:eastAsia="Times New Roman" w:hAnsi="Consolas" w:cs="Courier New"/>
+          <w:color w:val="E2E2E2"/>
+          <w:kern w:val="0"/>
+          <w:sz w:val="21"/>
+          <w:szCs w:val="21"/>
+          <w:lang w:val="en-US" w:eastAsia="de-DE"/>
+          <w14:ligatures w14:val="none"/>
+        </w:rPr>
+        <w:t xml:space="preserve"> &lt;&lt; </w:t>
+      </w:r>
+      <w:proofErr w:type="gramStart"/>
+      <w:r>
+        <w:rPr>
+          <w:rFonts w:ascii="Consolas" w:eastAsia="Times New Roman" w:hAnsi="Consolas" w:cs="Courier New"/>
+          <w:color w:val="E2E2E2"/>
+          <w:kern w:val="0"/>
+          <w:sz w:val="21"/>
+          <w:szCs w:val="21"/>
+          <w:lang w:val="en-US" w:eastAsia="de-DE"/>
+          <w14:ligatures w14:val="none"/>
+        </w:rPr>
+        <w:t>std::</w:t>
+      </w:r>
+      <w:proofErr w:type="spellStart"/>
+      <w:proofErr w:type="gramEnd"/>
+      <w:r>
+        <w:rPr>
+          <w:rFonts w:ascii="Consolas" w:eastAsia="Times New Roman" w:hAnsi="Consolas" w:cs="Courier New"/>
+          <w:color w:val="E2E2E2"/>
+          <w:kern w:val="0"/>
+          <w:sz w:val="21"/>
+          <w:szCs w:val="21"/>
+          <w:lang w:val="en-US" w:eastAsia="de-DE"/>
+          <w14:ligatures w14:val="none"/>
+        </w:rPr>
+        <w:t>endl</w:t>
+      </w:r>
+      <w:proofErr w:type="spellEnd"/>
+      <w:r>
+        <w:rPr>
+          <w:rFonts w:ascii="Consolas" w:eastAsia="Times New Roman" w:hAnsi="Consolas" w:cs="Courier New"/>
+          <w:color w:val="E2E2E2"/>
+          <w:kern w:val="0"/>
+          <w:sz w:val="21"/>
+          <w:szCs w:val="21"/>
+          <w:lang w:val="en-US" w:eastAsia="de-DE"/>
+          <w14:ligatures w14:val="none"/>
+        </w:rPr>
+        <w:t>;</w:t>
+      </w:r>
+    </w:p>
+    <w:p>
+      <w:pPr>
+        <w:shd w:val="clear" w:color="auto" w:fill="303030"/>
+        <w:tabs>
+          <w:tab w:val="left" w:pos="916"/>
+          <w:tab w:val="left" w:pos="1832"/>
+          <w:tab w:val="left" w:pos="2748"/>
+          <w:tab w:val="left" w:pos="3664"/>
+          <w:tab w:val="left" w:pos="4580"/>
+          <w:tab w:val="left" w:pos="5496"/>
+          <w:tab w:val="left" w:pos="6412"/>
+          <w:tab w:val="left" w:pos="7328"/>
+          <w:tab w:val="left" w:pos="8244"/>
+          <w:tab w:val="left" w:pos="9160"/>
+          <w:tab w:val="left" w:pos="10076"/>
+          <w:tab w:val="left" w:pos="10992"/>
+          <w:tab w:val="left" w:pos="11908"/>
+          <w:tab w:val="left" w:pos="12824"/>
+          <w:tab w:val="left" w:pos="13740"/>
+          <w:tab w:val="left" w:pos="14656"/>
+        </w:tabs>
+        <w:spacing w:after="0" w:line="240" w:lineRule="auto"/>
+        <w:rPr>
+          <w:rFonts w:ascii="Consolas" w:eastAsia="Times New Roman" w:hAnsi="Consolas" w:cs="Courier New"/>
+          <w:color w:val="E2E2E2"/>
+          <w:kern w:val="0"/>
+          <w:sz w:val="21"/>
+          <w:szCs w:val="21"/>
+          <w:lang w:eastAsia="de-DE"/>
+          <w14:ligatures w14:val="none"/>
+        </w:rPr>
+      </w:pPr>
+      <w:r>
+        <w:rPr>
+          <w:rFonts w:ascii="Consolas" w:eastAsia="Times New Roman" w:hAnsi="Consolas" w:cs="Courier New"/>
+          <w:color w:val="E2E2E2"/>
+          <w:kern w:val="0"/>
+          <w:sz w:val="21"/>
+          <w:szCs w:val="21"/>
+          <w:lang w:val="en-US" w:eastAsia="de-DE"/>
+          <w14:ligatures w14:val="none"/>
+        </w:rPr>
+        <w:t xml:space="preserve">    </w:t>
+      </w:r>
+      <w:r>
+        <w:rPr>
+          <w:rFonts w:ascii="Consolas" w:eastAsia="Times New Roman" w:hAnsi="Consolas" w:cs="Courier New"/>
+          <w:color w:val="FFD700"/>
+          <w:kern w:val="0"/>
+          <w:sz w:val="21"/>
+          <w:szCs w:val="21"/>
+          <w:lang w:eastAsia="de-DE"/>
+          <w14:ligatures w14:val="none"/>
+        </w:rPr>
+        <w:t>}</w:t>
+      </w:r>
+    </w:p>
+    <w:p>
+      <w:pPr>
+        <w:shd w:val="clear" w:color="auto" w:fill="303030"/>
+        <w:tabs>
+          <w:tab w:val="left" w:pos="916"/>
+          <w:tab w:val="left" w:pos="1832"/>
+          <w:tab w:val="left" w:pos="2748"/>
+          <w:tab w:val="left" w:pos="3664"/>
+          <w:tab w:val="left" w:pos="4580"/>
+          <w:tab w:val="left" w:pos="5496"/>
+          <w:tab w:val="left" w:pos="6412"/>
+          <w:tab w:val="left" w:pos="7328"/>
+          <w:tab w:val="left" w:pos="8244"/>
+          <w:tab w:val="left" w:pos="9160"/>
+          <w:tab w:val="left" w:pos="10076"/>
+          <w:tab w:val="left" w:pos="10992"/>
+          <w:tab w:val="left" w:pos="11908"/>
+          <w:tab w:val="left" w:pos="12824"/>
+          <w:tab w:val="left" w:pos="13740"/>
+          <w:tab w:val="left" w:pos="14656"/>
+        </w:tabs>
+        <w:spacing w:after="0" w:line="240" w:lineRule="auto"/>
+        <w:rPr>
+          <w:rFonts w:ascii="Consolas" w:eastAsia="Times New Roman" w:hAnsi="Consolas" w:cs="Courier New"/>
+          <w:color w:val="FFD700"/>
+          <w:kern w:val="0"/>
+          <w:sz w:val="21"/>
+          <w:szCs w:val="21"/>
+          <w:lang w:eastAsia="de-DE"/>
+          <w14:ligatures w14:val="none"/>
+        </w:rPr>
+      </w:pPr>
+      <w:r>
+        <w:rPr>
+          <w:rFonts w:ascii="Consolas" w:eastAsia="Times New Roman" w:hAnsi="Consolas" w:cs="Courier New"/>
+          <w:color w:val="FFD700"/>
+          <w:kern w:val="0"/>
+          <w:sz w:val="21"/>
+          <w:szCs w:val="21"/>
+          <w:lang w:eastAsia="de-DE"/>
+          <w14:ligatures w14:val="none"/>
+        </w:rPr>
+        <w:t>}</w:t>
+      </w:r>
+    </w:p>
+    <w:p>
+      <w:pPr>
+        <w:shd w:val="clear" w:color="auto" w:fill="303030"/>
+        <w:tabs>
+          <w:tab w:val="left" w:pos="916"/>
+          <w:tab w:val="left" w:pos="1832"/>
+          <w:tab w:val="left" w:pos="2748"/>
+          <w:tab w:val="left" w:pos="3664"/>
+          <w:tab w:val="left" w:pos="4580"/>
+          <w:tab w:val="left" w:pos="5496"/>
+          <w:tab w:val="left" w:pos="6412"/>
+          <w:tab w:val="left" w:pos="7328"/>
+          <w:tab w:val="left" w:pos="8244"/>
+          <w:tab w:val="left" w:pos="9160"/>
+          <w:tab w:val="left" w:pos="10076"/>
+          <w:tab w:val="left" w:pos="10992"/>
+          <w:tab w:val="left" w:pos="11908"/>
+          <w:tab w:val="left" w:pos="12824"/>
+          <w:tab w:val="left" w:pos="13740"/>
+          <w:tab w:val="left" w:pos="14656"/>
+        </w:tabs>
+        <w:spacing w:after="0" w:line="240" w:lineRule="auto"/>
+        <w:rPr>
+          <w:rFonts w:ascii="Consolas" w:eastAsia="Times New Roman" w:hAnsi="Consolas" w:cs="Courier New"/>
+          <w:color w:val="FFD700"/>
+          <w:kern w:val="0"/>
+          <w:sz w:val="21"/>
+          <w:szCs w:val="21"/>
+          <w:lang w:eastAsia="de-DE"/>
+          <w14:ligatures w14:val="none"/>
+        </w:rPr>
+      </w:pPr>
+    </w:p>
+    <w:p>
+      <w:pPr>
+        <w:shd w:val="clear" w:color="auto" w:fill="303030"/>
+        <w:tabs>
+          <w:tab w:val="left" w:pos="916"/>
+          <w:tab w:val="left" w:pos="1832"/>
+          <w:tab w:val="left" w:pos="2748"/>
+          <w:tab w:val="left" w:pos="3664"/>
+          <w:tab w:val="left" w:pos="4580"/>
+          <w:tab w:val="left" w:pos="5496"/>
+          <w:tab w:val="left" w:pos="6412"/>
+          <w:tab w:val="left" w:pos="7328"/>
+          <w:tab w:val="left" w:pos="8244"/>
+          <w:tab w:val="left" w:pos="9160"/>
+          <w:tab w:val="left" w:pos="10076"/>
+          <w:tab w:val="left" w:pos="10992"/>
+          <w:tab w:val="left" w:pos="11908"/>
+          <w:tab w:val="left" w:pos="12824"/>
+          <w:tab w:val="left" w:pos="13740"/>
+          <w:tab w:val="left" w:pos="14656"/>
+        </w:tabs>
+        <w:spacing w:after="0" w:line="240" w:lineRule="auto"/>
+        <w:rPr>
+          <w:rFonts w:ascii="Consolas" w:eastAsia="Times New Roman" w:hAnsi="Consolas" w:cs="Courier New"/>
+          <w:color w:val="E2E2E2"/>
+          <w:kern w:val="0"/>
+          <w:sz w:val="21"/>
+          <w:szCs w:val="21"/>
+          <w:lang w:val="en-US" w:eastAsia="de-DE"/>
+          <w14:ligatures w14:val="none"/>
+        </w:rPr>
+      </w:pPr>
+      <w:r>
+        <w:rPr>
+          <w:rFonts w:ascii="Consolas" w:eastAsia="Times New Roman" w:hAnsi="Consolas" w:cs="Courier New"/>
+          <w:b/>
+          <w:bCs/>
+          <w:color w:val="569CD6"/>
+          <w:kern w:val="0"/>
+          <w:sz w:val="21"/>
+          <w:szCs w:val="21"/>
+          <w:lang w:val="en-US" w:eastAsia="de-DE"/>
+          <w14:ligatures w14:val="none"/>
+        </w:rPr>
+        <w:t>int</w:t>
+      </w:r>
+      <w:r>
+        <w:rPr>
+          <w:rFonts w:ascii="Consolas" w:eastAsia="Times New Roman" w:hAnsi="Consolas" w:cs="Courier New"/>
+          <w:color w:val="E2E2E2"/>
+          <w:kern w:val="0"/>
+          <w:sz w:val="21"/>
+          <w:szCs w:val="21"/>
+          <w:lang w:val="en-US" w:eastAsia="de-DE"/>
+          <w14:ligatures w14:val="none"/>
+        </w:rPr>
+        <w:t xml:space="preserve"> </w:t>
+      </w:r>
+      <w:proofErr w:type="gramStart"/>
+      <w:r>
+        <w:rPr>
+          <w:rFonts w:ascii="Consolas" w:eastAsia="Times New Roman" w:hAnsi="Consolas" w:cs="Courier New"/>
+          <w:color w:val="FFF2AA"/>
+          <w:kern w:val="0"/>
+          <w:sz w:val="21"/>
+          <w:szCs w:val="21"/>
+          <w:lang w:val="en-US" w:eastAsia="de-DE"/>
+          <w14:ligatures w14:val="none"/>
+        </w:rPr>
+        <w:t>main</w:t>
+      </w:r>
+      <w:r>
+        <w:rPr>
+          <w:rFonts w:ascii="Consolas" w:eastAsia="Times New Roman" w:hAnsi="Consolas" w:cs="Courier New"/>
+          <w:color w:val="E2E2E2"/>
+          <w:kern w:val="0"/>
+          <w:sz w:val="21"/>
+          <w:szCs w:val="21"/>
+          <w:lang w:val="en-US" w:eastAsia="de-DE"/>
+          <w14:ligatures w14:val="none"/>
+        </w:rPr>
+        <w:t>(</w:t>
+      </w:r>
+      <w:proofErr w:type="gramEnd"/>
+      <w:r>
+        <w:rPr>
+          <w:rFonts w:ascii="Consolas" w:eastAsia="Times New Roman" w:hAnsi="Consolas" w:cs="Courier New"/>
+          <w:color w:val="E2E2E2"/>
+          <w:kern w:val="0"/>
+          <w:sz w:val="21"/>
+          <w:szCs w:val="21"/>
+          <w:lang w:val="en-US" w:eastAsia="de-DE"/>
+          <w14:ligatures w14:val="none"/>
+        </w:rPr>
+        <w:t>)</w:t>
+      </w:r>
+    </w:p>
+    <w:p>
+      <w:pPr>
+        <w:shd w:val="clear" w:color="auto" w:fill="303030"/>
+        <w:tabs>
+          <w:tab w:val="left" w:pos="916"/>
+          <w:tab w:val="left" w:pos="1832"/>
+          <w:tab w:val="left" w:pos="2748"/>
+          <w:tab w:val="left" w:pos="3664"/>
+          <w:tab w:val="left" w:pos="4580"/>
+          <w:tab w:val="left" w:pos="5496"/>
+          <w:tab w:val="left" w:pos="6412"/>
+          <w:tab w:val="left" w:pos="7328"/>
+          <w:tab w:val="left" w:pos="8244"/>
+          <w:tab w:val="left" w:pos="9160"/>
+          <w:tab w:val="left" w:pos="10076"/>
+          <w:tab w:val="left" w:pos="10992"/>
+          <w:tab w:val="left" w:pos="11908"/>
+          <w:tab w:val="left" w:pos="12824"/>
+          <w:tab w:val="left" w:pos="13740"/>
+          <w:tab w:val="left" w:pos="14656"/>
+        </w:tabs>
+        <w:spacing w:after="0" w:line="240" w:lineRule="auto"/>
+        <w:rPr>
+          <w:rFonts w:ascii="Consolas" w:eastAsia="Times New Roman" w:hAnsi="Consolas" w:cs="Courier New"/>
+          <w:color w:val="E2E2E2"/>
+          <w:kern w:val="0"/>
+          <w:sz w:val="21"/>
+          <w:szCs w:val="21"/>
+          <w:lang w:val="en-US" w:eastAsia="de-DE"/>
+          <w14:ligatures w14:val="none"/>
+        </w:rPr>
+      </w:pPr>
+      <w:r>
+        <w:rPr>
+          <w:rFonts w:ascii="Consolas" w:eastAsia="Times New Roman" w:hAnsi="Consolas" w:cs="Courier New"/>
+          <w:color w:val="FFD700"/>
+          <w:kern w:val="0"/>
+          <w:sz w:val="21"/>
+          <w:szCs w:val="21"/>
+          <w:lang w:val="en-US" w:eastAsia="de-DE"/>
+          <w14:ligatures w14:val="none"/>
+        </w:rPr>
+        <w:t>{</w:t>
+      </w:r>
+    </w:p>
+    <w:p>
+      <w:pPr>
+        <w:shd w:val="clear" w:color="auto" w:fill="303030"/>
+        <w:tabs>
+          <w:tab w:val="left" w:pos="916"/>
+          <w:tab w:val="left" w:pos="1832"/>
+          <w:tab w:val="left" w:pos="2748"/>
+          <w:tab w:val="left" w:pos="3664"/>
+          <w:tab w:val="left" w:pos="4580"/>
+          <w:tab w:val="left" w:pos="5496"/>
+          <w:tab w:val="left" w:pos="6412"/>
+          <w:tab w:val="left" w:pos="7328"/>
+          <w:tab w:val="left" w:pos="8244"/>
+          <w:tab w:val="left" w:pos="9160"/>
+          <w:tab w:val="left" w:pos="10076"/>
+          <w:tab w:val="left" w:pos="10992"/>
+          <w:tab w:val="left" w:pos="11908"/>
+          <w:tab w:val="left" w:pos="12824"/>
+          <w:tab w:val="left" w:pos="13740"/>
+          <w:tab w:val="left" w:pos="14656"/>
+        </w:tabs>
+        <w:spacing w:after="0" w:line="240" w:lineRule="auto"/>
+        <w:rPr>
+          <w:rFonts w:ascii="Consolas" w:eastAsia="Times New Roman" w:hAnsi="Consolas" w:cs="Courier New"/>
+          <w:color w:val="E2E2E2"/>
+          <w:kern w:val="0"/>
+          <w:sz w:val="21"/>
+          <w:szCs w:val="21"/>
+          <w:lang w:val="en-US" w:eastAsia="de-DE"/>
+          <w14:ligatures w14:val="none"/>
+        </w:rPr>
+      </w:pPr>
+      <w:r>
+        <w:rPr>
+          <w:rFonts w:ascii="Consolas" w:eastAsia="Times New Roman" w:hAnsi="Consolas" w:cs="Courier New"/>
+          <w:color w:val="E2E2E2"/>
+          <w:kern w:val="0"/>
+          <w:sz w:val="21"/>
+          <w:szCs w:val="21"/>
+          <w:lang w:val="en-US" w:eastAsia="de-DE"/>
+          <w14:ligatures w14:val="none"/>
+        </w:rPr>
+        <w:t xml:space="preserve">    </w:t>
+      </w:r>
+      <w:proofErr w:type="spellStart"/>
+      <w:proofErr w:type="gramStart"/>
+      <w:r>
+        <w:rPr>
+          <w:rFonts w:ascii="Consolas" w:eastAsia="Times New Roman" w:hAnsi="Consolas" w:cs="Courier New"/>
+          <w:color w:val="FFF2AA"/>
+          <w:kern w:val="0"/>
+          <w:sz w:val="21"/>
+          <w:szCs w:val="21"/>
+          <w:lang w:val="en-US" w:eastAsia="de-DE"/>
+          <w14:ligatures w14:val="none"/>
+        </w:rPr>
+        <w:t>printFour</w:t>
+      </w:r>
+      <w:proofErr w:type="spellEnd"/>
+      <w:r>
+        <w:rPr>
+          <w:rFonts w:ascii="Consolas" w:eastAsia="Times New Roman" w:hAnsi="Consolas" w:cs="Courier New"/>
+          <w:color w:val="E2E2E2"/>
+          <w:kern w:val="0"/>
+          <w:sz w:val="21"/>
+          <w:szCs w:val="21"/>
+          <w:lang w:val="en-US" w:eastAsia="de-DE"/>
+          <w14:ligatures w14:val="none"/>
+        </w:rPr>
+        <w:t>(</w:t>
+      </w:r>
+      <w:proofErr w:type="gramEnd"/>
+      <w:r>
+        <w:rPr>
+          <w:rFonts w:ascii="Consolas" w:eastAsia="Times New Roman" w:hAnsi="Consolas" w:cs="Courier New"/>
+          <w:color w:val="A6E696"/>
+          <w:kern w:val="0"/>
+          <w:sz w:val="21"/>
+          <w:szCs w:val="21"/>
+          <w:lang w:val="en-US" w:eastAsia="de-DE"/>
+          <w14:ligatures w14:val="none"/>
+        </w:rPr>
+        <w:t>5</w:t>
+      </w:r>
+      <w:r>
+        <w:rPr>
+          <w:rFonts w:ascii="Consolas" w:eastAsia="Times New Roman" w:hAnsi="Consolas" w:cs="Courier New"/>
+          <w:color w:val="E2E2E2"/>
+          <w:kern w:val="0"/>
+          <w:sz w:val="21"/>
+          <w:szCs w:val="21"/>
+          <w:lang w:val="en-US" w:eastAsia="de-DE"/>
+          <w14:ligatures w14:val="none"/>
+        </w:rPr>
+        <w:t>)</w:t>
+      </w:r>
+      <w:r>
+        <w:rPr>
+          <w:rFonts w:ascii="Consolas" w:eastAsia="Times New Roman" w:hAnsi="Consolas" w:cs="Courier New"/>
+          <w:color w:val="E2E2E2"/>
+          <w:kern w:val="0"/>
+          <w:sz w:val="21"/>
+          <w:szCs w:val="21"/>
+          <w:lang w:val="en-US" w:eastAsia="de-DE"/>
+          <w14:ligatures w14:val="none"/>
+        </w:rPr>
+        <w:t>;</w:t>
+      </w:r>
+    </w:p>
+    <w:p>
+      <w:pPr>
+        <w:shd w:val="clear" w:color="auto" w:fill="303030"/>
+        <w:tabs>
+          <w:tab w:val="left" w:pos="916"/>
+          <w:tab w:val="left" w:pos="1832"/>
+          <w:tab w:val="left" w:pos="2748"/>
+          <w:tab w:val="left" w:pos="3664"/>
+          <w:tab w:val="left" w:pos="4580"/>
+          <w:tab w:val="left" w:pos="5496"/>
+          <w:tab w:val="left" w:pos="6412"/>
+          <w:tab w:val="left" w:pos="7328"/>
+          <w:tab w:val="left" w:pos="8244"/>
+          <w:tab w:val="left" w:pos="9160"/>
+          <w:tab w:val="left" w:pos="10076"/>
+          <w:tab w:val="left" w:pos="10992"/>
+          <w:tab w:val="left" w:pos="11908"/>
+          <w:tab w:val="left" w:pos="12824"/>
+          <w:tab w:val="left" w:pos="13740"/>
+          <w:tab w:val="left" w:pos="14656"/>
+        </w:tabs>
+        <w:spacing w:after="0" w:line="240" w:lineRule="auto"/>
+        <w:rPr>
+          <w:rFonts w:ascii="Consolas" w:eastAsia="Times New Roman" w:hAnsi="Consolas" w:cs="Courier New"/>
+          <w:color w:val="E2E2E2"/>
+          <w:kern w:val="0"/>
+          <w:sz w:val="21"/>
+          <w:szCs w:val="21"/>
+          <w:lang w:val="en-US" w:eastAsia="de-DE"/>
+          <w14:ligatures w14:val="none"/>
+        </w:rPr>
+      </w:pPr>
+      <w:r>
+        <w:rPr>
+          <w:rFonts w:ascii="Consolas" w:eastAsia="Times New Roman" w:hAnsi="Consolas" w:cs="Courier New"/>
+          <w:color w:val="FFF2AA"/>
+          <w:kern w:val="0"/>
+          <w:sz w:val="21"/>
+          <w:szCs w:val="21"/>
+          <w:lang w:val="en-US" w:eastAsia="de-DE"/>
+          <w14:ligatures w14:val="none"/>
+        </w:rPr>
+        <w:t xml:space="preserve">    </w:t>
+      </w:r>
+      <w:proofErr w:type="spellStart"/>
+      <w:proofErr w:type="gramStart"/>
+      <w:r>
+        <w:rPr>
+          <w:rFonts w:ascii="Consolas" w:eastAsia="Times New Roman" w:hAnsi="Consolas" w:cs="Courier New"/>
+          <w:color w:val="FFF2AA"/>
+          <w:kern w:val="0"/>
+          <w:sz w:val="21"/>
+          <w:szCs w:val="21"/>
+          <w:lang w:val="en-US" w:eastAsia="de-DE"/>
+          <w14:ligatures w14:val="none"/>
+        </w:rPr>
+        <w:t>printFour</w:t>
+      </w:r>
+      <w:proofErr w:type="spellEnd"/>
+      <w:r>
+        <w:rPr>
+          <w:rFonts w:ascii="Consolas" w:eastAsia="Times New Roman" w:hAnsi="Consolas" w:cs="Courier New"/>
+          <w:color w:val="E2E2E2"/>
+          <w:kern w:val="0"/>
+          <w:sz w:val="21"/>
+          <w:szCs w:val="21"/>
+          <w:lang w:val="en-US" w:eastAsia="de-DE"/>
+          <w14:ligatures w14:val="none"/>
+        </w:rPr>
+        <w:t>(</w:t>
+      </w:r>
+      <w:proofErr w:type="gramEnd"/>
+      <w:r>
+        <w:rPr>
+          <w:rFonts w:ascii="Consolas" w:eastAsia="Times New Roman" w:hAnsi="Consolas" w:cs="Courier New"/>
+          <w:color w:val="A6E696"/>
+          <w:kern w:val="0"/>
+          <w:sz w:val="21"/>
+          <w:szCs w:val="21"/>
+          <w:lang w:val="en-US" w:eastAsia="de-DE"/>
+          <w14:ligatures w14:val="none"/>
+        </w:rPr>
+        <w:t>8</w:t>
+      </w:r>
+      <w:r>
+        <w:rPr>
+          <w:rFonts w:ascii="Consolas" w:eastAsia="Times New Roman" w:hAnsi="Consolas" w:cs="Courier New"/>
+          <w:color w:val="E2E2E2"/>
+          <w:kern w:val="0"/>
+          <w:sz w:val="21"/>
+          <w:szCs w:val="21"/>
+          <w:lang w:val="en-US" w:eastAsia="de-DE"/>
+          <w14:ligatures w14:val="none"/>
+        </w:rPr>
+        <w:t>)</w:t>
+      </w:r>
+      <w:r>
+        <w:rPr>
+          <w:rFonts w:ascii="Consolas" w:eastAsia="Times New Roman" w:hAnsi="Consolas" w:cs="Courier New"/>
+          <w:color w:val="E2E2E2"/>
+          <w:kern w:val="0"/>
+          <w:sz w:val="21"/>
+          <w:szCs w:val="21"/>
+          <w:lang w:val="en-US" w:eastAsia="de-DE"/>
+          <w14:ligatures w14:val="none"/>
+        </w:rPr>
+        <w:t>;</w:t>
+      </w:r>
+    </w:p>
+    <w:p>
+      <w:pPr>
+        <w:shd w:val="clear" w:color="auto" w:fill="303030"/>
+        <w:tabs>
+          <w:tab w:val="left" w:pos="916"/>
+          <w:tab w:val="left" w:pos="1832"/>
+          <w:tab w:val="left" w:pos="2748"/>
+          <w:tab w:val="left" w:pos="3664"/>
+          <w:tab w:val="left" w:pos="4580"/>
+          <w:tab w:val="left" w:pos="5496"/>
+          <w:tab w:val="left" w:pos="6412"/>
+          <w:tab w:val="left" w:pos="7328"/>
+          <w:tab w:val="left" w:pos="8244"/>
+          <w:tab w:val="left" w:pos="9160"/>
+          <w:tab w:val="left" w:pos="10076"/>
+          <w:tab w:val="left" w:pos="10992"/>
+          <w:tab w:val="left" w:pos="11908"/>
+          <w:tab w:val="left" w:pos="12824"/>
+          <w:tab w:val="left" w:pos="13740"/>
+          <w:tab w:val="left" w:pos="14656"/>
+        </w:tabs>
+        <w:spacing w:after="0" w:line="240" w:lineRule="auto"/>
+        <w:rPr>
+          <w:rFonts w:ascii="Consolas" w:eastAsia="Times New Roman" w:hAnsi="Consolas" w:cs="Courier New"/>
+          <w:color w:val="E2E2E2"/>
+          <w:kern w:val="0"/>
+          <w:sz w:val="21"/>
+          <w:szCs w:val="21"/>
+          <w:lang w:val="en-US" w:eastAsia="de-DE"/>
+          <w14:ligatures w14:val="none"/>
+        </w:rPr>
+      </w:pPr>
+      <w:r>
+        <w:rPr>
+          <w:rFonts w:ascii="Consolas" w:eastAsia="Times New Roman" w:hAnsi="Consolas" w:cs="Courier New"/>
+          <w:color w:val="E2E2E2"/>
+          <w:kern w:val="0"/>
+          <w:sz w:val="21"/>
+          <w:szCs w:val="21"/>
+          <w:lang w:val="en-US" w:eastAsia="de-DE"/>
+          <w14:ligatures w14:val="none"/>
+        </w:rPr>
+        <w:t xml:space="preserve">    </w:t>
+      </w:r>
+      <w:r>
+        <w:rPr>
+          <w:rFonts w:ascii="Consolas" w:eastAsia="Times New Roman" w:hAnsi="Consolas" w:cs="Courier New"/>
+          <w:b/>
+          <w:bCs/>
+          <w:color w:val="569CD6"/>
+          <w:kern w:val="0"/>
+          <w:sz w:val="21"/>
+          <w:szCs w:val="21"/>
+          <w:lang w:val="en-US" w:eastAsia="de-DE"/>
+          <w14:ligatures w14:val="none"/>
+        </w:rPr>
+        <w:t>return</w:t>
+      </w:r>
+      <w:r>
+        <w:rPr>
+          <w:rFonts w:ascii="Consolas" w:eastAsia="Times New Roman" w:hAnsi="Consolas" w:cs="Courier New"/>
+          <w:color w:val="E2E2E2"/>
+          <w:kern w:val="0"/>
+          <w:sz w:val="21"/>
+          <w:szCs w:val="21"/>
+          <w:lang w:val="en-US" w:eastAsia="de-DE"/>
+          <w14:ligatures w14:val="none"/>
+        </w:rPr>
+        <w:t xml:space="preserve"> </w:t>
+      </w:r>
+      <w:r>
+        <w:rPr>
+          <w:rFonts w:ascii="Consolas" w:eastAsia="Times New Roman" w:hAnsi="Consolas" w:cs="Courier New"/>
+          <w:color w:val="A6E696"/>
+          <w:kern w:val="0"/>
+          <w:sz w:val="21"/>
+          <w:szCs w:val="21"/>
+          <w:lang w:val="en-US" w:eastAsia="de-DE"/>
+          <w14:ligatures w14:val="none"/>
+        </w:rPr>
+        <w:t>0</w:t>
+      </w:r>
+      <w:r>
+        <w:rPr>
+          <w:rFonts w:ascii="Consolas" w:eastAsia="Times New Roman" w:hAnsi="Consolas" w:cs="Courier New"/>
+          <w:color w:val="E2E2E2"/>
+          <w:kern w:val="0"/>
+          <w:sz w:val="21"/>
+          <w:szCs w:val="21"/>
+          <w:lang w:val="en-US" w:eastAsia="de-DE"/>
+          <w14:ligatures w14:val="none"/>
+        </w:rPr>
+        <w:t>;</w:t>
+      </w:r>
+    </w:p>
+    <w:p>
+      <w:pPr>
+        <w:shd w:val="clear" w:color="auto" w:fill="303030"/>
+        <w:tabs>
+          <w:tab w:val="left" w:pos="916"/>
+          <w:tab w:val="left" w:pos="1832"/>
+          <w:tab w:val="left" w:pos="2748"/>
+          <w:tab w:val="left" w:pos="3664"/>
+          <w:tab w:val="left" w:pos="4580"/>
+          <w:tab w:val="left" w:pos="5496"/>
+          <w:tab w:val="left" w:pos="6412"/>
+          <w:tab w:val="left" w:pos="7328"/>
+          <w:tab w:val="left" w:pos="8244"/>
+          <w:tab w:val="left" w:pos="9160"/>
+          <w:tab w:val="left" w:pos="10076"/>
+          <w:tab w:val="left" w:pos="10992"/>
+          <w:tab w:val="left" w:pos="11908"/>
+          <w:tab w:val="left" w:pos="12824"/>
+          <w:tab w:val="left" w:pos="13740"/>
+          <w:tab w:val="left" w:pos="14656"/>
+        </w:tabs>
+        <w:spacing w:after="0" w:line="240" w:lineRule="auto"/>
+        <w:rPr>
+          <w:rFonts w:ascii="Consolas" w:eastAsia="Times New Roman" w:hAnsi="Consolas" w:cs="Courier New"/>
+          <w:color w:val="E2E2E2"/>
+          <w:kern w:val="0"/>
+          <w:sz w:val="21"/>
+          <w:szCs w:val="21"/>
+          <w:lang w:eastAsia="de-DE"/>
+          <w14:ligatures w14:val="none"/>
+        </w:rPr>
+      </w:pPr>
+      <w:r>
+        <w:rPr>
+          <w:rFonts w:ascii="Consolas" w:eastAsia="Times New Roman" w:hAnsi="Consolas" w:cs="Courier New"/>
+          <w:color w:val="FFD700"/>
+          <w:kern w:val="0"/>
+          <w:sz w:val="21"/>
+          <w:szCs w:val="21"/>
+          <w:lang w:eastAsia="de-DE"/>
+          <w14:ligatures w14:val="none"/>
+        </w:rPr>
+        <w:t>}</w:t>
+      </w:r>
+    </w:p>
+    <w:p/>
+    <w:p/>
+    <w:p/>
+    <w:p/>
+    <w:p/>
+    <w:p/>
+    <w:p/>
+    <w:p/>
+    <w:p/>
+    <w:p/>
+    <w:p/>
     <w:sectPr>
       <w:pgSz w:w="11906" w:h="16838"/>
       <w:pgMar w:top="1417" w:right="1417" w:bottom="1134" w:left="1417" w:header="708" w:footer="708" w:gutter="0"/>
@@ -13527,6 +15066,7 @@
   <w:style w:type="character" w:default="1" w:styleId="Absatz-Standardschriftart">
     <w:name w:val="Default Paragraph Font"/>
     <w:uiPriority w:val="1"/>
+    <w:semiHidden/>
     <w:unhideWhenUsed/>
   </w:style>
   <w:style w:type="table" w:default="1" w:styleId="NormaleTabelle">

</xml_diff>